<commit_message>
Actualizaciones y agregados Fase 2
-Agregado de archivo 2.2 y 2.3, individuales (Preguntar si es un archivo para todos o para cada uno).
-Agregado de Planilla de evaluación avance fase 2 (Grupal)
-Actualización de 2.4 y 2.6, aún en progreso (Grupal).
</commit_message>
<xml_diff>
--- a/Capstone/Fase 2/Grupales/2.4_GuiaEstudiante_Fase 2_DesarrolloProyecto APT.docx
+++ b/Capstone/Fase 2/Grupales/2.4_GuiaEstudiante_Fase 2_DesarrolloProyecto APT.docx
@@ -1,11 +1,8 @@
 
 <file path=word/document.xml><?xml version="1.0" encoding="utf-8"?>
-<w:document xmlns:wpc="http://schemas.microsoft.com/office/word/2010/wordprocessingCanvas" xmlns:cx="http://schemas.microsoft.com/office/drawing/2014/chartex" xmlns:mc="http://schemas.openxmlformats.org/markup-compatibility/2006" xmlns:o="urn:schemas-microsoft-com:office:office" xmlns:r="http://schemas.openxmlformats.org/officeDocument/2006/relationships" xmlns:m="http://schemas.openxmlformats.org/officeDocument/2006/math" xmlns:v="urn:schemas-microsoft-com:vml" xmlns:wp14="http://schemas.microsoft.com/office/word/2010/wordprocessingDrawing" xmlns:wp="http://schemas.openxmlformats.org/drawingml/2006/wordprocessingDrawing" xmlns:w10="urn:schemas-microsoft-com:office:word" xmlns:w="http://schemas.openxmlformats.org/wordprocessingml/2006/main" xmlns:w14="http://schemas.microsoft.com/office/word/2010/wordml" xmlns:w15="http://schemas.microsoft.com/office/word/2012/wordml" xmlns:w16se="http://schemas.microsoft.com/office/word/2015/wordml/symex" xmlns:wpg="http://schemas.microsoft.com/office/word/2010/wordprocessingGroup" xmlns:wpi="http://schemas.microsoft.com/office/word/2010/wordprocessingInk" xmlns:wne="http://schemas.microsoft.com/office/word/2006/wordml" xmlns:wps="http://schemas.microsoft.com/office/word/2010/wordprocessingShape" mc:Ignorable="w14 w15 w16se wp14">
+<w:document xmlns:wpc="http://schemas.microsoft.com/office/word/2010/wordprocessingCanvas" xmlns:cx="http://schemas.microsoft.com/office/drawing/2014/chartex" xmlns:cx1="http://schemas.microsoft.com/office/drawing/2015/9/8/chartex" xmlns:cx2="http://schemas.microsoft.com/office/drawing/2015/10/21/chartex" xmlns:cx3="http://schemas.microsoft.com/office/drawing/2016/5/9/chartex" xmlns:cx4="http://schemas.microsoft.com/office/drawing/2016/5/10/chartex" xmlns:cx5="http://schemas.microsoft.com/office/drawing/2016/5/11/chartex" xmlns:cx6="http://schemas.microsoft.com/office/drawing/2016/5/12/chartex" xmlns:cx7="http://schemas.microsoft.com/office/drawing/2016/5/13/chartex" xmlns:cx8="http://schemas.microsoft.com/office/drawing/2016/5/14/chartex" xmlns:mc="http://schemas.openxmlformats.org/markup-compatibility/2006" xmlns:aink="http://schemas.microsoft.com/office/drawing/2016/ink" xmlns:am3d="http://schemas.microsoft.com/office/drawing/2017/model3d" xmlns:o="urn:schemas-microsoft-com:office:office" xmlns:oel="http://schemas.microsoft.com/office/2019/extlst" xmlns:r="http://schemas.openxmlformats.org/officeDocument/2006/relationships" xmlns:m="http://schemas.openxmlformats.org/officeDocument/2006/math" xmlns:v="urn:schemas-microsoft-com:vml" xmlns:wp14="http://schemas.microsoft.com/office/word/2010/wordprocessingDrawing" xmlns:wp="http://schemas.openxmlformats.org/drawingml/2006/wordprocessingDrawing" xmlns:w10="urn:schemas-microsoft-com:office:word" xmlns:w="http://schemas.openxmlformats.org/wordprocessingml/2006/main" xmlns:w14="http://schemas.microsoft.com/office/word/2010/wordml" xmlns:w15="http://schemas.microsoft.com/office/word/2012/wordml" xmlns:w16cex="http://schemas.microsoft.com/office/word/2018/wordml/cex" xmlns:w16cid="http://schemas.microsoft.com/office/word/2016/wordml/cid" xmlns:w16="http://schemas.microsoft.com/office/word/2018/wordml" xmlns:w16du="http://schemas.microsoft.com/office/word/2023/wordml/word16du" xmlns:w16sdtdh="http://schemas.microsoft.com/office/word/2020/wordml/sdtdatahash" xmlns:w16sdtfl="http://schemas.microsoft.com/office/word/2024/wordml/sdtformatlock" xmlns:w16se="http://schemas.microsoft.com/office/word/2015/wordml/symex" xmlns:wpg="http://schemas.microsoft.com/office/word/2010/wordprocessingGroup" xmlns:wpi="http://schemas.microsoft.com/office/word/2010/wordprocessingInk" xmlns:wne="http://schemas.microsoft.com/office/word/2006/wordml" xmlns:wps="http://schemas.microsoft.com/office/word/2010/wordprocessingShape" mc:Ignorable="w14 w15 w16se w16cid w16 w16cex w16sdtdh w16sdtfl w16du wp14">
   <w:body>
-    <w:p>
-      <w:bookmarkStart w:id="0" w:name="_GoBack"/>
-      <w:bookmarkEnd w:id="0"/>
-    </w:p>
+    <w:p/>
     <w:p>
       <w:pPr>
         <w:rPr>
@@ -238,7 +235,7 @@
           </mc:Choice>
           <mc:Fallback>
             <w:pict>
-              <v:group w14:anchorId="39581AEC" id="Grupo 27" o:spid="_x0000_s1026" style="position:absolute;margin-left:0;margin-top:.75pt;width:491.25pt;height:123pt;z-index:251659264;mso-position-horizontal:center;mso-position-horizontal-relative:margin;mso-width-relative:margin;mso-height-relative:margin" coordsize="59912,15621" o:gfxdata="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">
+              <v:group w14:anchorId="39581AEC" id="Grupo 27" o:spid="_x0000_s1026" style="position:absolute;margin-left:0;margin-top:.75pt;width:491.25pt;height:123pt;z-index:251659264;mso-position-horizontal:center;mso-position-horizontal-relative:margin;mso-width-relative:margin;mso-height-relative:margin" coordsize="59912,15621" o:gfxdata="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">
                 <v:shapetype id="_x0000_t202" coordsize="21600,21600" o:spt="202" path="m,l,21600r21600,l21600,xe">
                   <v:stroke joinstyle="miter"/>
                   <v:path gradientshapeok="t" o:connecttype="rect"/>
@@ -646,141 +643,103 @@
                 <w:szCs w:val="20"/>
                 <w:lang w:eastAsia="es-CL"/>
               </w:rPr>
-              <w:t xml:space="preserve">En esta </w:t>
-            </w:r>
-            <w:r>
-              <w:rPr>
-                <w:rFonts w:ascii="Calibri" w:hAnsi="Calibri" w:cs="Arial"/>
-                <w:i/>
-                <w:color w:val="548DD4"/>
-                <w:sz w:val="20"/>
-                <w:szCs w:val="20"/>
-                <w:lang w:eastAsia="es-CL"/>
-              </w:rPr>
-              <w:t>sección</w:t>
-            </w:r>
-            <w:r>
-              <w:rPr>
-                <w:rFonts w:ascii="Calibri" w:hAnsi="Calibri" w:cs="Arial"/>
-                <w:i/>
-                <w:color w:val="548DD4"/>
-                <w:sz w:val="20"/>
-                <w:szCs w:val="20"/>
-                <w:lang w:eastAsia="es-CL"/>
-              </w:rPr>
-              <w:t xml:space="preserve"> deberá</w:t>
-            </w:r>
-            <w:r>
-              <w:rPr>
-                <w:rFonts w:ascii="Calibri" w:hAnsi="Calibri" w:cs="Arial"/>
-                <w:i/>
-                <w:color w:val="548DD4"/>
-                <w:sz w:val="20"/>
-                <w:szCs w:val="20"/>
-                <w:lang w:eastAsia="es-CL"/>
-              </w:rPr>
-              <w:t>s</w:t>
-            </w:r>
-            <w:r>
-              <w:rPr>
-                <w:rFonts w:ascii="Calibri" w:hAnsi="Calibri" w:cs="Arial"/>
-                <w:i/>
-                <w:color w:val="548DD4"/>
-                <w:sz w:val="20"/>
-                <w:szCs w:val="20"/>
-                <w:lang w:eastAsia="es-CL"/>
-              </w:rPr>
-              <w:t xml:space="preserve"> </w:t>
-            </w:r>
-            <w:r>
-              <w:rPr>
-                <w:rFonts w:ascii="Calibri" w:hAnsi="Calibri" w:cs="Arial"/>
-                <w:i/>
-                <w:color w:val="548DD4"/>
-                <w:sz w:val="20"/>
-                <w:szCs w:val="20"/>
-                <w:lang w:eastAsia="es-CL"/>
-              </w:rPr>
-              <w:t xml:space="preserve">realizar un resumen de los avances que has realizado en tu proyecto APT. </w:t>
-            </w:r>
-            <w:r>
-              <w:rPr>
-                <w:rFonts w:ascii="Calibri" w:hAnsi="Calibri" w:cs="Arial"/>
-                <w:i/>
-                <w:color w:val="548DD4"/>
-                <w:sz w:val="20"/>
-                <w:szCs w:val="20"/>
-                <w:lang w:eastAsia="es-CL"/>
-              </w:rPr>
-              <w:t xml:space="preserve">Relata </w:t>
-            </w:r>
-            <w:r>
-              <w:rPr>
-                <w:rFonts w:ascii="Calibri" w:hAnsi="Calibri" w:cs="Arial"/>
-                <w:i/>
-                <w:color w:val="548DD4"/>
-                <w:sz w:val="20"/>
-                <w:szCs w:val="20"/>
-                <w:lang w:eastAsia="es-CL"/>
-              </w:rPr>
-              <w:t xml:space="preserve">brevemente </w:t>
-            </w:r>
-            <w:r>
-              <w:rPr>
-                <w:rFonts w:ascii="Calibri" w:hAnsi="Calibri" w:cs="Arial"/>
-                <w:i/>
-                <w:color w:val="548DD4"/>
-                <w:sz w:val="20"/>
-                <w:szCs w:val="20"/>
-                <w:lang w:eastAsia="es-CL"/>
-              </w:rPr>
-              <w:t xml:space="preserve">qué </w:t>
-            </w:r>
-            <w:r>
-              <w:rPr>
-                <w:rFonts w:ascii="Calibri" w:hAnsi="Calibri" w:cs="Arial"/>
-                <w:i/>
-                <w:color w:val="548DD4"/>
-                <w:sz w:val="20"/>
-                <w:szCs w:val="20"/>
-                <w:lang w:eastAsia="es-CL"/>
-              </w:rPr>
-              <w:t xml:space="preserve">actividades </w:t>
-            </w:r>
-            <w:r>
-              <w:rPr>
-                <w:rFonts w:ascii="Calibri" w:hAnsi="Calibri" w:cs="Arial"/>
-                <w:i/>
-                <w:color w:val="548DD4"/>
-                <w:sz w:val="20"/>
-                <w:szCs w:val="20"/>
-                <w:lang w:eastAsia="es-CL"/>
-              </w:rPr>
-              <w:t>del proyecto has llevado a cabo y qué objetivos específicos has cumplido hasta el minuto y de qué manera.</w:t>
-            </w:r>
-          </w:p>
-          <w:p>
-            <w:pPr>
-              <w:jc w:val="both"/>
-              <w:rPr>
-                <w:rFonts w:ascii="Calibri" w:hAnsi="Calibri" w:cs="Arial"/>
-                <w:i/>
-                <w:color w:val="548DD4"/>
-                <w:sz w:val="20"/>
-                <w:szCs w:val="20"/>
-                <w:lang w:eastAsia="es-CL"/>
-              </w:rPr>
-            </w:pPr>
-            <w:r>
-              <w:rPr>
-                <w:rFonts w:ascii="Calibri" w:hAnsi="Calibri" w:cs="Arial"/>
-                <w:i/>
-                <w:color w:val="548DD4"/>
-                <w:sz w:val="20"/>
-                <w:szCs w:val="20"/>
-                <w:lang w:eastAsia="es-CL"/>
-              </w:rPr>
-              <w:t>En caso que hayas realizado ajustes a los objetivos o metodología, debes incluir dichos apartados nuevamente en este informe, señalando cuáles son dichos ajustes.</w:t>
+              <w:t>Objetivo específico 1. Analizar la problemática y definir requisitos funcionales: Se investigaron las dificultades que enfrentan pacientes, principalmente adultos mayores y personas con polifarmacia, para cumplir correctamente la toma de medicamentos. A partir de esta investigación, se elaboró un documento de requisitos funcionales que recoge las necesidades del usuario y las funcionalidades esenciales de la aplicación. Esta tarea se encuentra alineada con la competencia de ofrecer propuestas de solución informática, y fue realizada mediante reuniones virtuales para coordinación</w:t>
+            </w:r>
+          </w:p>
+          <w:p>
+            <w:pPr>
+              <w:jc w:val="both"/>
+              <w:rPr>
+                <w:rFonts w:ascii="Calibri" w:hAnsi="Calibri" w:cs="Arial"/>
+                <w:i/>
+                <w:color w:val="548DD4"/>
+                <w:sz w:val="20"/>
+                <w:szCs w:val="20"/>
+                <w:lang w:eastAsia="es-CL"/>
+              </w:rPr>
+            </w:pPr>
+            <w:r>
+              <w:rPr>
+                <w:rFonts w:ascii="Calibri" w:hAnsi="Calibri" w:cs="Arial"/>
+                <w:i/>
+                <w:color w:val="548DD4"/>
+                <w:sz w:val="20"/>
+                <w:szCs w:val="20"/>
+                <w:lang w:eastAsia="es-CL"/>
+              </w:rPr>
+              <w:t xml:space="preserve">Objetivo específico 2.  Diseñar la estructura de la base de datos: Se diseñó un modelo de datos completo que incluye entidades clave como usuarios, medicamentos, dosis y horarios, asegurando la integridad de la información y la correcta relación entre entidades. Esta actividad se vincula con la competencia de construir el modelo arquitectónico de una solución sistémica que soporte los procesos del negocio, empleando herramientas como MySQL, Spring Boot, Microsoft </w:t>
+            </w:r>
+            <w:proofErr w:type="gramStart"/>
+            <w:r>
+              <w:rPr>
+                <w:rFonts w:ascii="Calibri" w:hAnsi="Calibri" w:cs="Arial"/>
+                <w:i/>
+                <w:color w:val="548DD4"/>
+                <w:sz w:val="20"/>
+                <w:szCs w:val="20"/>
+                <w:lang w:eastAsia="es-CL"/>
+              </w:rPr>
+              <w:t>Azure  y</w:t>
+            </w:r>
+            <w:proofErr w:type="gramEnd"/>
+            <w:r>
+              <w:rPr>
+                <w:rFonts w:ascii="Calibri" w:hAnsi="Calibri" w:cs="Arial"/>
+                <w:i/>
+                <w:color w:val="548DD4"/>
+                <w:sz w:val="20"/>
+                <w:szCs w:val="20"/>
+                <w:lang w:eastAsia="es-CL"/>
+              </w:rPr>
+              <w:t xml:space="preserve"> Draw.io.</w:t>
+            </w:r>
+          </w:p>
+          <w:p>
+            <w:pPr>
+              <w:jc w:val="both"/>
+              <w:rPr>
+                <w:rFonts w:ascii="Calibri" w:hAnsi="Calibri" w:cs="Arial"/>
+                <w:i/>
+                <w:color w:val="548DD4"/>
+                <w:sz w:val="20"/>
+                <w:szCs w:val="20"/>
+                <w:lang w:eastAsia="es-CL"/>
+              </w:rPr>
+            </w:pPr>
+            <w:r>
+              <w:rPr>
+                <w:rFonts w:ascii="Calibri" w:hAnsi="Calibri" w:cs="Arial"/>
+                <w:i/>
+                <w:color w:val="548DD4"/>
+                <w:sz w:val="20"/>
+                <w:szCs w:val="20"/>
+                <w:lang w:eastAsia="es-CL"/>
+              </w:rPr>
+              <w:t>Objetivo específico 3. Desarrollar la aplicación móvil con funciones principales: Se implementaron los módulos iniciales de la aplicación, permitiendo el registro de usuarios, de medicamentos y la activación de alertas básicas en un simulador móvil. Esta actividad aborda la competencia de desarrollar una solución de software utilizando técnicas que permitan sistematizar el proceso de desarrollo y mantenimiento, asegurando que la aplicación cumpla con los objetivos planteados.</w:t>
+            </w:r>
+          </w:p>
+          <w:p>
+            <w:pPr>
+              <w:jc w:val="both"/>
+              <w:rPr>
+                <w:rFonts w:ascii="Calibri" w:hAnsi="Calibri" w:cs="Arial"/>
+                <w:i/>
+                <w:color w:val="548DD4"/>
+                <w:sz w:val="20"/>
+                <w:szCs w:val="20"/>
+                <w:lang w:eastAsia="es-CL"/>
+              </w:rPr>
+            </w:pPr>
+            <w:r>
+              <w:rPr>
+                <w:rFonts w:ascii="Calibri" w:hAnsi="Calibri" w:cs="Arial"/>
+                <w:i/>
+                <w:color w:val="548DD4"/>
+                <w:sz w:val="20"/>
+                <w:szCs w:val="20"/>
+                <w:lang w:eastAsia="es-CL"/>
+              </w:rPr>
+              <w:t>Metodología aplicada: Para gestionar estas actividades, se adoptó la metodología ágil Kanban mediante la aplicación Jira, permitiendo organizar tareas, visualizar el flujo de trabajo y priorizar entregables de manera efectiva. Esto ha facilitado el control del avance y la identificación temprana de posibles obstáculos.</w:t>
             </w:r>
           </w:p>
         </w:tc>
@@ -806,6 +765,7 @@
                 <w:rFonts w:ascii="Calibri" w:hAnsi="Calibri"/>
                 <w:color w:val="1F3864" w:themeColor="accent1" w:themeShade="80"/>
               </w:rPr>
+              <w:lastRenderedPageBreak/>
               <w:t>Objetivos</w:t>
             </w:r>
           </w:p>
@@ -820,6 +780,591 @@
               <w:jc w:val="both"/>
               <w:rPr>
                 <w:rFonts w:ascii="Calibri" w:hAnsi="Calibri" w:cs="Arial"/>
+                <w:bCs/>
+                <w:i/>
+                <w:color w:val="548DD4"/>
+                <w:sz w:val="18"/>
+                <w:szCs w:val="18"/>
+                <w:lang w:eastAsia="es-CL"/>
+              </w:rPr>
+            </w:pPr>
+            <w:r>
+              <w:rPr>
+                <w:rFonts w:ascii="Calibri" w:hAnsi="Calibri" w:cs="Arial"/>
+                <w:bCs/>
+                <w:i/>
+                <w:color w:val="548DD4"/>
+                <w:sz w:val="18"/>
+                <w:szCs w:val="18"/>
+                <w:lang w:eastAsia="es-CL"/>
+              </w:rPr>
+              <w:t>1.- Analizar la problemática y definir requisitos funcionales</w:t>
+            </w:r>
+          </w:p>
+          <w:p>
+            <w:pPr>
+              <w:jc w:val="both"/>
+              <w:rPr>
+                <w:rFonts w:ascii="Calibri" w:hAnsi="Calibri" w:cs="Arial"/>
+                <w:bCs/>
+                <w:i/>
+                <w:color w:val="548DD4"/>
+                <w:sz w:val="18"/>
+                <w:szCs w:val="18"/>
+                <w:lang w:eastAsia="es-CL"/>
+              </w:rPr>
+            </w:pPr>
+            <w:r>
+              <w:rPr>
+                <w:rFonts w:ascii="Calibri" w:hAnsi="Calibri" w:cs="Arial"/>
+                <w:bCs/>
+                <w:i/>
+                <w:color w:val="548DD4"/>
+                <w:sz w:val="18"/>
+                <w:szCs w:val="18"/>
+                <w:lang w:eastAsia="es-CL"/>
+              </w:rPr>
+              <w:t>●</w:t>
+            </w:r>
+            <w:r>
+              <w:rPr>
+                <w:rFonts w:ascii="Calibri" w:hAnsi="Calibri" w:cs="Arial"/>
+                <w:bCs/>
+                <w:i/>
+                <w:color w:val="548DD4"/>
+                <w:sz w:val="18"/>
+                <w:szCs w:val="18"/>
+                <w:lang w:eastAsia="es-CL"/>
+              </w:rPr>
+              <w:tab/>
+              <w:t>Acción: Investigar las dificultades en la toma eficaz de medicamentos en adultos mayores y personas con polifarmacia, elaborando un documento de requisitos funcionales.</w:t>
+            </w:r>
+          </w:p>
+          <w:p>
+            <w:pPr>
+              <w:jc w:val="both"/>
+              <w:rPr>
+                <w:rFonts w:ascii="Calibri" w:hAnsi="Calibri" w:cs="Arial"/>
+                <w:bCs/>
+                <w:i/>
+                <w:color w:val="548DD4"/>
+                <w:sz w:val="18"/>
+                <w:szCs w:val="18"/>
+                <w:lang w:eastAsia="es-CL"/>
+              </w:rPr>
+            </w:pPr>
+            <w:r>
+              <w:rPr>
+                <w:rFonts w:ascii="Calibri" w:hAnsi="Calibri" w:cs="Arial"/>
+                <w:bCs/>
+                <w:i/>
+                <w:color w:val="548DD4"/>
+                <w:sz w:val="18"/>
+                <w:szCs w:val="18"/>
+                <w:lang w:eastAsia="es-CL"/>
+              </w:rPr>
+              <w:t>●</w:t>
+            </w:r>
+            <w:r>
+              <w:rPr>
+                <w:rFonts w:ascii="Calibri" w:hAnsi="Calibri" w:cs="Arial"/>
+                <w:bCs/>
+                <w:i/>
+                <w:color w:val="548DD4"/>
+                <w:sz w:val="18"/>
+                <w:szCs w:val="18"/>
+                <w:lang w:eastAsia="es-CL"/>
+              </w:rPr>
+              <w:tab/>
+              <w:t>Verificación: Validación del documento por el equipo de trabajo y comparación con la problemática planteada.</w:t>
+            </w:r>
+          </w:p>
+          <w:p>
+            <w:pPr>
+              <w:jc w:val="both"/>
+              <w:rPr>
+                <w:rFonts w:ascii="Calibri" w:hAnsi="Calibri" w:cs="Arial"/>
+                <w:bCs/>
+                <w:i/>
+                <w:color w:val="548DD4"/>
+                <w:sz w:val="18"/>
+                <w:szCs w:val="18"/>
+                <w:lang w:eastAsia="es-CL"/>
+              </w:rPr>
+            </w:pPr>
+            <w:r>
+              <w:rPr>
+                <w:rFonts w:ascii="Calibri" w:hAnsi="Calibri" w:cs="Arial"/>
+                <w:bCs/>
+                <w:i/>
+                <w:color w:val="548DD4"/>
+                <w:sz w:val="18"/>
+                <w:szCs w:val="18"/>
+                <w:lang w:eastAsia="es-CL"/>
+              </w:rPr>
+              <w:t>2.- Diseñar la estructura de la base de datos</w:t>
+            </w:r>
+          </w:p>
+          <w:p>
+            <w:pPr>
+              <w:jc w:val="both"/>
+              <w:rPr>
+                <w:rFonts w:ascii="Calibri" w:hAnsi="Calibri" w:cs="Arial"/>
+                <w:bCs/>
+                <w:i/>
+                <w:color w:val="548DD4"/>
+                <w:sz w:val="18"/>
+                <w:szCs w:val="18"/>
+                <w:lang w:eastAsia="es-CL"/>
+              </w:rPr>
+            </w:pPr>
+            <w:r>
+              <w:rPr>
+                <w:rFonts w:ascii="Calibri" w:hAnsi="Calibri" w:cs="Arial"/>
+                <w:bCs/>
+                <w:i/>
+                <w:color w:val="548DD4"/>
+                <w:sz w:val="18"/>
+                <w:szCs w:val="18"/>
+                <w:lang w:eastAsia="es-CL"/>
+              </w:rPr>
+              <w:t>●</w:t>
+            </w:r>
+            <w:r>
+              <w:rPr>
+                <w:rFonts w:ascii="Calibri" w:hAnsi="Calibri" w:cs="Arial"/>
+                <w:bCs/>
+                <w:i/>
+                <w:color w:val="548DD4"/>
+                <w:sz w:val="18"/>
+                <w:szCs w:val="18"/>
+                <w:lang w:eastAsia="es-CL"/>
+              </w:rPr>
+              <w:tab/>
+              <w:t>Acción: Crear un modelo de base de datos que registre usuarios, medicamentos, dosis y horarios.</w:t>
+            </w:r>
+          </w:p>
+          <w:p>
+            <w:pPr>
+              <w:jc w:val="both"/>
+              <w:rPr>
+                <w:rFonts w:ascii="Calibri" w:hAnsi="Calibri" w:cs="Arial"/>
+                <w:bCs/>
+                <w:i/>
+                <w:color w:val="548DD4"/>
+                <w:sz w:val="18"/>
+                <w:szCs w:val="18"/>
+                <w:lang w:eastAsia="es-CL"/>
+              </w:rPr>
+            </w:pPr>
+            <w:r>
+              <w:rPr>
+                <w:rFonts w:ascii="Calibri" w:hAnsi="Calibri" w:cs="Arial"/>
+                <w:bCs/>
+                <w:i/>
+                <w:color w:val="548DD4"/>
+                <w:sz w:val="18"/>
+                <w:szCs w:val="18"/>
+                <w:lang w:eastAsia="es-CL"/>
+              </w:rPr>
+              <w:t>●</w:t>
+            </w:r>
+            <w:r>
+              <w:rPr>
+                <w:rFonts w:ascii="Calibri" w:hAnsi="Calibri" w:cs="Arial"/>
+                <w:bCs/>
+                <w:i/>
+                <w:color w:val="548DD4"/>
+                <w:sz w:val="18"/>
+                <w:szCs w:val="18"/>
+                <w:lang w:eastAsia="es-CL"/>
+              </w:rPr>
+              <w:tab/>
+              <w:t>Verificación: Implementación de al menos 4 entidades principales con relaciones correctas, probadas mediante consultas funcionales.</w:t>
+            </w:r>
+          </w:p>
+          <w:p>
+            <w:pPr>
+              <w:jc w:val="both"/>
+              <w:rPr>
+                <w:rFonts w:ascii="Calibri" w:hAnsi="Calibri" w:cs="Arial"/>
+                <w:bCs/>
+                <w:i/>
+                <w:color w:val="548DD4"/>
+                <w:sz w:val="18"/>
+                <w:szCs w:val="18"/>
+                <w:lang w:eastAsia="es-CL"/>
+              </w:rPr>
+            </w:pPr>
+            <w:r>
+              <w:rPr>
+                <w:rFonts w:ascii="Calibri" w:hAnsi="Calibri" w:cs="Arial"/>
+                <w:bCs/>
+                <w:i/>
+                <w:color w:val="548DD4"/>
+                <w:sz w:val="18"/>
+                <w:szCs w:val="18"/>
+                <w:lang w:eastAsia="es-CL"/>
+              </w:rPr>
+              <w:t>3.- Desarrollar la aplicación móvil con funciones principales</w:t>
+            </w:r>
+          </w:p>
+          <w:p>
+            <w:pPr>
+              <w:jc w:val="both"/>
+              <w:rPr>
+                <w:rFonts w:ascii="Calibri" w:hAnsi="Calibri" w:cs="Arial"/>
+                <w:bCs/>
+                <w:i/>
+                <w:color w:val="548DD4"/>
+                <w:sz w:val="18"/>
+                <w:szCs w:val="18"/>
+                <w:lang w:eastAsia="es-CL"/>
+              </w:rPr>
+            </w:pPr>
+            <w:r>
+              <w:rPr>
+                <w:rFonts w:ascii="Calibri" w:hAnsi="Calibri" w:cs="Arial"/>
+                <w:bCs/>
+                <w:i/>
+                <w:color w:val="548DD4"/>
+                <w:sz w:val="18"/>
+                <w:szCs w:val="18"/>
+                <w:lang w:eastAsia="es-CL"/>
+              </w:rPr>
+              <w:t>●</w:t>
+            </w:r>
+            <w:r>
+              <w:rPr>
+                <w:rFonts w:ascii="Calibri" w:hAnsi="Calibri" w:cs="Arial"/>
+                <w:bCs/>
+                <w:i/>
+                <w:color w:val="548DD4"/>
+                <w:sz w:val="18"/>
+                <w:szCs w:val="18"/>
+                <w:lang w:eastAsia="es-CL"/>
+              </w:rPr>
+              <w:tab/>
+              <w:t>Acción: Programar los módulos de registro de medicamentos, generación de alertas y notificaciones.</w:t>
+            </w:r>
+          </w:p>
+          <w:p>
+            <w:pPr>
+              <w:jc w:val="both"/>
+              <w:rPr>
+                <w:rFonts w:ascii="Calibri" w:hAnsi="Calibri" w:cs="Arial"/>
+                <w:bCs/>
+                <w:i/>
+                <w:color w:val="548DD4"/>
+                <w:sz w:val="18"/>
+                <w:szCs w:val="18"/>
+                <w:lang w:eastAsia="es-CL"/>
+              </w:rPr>
+            </w:pPr>
+            <w:r>
+              <w:rPr>
+                <w:rFonts w:ascii="Calibri" w:hAnsi="Calibri" w:cs="Arial"/>
+                <w:bCs/>
+                <w:i/>
+                <w:color w:val="548DD4"/>
+                <w:sz w:val="18"/>
+                <w:szCs w:val="18"/>
+                <w:lang w:eastAsia="es-CL"/>
+              </w:rPr>
+              <w:t>●</w:t>
+            </w:r>
+            <w:r>
+              <w:rPr>
+                <w:rFonts w:ascii="Calibri" w:hAnsi="Calibri" w:cs="Arial"/>
+                <w:bCs/>
+                <w:i/>
+                <w:color w:val="548DD4"/>
+                <w:sz w:val="18"/>
+                <w:szCs w:val="18"/>
+                <w:lang w:eastAsia="es-CL"/>
+              </w:rPr>
+              <w:tab/>
+              <w:t>Verificación: Permitir el registro de al menos 10 medicamentos y comprobar que las notificaciones se activen en un simulador móvil.</w:t>
+            </w:r>
+          </w:p>
+          <w:p>
+            <w:pPr>
+              <w:jc w:val="both"/>
+              <w:rPr>
+                <w:rFonts w:ascii="Calibri" w:hAnsi="Calibri" w:cs="Arial"/>
+                <w:bCs/>
+                <w:i/>
+                <w:color w:val="548DD4"/>
+                <w:sz w:val="18"/>
+                <w:szCs w:val="18"/>
+                <w:lang w:eastAsia="es-CL"/>
+              </w:rPr>
+            </w:pPr>
+            <w:r>
+              <w:rPr>
+                <w:rFonts w:ascii="Calibri" w:hAnsi="Calibri" w:cs="Arial"/>
+                <w:bCs/>
+                <w:i/>
+                <w:color w:val="548DD4"/>
+                <w:sz w:val="18"/>
+                <w:szCs w:val="18"/>
+                <w:lang w:eastAsia="es-CL"/>
+              </w:rPr>
+              <w:t>4.- Incorporar alertas a cuidadores o familiares</w:t>
+            </w:r>
+          </w:p>
+          <w:p>
+            <w:pPr>
+              <w:jc w:val="both"/>
+              <w:rPr>
+                <w:rFonts w:ascii="Calibri" w:hAnsi="Calibri" w:cs="Arial"/>
+                <w:bCs/>
+                <w:i/>
+                <w:color w:val="548DD4"/>
+                <w:sz w:val="18"/>
+                <w:szCs w:val="18"/>
+                <w:lang w:eastAsia="es-CL"/>
+              </w:rPr>
+            </w:pPr>
+            <w:r>
+              <w:rPr>
+                <w:rFonts w:ascii="Calibri" w:hAnsi="Calibri" w:cs="Arial"/>
+                <w:bCs/>
+                <w:i/>
+                <w:color w:val="548DD4"/>
+                <w:sz w:val="18"/>
+                <w:szCs w:val="18"/>
+                <w:lang w:eastAsia="es-CL"/>
+              </w:rPr>
+              <w:t>●</w:t>
+            </w:r>
+            <w:r>
+              <w:rPr>
+                <w:rFonts w:ascii="Calibri" w:hAnsi="Calibri" w:cs="Arial"/>
+                <w:bCs/>
+                <w:i/>
+                <w:color w:val="548DD4"/>
+                <w:sz w:val="18"/>
+                <w:szCs w:val="18"/>
+                <w:lang w:eastAsia="es-CL"/>
+              </w:rPr>
+              <w:tab/>
+              <w:t>Acción: Implementar una funcionalidad que envíe notificaciones a un contacto externo cuando el usuario no confirme la toma.</w:t>
+            </w:r>
+          </w:p>
+          <w:p>
+            <w:pPr>
+              <w:jc w:val="both"/>
+              <w:rPr>
+                <w:rFonts w:ascii="Calibri" w:hAnsi="Calibri" w:cs="Arial"/>
+                <w:bCs/>
+                <w:i/>
+                <w:color w:val="548DD4"/>
+                <w:sz w:val="18"/>
+                <w:szCs w:val="18"/>
+                <w:lang w:eastAsia="es-CL"/>
+              </w:rPr>
+            </w:pPr>
+            <w:r>
+              <w:rPr>
+                <w:rFonts w:ascii="Calibri" w:hAnsi="Calibri" w:cs="Arial"/>
+                <w:bCs/>
+                <w:i/>
+                <w:color w:val="548DD4"/>
+                <w:sz w:val="18"/>
+                <w:szCs w:val="18"/>
+                <w:lang w:eastAsia="es-CL"/>
+              </w:rPr>
+              <w:t>●</w:t>
+            </w:r>
+            <w:r>
+              <w:rPr>
+                <w:rFonts w:ascii="Calibri" w:hAnsi="Calibri" w:cs="Arial"/>
+                <w:bCs/>
+                <w:i/>
+                <w:color w:val="548DD4"/>
+                <w:sz w:val="18"/>
+                <w:szCs w:val="18"/>
+                <w:lang w:eastAsia="es-CL"/>
+              </w:rPr>
+              <w:tab/>
+              <w:t>Verificación: Realizar pruebas en las que al menos un usuario externo reciba las alertas en condiciones simuladas.</w:t>
+            </w:r>
+          </w:p>
+          <w:p>
+            <w:pPr>
+              <w:jc w:val="both"/>
+              <w:rPr>
+                <w:rFonts w:ascii="Calibri" w:hAnsi="Calibri" w:cs="Arial"/>
+                <w:bCs/>
+                <w:i/>
+                <w:color w:val="548DD4"/>
+                <w:sz w:val="18"/>
+                <w:szCs w:val="18"/>
+                <w:lang w:eastAsia="es-CL"/>
+              </w:rPr>
+            </w:pPr>
+            <w:r>
+              <w:rPr>
+                <w:rFonts w:ascii="Calibri" w:hAnsi="Calibri" w:cs="Arial"/>
+                <w:bCs/>
+                <w:i/>
+                <w:color w:val="548DD4"/>
+                <w:sz w:val="18"/>
+                <w:szCs w:val="18"/>
+                <w:lang w:eastAsia="es-CL"/>
+              </w:rPr>
+              <w:t>5.- Probar y validar la aplicación con casos simulados</w:t>
+            </w:r>
+          </w:p>
+          <w:p>
+            <w:pPr>
+              <w:jc w:val="both"/>
+              <w:rPr>
+                <w:rFonts w:ascii="Calibri" w:hAnsi="Calibri" w:cs="Arial"/>
+                <w:bCs/>
+                <w:i/>
+                <w:color w:val="548DD4"/>
+                <w:sz w:val="18"/>
+                <w:szCs w:val="18"/>
+                <w:lang w:eastAsia="es-CL"/>
+              </w:rPr>
+            </w:pPr>
+            <w:r>
+              <w:rPr>
+                <w:rFonts w:ascii="Calibri" w:hAnsi="Calibri" w:cs="Arial"/>
+                <w:bCs/>
+                <w:i/>
+                <w:color w:val="548DD4"/>
+                <w:sz w:val="18"/>
+                <w:szCs w:val="18"/>
+                <w:lang w:eastAsia="es-CL"/>
+              </w:rPr>
+              <w:t>●</w:t>
+            </w:r>
+            <w:r>
+              <w:rPr>
+                <w:rFonts w:ascii="Calibri" w:hAnsi="Calibri" w:cs="Arial"/>
+                <w:bCs/>
+                <w:i/>
+                <w:color w:val="548DD4"/>
+                <w:sz w:val="18"/>
+                <w:szCs w:val="18"/>
+                <w:lang w:eastAsia="es-CL"/>
+              </w:rPr>
+              <w:tab/>
+              <w:t>Acción: Ejecutar pruebas funcionales y de usabilidad con distintos escenarios de uso.</w:t>
+            </w:r>
+          </w:p>
+          <w:p>
+            <w:pPr>
+              <w:jc w:val="both"/>
+              <w:rPr>
+                <w:rFonts w:ascii="Calibri" w:hAnsi="Calibri" w:cs="Arial"/>
+                <w:bCs/>
+                <w:i/>
+                <w:color w:val="548DD4"/>
+                <w:sz w:val="18"/>
+                <w:szCs w:val="18"/>
+                <w:lang w:eastAsia="es-CL"/>
+              </w:rPr>
+            </w:pPr>
+            <w:r>
+              <w:rPr>
+                <w:rFonts w:ascii="Calibri" w:hAnsi="Calibri" w:cs="Arial"/>
+                <w:bCs/>
+                <w:i/>
+                <w:color w:val="548DD4"/>
+                <w:sz w:val="18"/>
+                <w:szCs w:val="18"/>
+                <w:lang w:eastAsia="es-CL"/>
+              </w:rPr>
+              <w:t>●</w:t>
+            </w:r>
+            <w:r>
+              <w:rPr>
+                <w:rFonts w:ascii="Calibri" w:hAnsi="Calibri" w:cs="Arial"/>
+                <w:bCs/>
+                <w:i/>
+                <w:color w:val="548DD4"/>
+                <w:sz w:val="18"/>
+                <w:szCs w:val="18"/>
+                <w:lang w:eastAsia="es-CL"/>
+              </w:rPr>
+              <w:tab/>
+              <w:t>Verificación: Aplicar al menos 5 casos de prueba documentados que aseguren correcto funcionamiento y facilidad de uso.</w:t>
+            </w:r>
+          </w:p>
+          <w:p>
+            <w:pPr>
+              <w:jc w:val="both"/>
+              <w:rPr>
+                <w:rFonts w:ascii="Calibri" w:hAnsi="Calibri" w:cs="Arial"/>
+                <w:bCs/>
+                <w:i/>
+                <w:color w:val="548DD4"/>
+                <w:sz w:val="18"/>
+                <w:szCs w:val="18"/>
+                <w:lang w:eastAsia="es-CL"/>
+              </w:rPr>
+            </w:pPr>
+            <w:r>
+              <w:rPr>
+                <w:rFonts w:ascii="Calibri" w:hAnsi="Calibri" w:cs="Arial"/>
+                <w:bCs/>
+                <w:i/>
+                <w:color w:val="548DD4"/>
+                <w:sz w:val="18"/>
+                <w:szCs w:val="18"/>
+                <w:lang w:eastAsia="es-CL"/>
+              </w:rPr>
+              <w:t>6.- Documentar el proceso y los resultados obtenidos</w:t>
+            </w:r>
+          </w:p>
+          <w:p>
+            <w:pPr>
+              <w:jc w:val="both"/>
+              <w:rPr>
+                <w:rFonts w:ascii="Calibri" w:hAnsi="Calibri" w:cs="Arial"/>
+                <w:bCs/>
+                <w:i/>
+                <w:color w:val="548DD4"/>
+                <w:sz w:val="18"/>
+                <w:szCs w:val="18"/>
+                <w:lang w:eastAsia="es-CL"/>
+              </w:rPr>
+            </w:pPr>
+            <w:r>
+              <w:rPr>
+                <w:rFonts w:ascii="Calibri" w:hAnsi="Calibri" w:cs="Arial"/>
+                <w:bCs/>
+                <w:i/>
+                <w:color w:val="548DD4"/>
+                <w:sz w:val="18"/>
+                <w:szCs w:val="18"/>
+                <w:lang w:eastAsia="es-CL"/>
+              </w:rPr>
+              <w:t>●</w:t>
+            </w:r>
+            <w:r>
+              <w:rPr>
+                <w:rFonts w:ascii="Calibri" w:hAnsi="Calibri" w:cs="Arial"/>
+                <w:bCs/>
+                <w:i/>
+                <w:color w:val="548DD4"/>
+                <w:sz w:val="18"/>
+                <w:szCs w:val="18"/>
+                <w:lang w:eastAsia="es-CL"/>
+              </w:rPr>
+              <w:tab/>
+              <w:t>Acción: Elaborar un informe con el detalle del desarrollo, pruebas y resultados alcanzados.</w:t>
+            </w:r>
+          </w:p>
+          <w:p>
+            <w:pPr>
+              <w:jc w:val="both"/>
+              <w:rPr>
+                <w:rFonts w:ascii="Calibri" w:hAnsi="Calibri" w:cs="Arial"/>
                 <w:b/>
                 <w:i/>
                 <w:color w:val="548DD4"/>
@@ -831,13 +1376,27 @@
             <w:r>
               <w:rPr>
                 <w:rFonts w:ascii="Calibri" w:hAnsi="Calibri" w:cs="Arial"/>
-                <w:i/>
-                <w:color w:val="548DD4"/>
-                <w:sz w:val="20"/>
-                <w:szCs w:val="20"/>
-                <w:lang w:eastAsia="es-CL"/>
-              </w:rPr>
-              <w:t>Opcional en caso de ajuste</w:t>
+                <w:bCs/>
+                <w:i/>
+                <w:color w:val="548DD4"/>
+                <w:sz w:val="18"/>
+                <w:szCs w:val="18"/>
+                <w:lang w:eastAsia="es-CL"/>
+              </w:rPr>
+              <w:t>●</w:t>
+            </w:r>
+            <w:r>
+              <w:rPr>
+                <w:rFonts w:ascii="Calibri" w:hAnsi="Calibri" w:cs="Arial"/>
+                <w:bCs/>
+                <w:i/>
+                <w:color w:val="548DD4"/>
+                <w:sz w:val="18"/>
+                <w:szCs w:val="18"/>
+                <w:lang w:eastAsia="es-CL"/>
+              </w:rPr>
+              <w:tab/>
+              <w:t>Verificación: Entrega del informe final con la comparación entre objetivos planteados y logros obtenidos.</w:t>
             </w:r>
           </w:p>
         </w:tc>
@@ -893,7 +1452,31 @@
                 <w:szCs w:val="20"/>
                 <w:lang w:eastAsia="es-CL"/>
               </w:rPr>
-              <w:t>Opcional en caso de ajuste</w:t>
+              <w:t>Para abordar la problemática identificada y cumplir con los objetivos del proyecto, se utilizará una metodología ágil de desarrollo, específicamente Kanban. Esta metodología permitirá organizar y visualizar el flujo de trabajo a través de un tablero, donde se registran las tareas en distintas etapas como Pendiente, En proceso, en revisión y Finalizado. Esto facilitará el control del avance, la priorización de actividades y la detección temprana de posibles obstáculos.</w:t>
+            </w:r>
+          </w:p>
+          <w:p>
+            <w:pPr>
+              <w:jc w:val="both"/>
+              <w:rPr>
+                <w:rFonts w:ascii="Calibri" w:hAnsi="Calibri" w:cs="Arial"/>
+                <w:i/>
+                <w:color w:val="548DD4"/>
+                <w:sz w:val="20"/>
+                <w:szCs w:val="20"/>
+                <w:lang w:eastAsia="es-CL"/>
+              </w:rPr>
+            </w:pPr>
+            <w:r>
+              <w:rPr>
+                <w:rFonts w:ascii="Calibri" w:hAnsi="Calibri" w:cs="Arial"/>
+                <w:i/>
+                <w:color w:val="548DD4"/>
+                <w:sz w:val="20"/>
+                <w:szCs w:val="20"/>
+                <w:lang w:eastAsia="es-CL"/>
+              </w:rPr>
+              <w:t>El enfoque ágil es especialmente adecuado ya que el proyecto se desarrollará dentro de un semestre académico, con entregas parciales y la necesidad de adaptarse a cambios o mejoras que surjan durante el proceso.</w:t>
             </w:r>
           </w:p>
         </w:tc>
@@ -919,6 +1502,7 @@
                 <w:rFonts w:ascii="Calibri" w:hAnsi="Calibri"/>
                 <w:color w:val="1F3864" w:themeColor="accent1" w:themeShade="80"/>
               </w:rPr>
+              <w:lastRenderedPageBreak/>
               <w:t>Evidencias de avance</w:t>
             </w:r>
           </w:p>
@@ -937,126 +1521,30 @@
                 <w:color w:val="548DD4"/>
                 <w:sz w:val="20"/>
                 <w:szCs w:val="20"/>
-                <w:lang w:eastAsia="es-CL"/>
-              </w:rPr>
-            </w:pPr>
-            <w:r>
-              <w:rPr>
-                <w:rFonts w:ascii="Calibri" w:hAnsi="Calibri" w:cs="Arial"/>
-                <w:i/>
-                <w:color w:val="548DD4"/>
-                <w:sz w:val="20"/>
-                <w:szCs w:val="20"/>
-                <w:lang w:eastAsia="es-CL"/>
-              </w:rPr>
-              <w:t>Describe la</w:t>
-            </w:r>
-            <w:r>
-              <w:rPr>
-                <w:rFonts w:ascii="Calibri" w:hAnsi="Calibri" w:cs="Arial"/>
-                <w:i/>
-                <w:color w:val="548DD4"/>
-                <w:sz w:val="20"/>
-                <w:szCs w:val="20"/>
-                <w:lang w:eastAsia="es-CL"/>
-              </w:rPr>
-              <w:t>(</w:t>
-            </w:r>
-            <w:r>
-              <w:rPr>
-                <w:rFonts w:ascii="Calibri" w:hAnsi="Calibri" w:cs="Arial"/>
-                <w:i/>
-                <w:color w:val="548DD4"/>
-                <w:sz w:val="20"/>
-                <w:szCs w:val="20"/>
-                <w:lang w:eastAsia="es-CL"/>
-              </w:rPr>
-              <w:t>s</w:t>
-            </w:r>
-            <w:r>
-              <w:rPr>
-                <w:rFonts w:ascii="Calibri" w:hAnsi="Calibri" w:cs="Arial"/>
-                <w:i/>
-                <w:color w:val="548DD4"/>
-                <w:sz w:val="20"/>
-                <w:szCs w:val="20"/>
-                <w:lang w:eastAsia="es-CL"/>
-              </w:rPr>
-              <w:t>)</w:t>
-            </w:r>
-            <w:r>
-              <w:rPr>
-                <w:rFonts w:ascii="Calibri" w:hAnsi="Calibri" w:cs="Arial"/>
-                <w:i/>
-                <w:color w:val="548DD4"/>
-                <w:sz w:val="20"/>
-                <w:szCs w:val="20"/>
-                <w:lang w:eastAsia="es-CL"/>
-              </w:rPr>
-              <w:t xml:space="preserve"> evidencia</w:t>
-            </w:r>
-            <w:r>
-              <w:rPr>
-                <w:rFonts w:ascii="Calibri" w:hAnsi="Calibri" w:cs="Arial"/>
-                <w:i/>
-                <w:color w:val="548DD4"/>
-                <w:sz w:val="20"/>
-                <w:szCs w:val="20"/>
-                <w:lang w:eastAsia="es-CL"/>
-              </w:rPr>
-              <w:t>(</w:t>
-            </w:r>
-            <w:r>
-              <w:rPr>
-                <w:rFonts w:ascii="Calibri" w:hAnsi="Calibri" w:cs="Arial"/>
-                <w:i/>
-                <w:color w:val="548DD4"/>
-                <w:sz w:val="20"/>
-                <w:szCs w:val="20"/>
-                <w:lang w:eastAsia="es-CL"/>
-              </w:rPr>
-              <w:t>s</w:t>
-            </w:r>
-            <w:r>
-              <w:rPr>
-                <w:rFonts w:ascii="Calibri" w:hAnsi="Calibri" w:cs="Arial"/>
-                <w:i/>
-                <w:color w:val="548DD4"/>
-                <w:sz w:val="20"/>
-                <w:szCs w:val="20"/>
-                <w:lang w:eastAsia="es-CL"/>
-              </w:rPr>
-              <w:t>)</w:t>
-            </w:r>
-            <w:r>
-              <w:rPr>
-                <w:rFonts w:ascii="Calibri" w:hAnsi="Calibri" w:cs="Arial"/>
-                <w:i/>
-                <w:color w:val="548DD4"/>
-                <w:sz w:val="20"/>
-                <w:szCs w:val="20"/>
-                <w:lang w:eastAsia="es-CL"/>
-              </w:rPr>
-              <w:t xml:space="preserve"> que </w:t>
-            </w:r>
-            <w:r>
-              <w:rPr>
-                <w:rFonts w:ascii="Calibri" w:hAnsi="Calibri" w:cs="Arial"/>
-                <w:i/>
-                <w:color w:val="548DD4"/>
-                <w:sz w:val="20"/>
-                <w:szCs w:val="20"/>
-                <w:lang w:eastAsia="es-CL"/>
-              </w:rPr>
-              <w:t xml:space="preserve">presentarás en este informe de avance y justifica </w:t>
-            </w:r>
-            <w:r>
-              <w:rPr>
-                <w:rFonts w:ascii="Calibri" w:hAnsi="Calibri" w:cs="Arial"/>
-                <w:i/>
-                <w:color w:val="548DD4"/>
-                <w:sz w:val="20"/>
-                <w:szCs w:val="20"/>
+                <w:highlight w:val="yellow"/>
+                <w:lang w:eastAsia="es-CL"/>
+              </w:rPr>
+            </w:pPr>
+            <w:r>
+              <w:rPr>
+                <w:rFonts w:ascii="Calibri" w:hAnsi="Calibri" w:cs="Arial"/>
+                <w:i/>
+                <w:color w:val="548DD4"/>
+                <w:sz w:val="20"/>
+                <w:szCs w:val="20"/>
+                <w:highlight w:val="yellow"/>
+                <w:lang w:eastAsia="es-CL"/>
+              </w:rPr>
+              <w:t xml:space="preserve">Describe la(s) evidencia(s) que presentarás en este informe de avance y justifica </w:t>
+            </w:r>
+            <w:r>
+              <w:rPr>
+                <w:rFonts w:ascii="Calibri" w:hAnsi="Calibri" w:cs="Arial"/>
+                <w:i/>
+                <w:color w:val="548DD4"/>
+                <w:sz w:val="20"/>
+                <w:szCs w:val="20"/>
+                <w:highlight w:val="yellow"/>
                 <w:lang w:eastAsia="es-CL"/>
               </w:rPr>
               <w:t xml:space="preserve">de qué manera </w:t>
@@ -1068,171 +1556,31 @@
                 <w:color w:val="548DD4"/>
                 <w:sz w:val="20"/>
                 <w:szCs w:val="20"/>
-                <w:lang w:eastAsia="es-CL"/>
-              </w:rPr>
-              <w:t>esta</w:t>
-            </w:r>
-            <w:r>
-              <w:rPr>
-                <w:rFonts w:ascii="Calibri" w:hAnsi="Calibri" w:cs="Arial"/>
-                <w:i/>
-                <w:color w:val="548DD4"/>
-                <w:sz w:val="20"/>
-                <w:szCs w:val="20"/>
-                <w:lang w:eastAsia="es-CL"/>
-              </w:rPr>
-              <w:t>(</w:t>
-            </w:r>
-            <w:r>
-              <w:rPr>
-                <w:rFonts w:ascii="Calibri" w:hAnsi="Calibri" w:cs="Arial"/>
-                <w:i/>
-                <w:color w:val="548DD4"/>
-                <w:sz w:val="20"/>
-                <w:szCs w:val="20"/>
-                <w:lang w:eastAsia="es-CL"/>
-              </w:rPr>
-              <w:t>s</w:t>
-            </w:r>
-            <w:r>
-              <w:rPr>
-                <w:rFonts w:ascii="Calibri" w:hAnsi="Calibri" w:cs="Arial"/>
-                <w:i/>
-                <w:color w:val="548DD4"/>
-                <w:sz w:val="20"/>
-                <w:szCs w:val="20"/>
-                <w:lang w:eastAsia="es-CL"/>
-              </w:rPr>
-              <w:t>)</w:t>
-            </w:r>
-            <w:r>
-              <w:rPr>
-                <w:rFonts w:ascii="Calibri" w:hAnsi="Calibri" w:cs="Arial"/>
-                <w:i/>
-                <w:color w:val="548DD4"/>
-                <w:sz w:val="20"/>
-                <w:szCs w:val="20"/>
-                <w:lang w:eastAsia="es-CL"/>
-              </w:rPr>
-              <w:t xml:space="preserve"> evidencia</w:t>
-            </w:r>
-            <w:r>
-              <w:rPr>
-                <w:rFonts w:ascii="Calibri" w:hAnsi="Calibri" w:cs="Arial"/>
-                <w:i/>
-                <w:color w:val="548DD4"/>
-                <w:sz w:val="20"/>
-                <w:szCs w:val="20"/>
-                <w:lang w:eastAsia="es-CL"/>
-              </w:rPr>
-              <w:t>(</w:t>
-            </w:r>
-            <w:r>
-              <w:rPr>
-                <w:rFonts w:ascii="Calibri" w:hAnsi="Calibri" w:cs="Arial"/>
-                <w:i/>
-                <w:color w:val="548DD4"/>
-                <w:sz w:val="20"/>
-                <w:szCs w:val="20"/>
-                <w:lang w:eastAsia="es-CL"/>
-              </w:rPr>
-              <w:t>s</w:t>
-            </w:r>
-            <w:r>
-              <w:rPr>
-                <w:rFonts w:ascii="Calibri" w:hAnsi="Calibri" w:cs="Arial"/>
-                <w:i/>
-                <w:color w:val="548DD4"/>
-                <w:sz w:val="20"/>
-                <w:szCs w:val="20"/>
-                <w:lang w:eastAsia="es-CL"/>
-              </w:rPr>
-              <w:t>)</w:t>
-            </w:r>
-            <w:r>
-              <w:rPr>
-                <w:rFonts w:ascii="Calibri" w:hAnsi="Calibri" w:cs="Arial"/>
-                <w:i/>
-                <w:color w:val="548DD4"/>
-                <w:sz w:val="20"/>
-                <w:szCs w:val="20"/>
-                <w:lang w:eastAsia="es-CL"/>
-              </w:rPr>
-              <w:t xml:space="preserve"> </w:t>
-            </w:r>
-            <w:r>
-              <w:rPr>
-                <w:rFonts w:ascii="Calibri" w:hAnsi="Calibri" w:cs="Arial"/>
-                <w:i/>
-                <w:color w:val="548DD4"/>
-                <w:sz w:val="20"/>
-                <w:szCs w:val="20"/>
-                <w:lang w:eastAsia="es-CL"/>
-              </w:rPr>
-              <w:t xml:space="preserve">permite(n) </w:t>
-            </w:r>
-            <w:r>
-              <w:rPr>
-                <w:rFonts w:ascii="Calibri" w:hAnsi="Calibri" w:cs="Arial"/>
-                <w:i/>
-                <w:color w:val="548DD4"/>
-                <w:sz w:val="20"/>
-                <w:szCs w:val="20"/>
-                <w:lang w:eastAsia="es-CL"/>
-              </w:rPr>
-              <w:t>da</w:t>
-            </w:r>
-            <w:r>
-              <w:rPr>
-                <w:rFonts w:ascii="Calibri" w:hAnsi="Calibri" w:cs="Arial"/>
-                <w:i/>
-                <w:color w:val="548DD4"/>
-                <w:sz w:val="20"/>
-                <w:szCs w:val="20"/>
-                <w:lang w:eastAsia="es-CL"/>
-              </w:rPr>
-              <w:t>r</w:t>
-            </w:r>
-            <w:r>
-              <w:rPr>
-                <w:rFonts w:ascii="Calibri" w:hAnsi="Calibri" w:cs="Arial"/>
-                <w:i/>
-                <w:color w:val="548DD4"/>
-                <w:sz w:val="20"/>
-                <w:szCs w:val="20"/>
-                <w:lang w:eastAsia="es-CL"/>
-              </w:rPr>
-              <w:t xml:space="preserve"> cuenta del </w:t>
-            </w:r>
-            <w:r>
-              <w:rPr>
-                <w:rFonts w:ascii="Calibri" w:hAnsi="Calibri" w:cs="Arial"/>
-                <w:i/>
-                <w:color w:val="548DD4"/>
-                <w:sz w:val="20"/>
-                <w:szCs w:val="20"/>
-                <w:lang w:eastAsia="es-CL"/>
-              </w:rPr>
-              <w:t>desarrollo</w:t>
-            </w:r>
-            <w:r>
-              <w:rPr>
-                <w:rFonts w:ascii="Calibri" w:hAnsi="Calibri" w:cs="Arial"/>
-                <w:i/>
-                <w:color w:val="548DD4"/>
-                <w:sz w:val="20"/>
-                <w:szCs w:val="20"/>
-                <w:lang w:eastAsia="es-CL"/>
-              </w:rPr>
-              <w:t xml:space="preserve"> </w:t>
-            </w:r>
-            <w:r>
-              <w:rPr>
-                <w:rFonts w:ascii="Calibri" w:hAnsi="Calibri" w:cs="Arial"/>
-                <w:i/>
-                <w:color w:val="548DD4"/>
-                <w:sz w:val="20"/>
-                <w:szCs w:val="20"/>
+                <w:highlight w:val="yellow"/>
+                <w:lang w:eastAsia="es-CL"/>
+              </w:rPr>
+              <w:t xml:space="preserve">esta(s) evidencia(s) permite(n) dar cuenta del </w:t>
+            </w:r>
+            <w:r>
+              <w:rPr>
+                <w:rFonts w:ascii="Calibri" w:hAnsi="Calibri" w:cs="Arial"/>
+                <w:i/>
+                <w:color w:val="548DD4"/>
+                <w:sz w:val="20"/>
+                <w:szCs w:val="20"/>
+                <w:highlight w:val="yellow"/>
+                <w:lang w:eastAsia="es-CL"/>
+              </w:rPr>
+              <w:t xml:space="preserve">desarrollo </w:t>
+            </w:r>
+            <w:r>
+              <w:rPr>
+                <w:rFonts w:ascii="Calibri" w:hAnsi="Calibri" w:cs="Arial"/>
+                <w:i/>
+                <w:color w:val="548DD4"/>
+                <w:sz w:val="20"/>
+                <w:szCs w:val="20"/>
+                <w:highlight w:val="yellow"/>
                 <w:lang w:eastAsia="es-CL"/>
               </w:rPr>
               <w:t>del proyecto.</w:t>
@@ -1247,52 +1595,43 @@
                 <w:color w:val="548DD4"/>
                 <w:sz w:val="20"/>
                 <w:szCs w:val="20"/>
-                <w:lang w:eastAsia="es-CL"/>
-              </w:rPr>
-            </w:pPr>
-            <w:r>
-              <w:rPr>
-                <w:rFonts w:ascii="Calibri" w:hAnsi="Calibri" w:cs="Arial"/>
-                <w:i/>
-                <w:color w:val="548DD4"/>
-                <w:sz w:val="20"/>
-                <w:szCs w:val="20"/>
-                <w:lang w:eastAsia="es-CL"/>
-              </w:rPr>
-              <w:t xml:space="preserve">En caso de ser pertinente </w:t>
-            </w:r>
-            <w:r>
-              <w:rPr>
-                <w:rFonts w:ascii="Calibri" w:hAnsi="Calibri" w:cs="Arial"/>
-                <w:i/>
-                <w:color w:val="548DD4"/>
-                <w:sz w:val="20"/>
-                <w:szCs w:val="20"/>
-                <w:lang w:eastAsia="es-CL"/>
-              </w:rPr>
-              <w:t>explica cómo resguardaste la calidad de tu Proyecto APT a partir de aspectos propios de tu disciplina (correcta aplicación de metodologías, actividades, herramientas, recursos propios, etc.).</w:t>
-            </w:r>
-          </w:p>
-          <w:p>
-            <w:pPr>
-              <w:jc w:val="both"/>
-              <w:rPr>
-                <w:rFonts w:ascii="Calibri" w:hAnsi="Calibri" w:cs="Arial"/>
-                <w:b/>
-                <w:i/>
-                <w:color w:val="548DD4"/>
-                <w:sz w:val="20"/>
-                <w:szCs w:val="20"/>
-                <w:lang w:eastAsia="es-CL"/>
-              </w:rPr>
-            </w:pPr>
-            <w:r>
-              <w:rPr>
-                <w:rFonts w:ascii="Calibri" w:hAnsi="Calibri" w:cs="Arial"/>
-                <w:i/>
-                <w:color w:val="548DD4"/>
-                <w:sz w:val="20"/>
-                <w:szCs w:val="20"/>
+                <w:highlight w:val="yellow"/>
+                <w:lang w:eastAsia="es-CL"/>
+              </w:rPr>
+            </w:pPr>
+            <w:r>
+              <w:rPr>
+                <w:rFonts w:ascii="Calibri" w:hAnsi="Calibri" w:cs="Arial"/>
+                <w:i/>
+                <w:color w:val="548DD4"/>
+                <w:sz w:val="20"/>
+                <w:szCs w:val="20"/>
+                <w:highlight w:val="yellow"/>
+                <w:lang w:eastAsia="es-CL"/>
+              </w:rPr>
+              <w:t>En caso de ser pertinente explica cómo resguardaste la calidad de tu Proyecto APT a partir de aspectos propios de tu disciplina (correcta aplicación de metodologías, actividades, herramientas, recursos propios, etc.).</w:t>
+            </w:r>
+          </w:p>
+          <w:p>
+            <w:pPr>
+              <w:jc w:val="both"/>
+              <w:rPr>
+                <w:rFonts w:ascii="Calibri" w:hAnsi="Calibri" w:cs="Arial"/>
+                <w:i/>
+                <w:color w:val="548DD4"/>
+                <w:sz w:val="20"/>
+                <w:szCs w:val="20"/>
+                <w:lang w:eastAsia="es-CL"/>
+              </w:rPr>
+            </w:pPr>
+            <w:r>
+              <w:rPr>
+                <w:rFonts w:ascii="Calibri" w:hAnsi="Calibri" w:cs="Arial"/>
+                <w:i/>
+                <w:color w:val="548DD4"/>
+                <w:sz w:val="20"/>
+                <w:szCs w:val="20"/>
+                <w:highlight w:val="yellow"/>
                 <w:lang w:eastAsia="es-CL"/>
               </w:rPr>
               <w:t>En este apartado adjuntar la(s) evidencia(s) seleccionada(s) para ser evaluada por el docente.</w:t>
@@ -1344,7 +1683,6 @@
                 <w:sz w:val="28"/>
                 <w:szCs w:val="28"/>
               </w:rPr>
-              <w:lastRenderedPageBreak/>
               <w:t>2</w:t>
             </w:r>
             <w:r>
@@ -1474,6 +1812,7 @@
                 <w:color w:val="1F3864" w:themeColor="accent1" w:themeShade="80"/>
                 <w:sz w:val="18"/>
               </w:rPr>
+              <w:lastRenderedPageBreak/>
               <w:t>Plan de Trabajo</w:t>
             </w:r>
           </w:p>
@@ -1711,7 +2050,7 @@
       </w:tr>
       <w:tr>
         <w:trPr>
-          <w:trHeight w:val="2410"/>
+          <w:trHeight w:val="1377"/>
         </w:trPr>
         <w:tc>
           <w:tcPr>
@@ -2302,6 +2641,2188 @@
                 <w:lang w:eastAsia="es-CL"/>
               </w:rPr>
               <w:t xml:space="preserve">do. </w:t>
+            </w:r>
+          </w:p>
+        </w:tc>
+      </w:tr>
+      <w:tr>
+        <w:trPr>
+          <w:trHeight w:val="1377"/>
+        </w:trPr>
+        <w:tc>
+          <w:tcPr>
+            <w:tcW w:w="1328" w:type="dxa"/>
+          </w:tcPr>
+          <w:p>
+            <w:pPr>
+              <w:jc w:val="both"/>
+              <w:rPr>
+                <w:rFonts w:ascii="Calibri" w:hAnsi="Calibri" w:cs="Arial"/>
+                <w:i/>
+                <w:color w:val="548DD4"/>
+                <w:sz w:val="18"/>
+                <w:szCs w:val="20"/>
+                <w:lang w:eastAsia="es-CL"/>
+              </w:rPr>
+            </w:pPr>
+            <w:r>
+              <w:rPr>
+                <w:rFonts w:ascii="Calibri" w:hAnsi="Calibri" w:cs="Arial"/>
+                <w:i/>
+                <w:color w:val="548DD4"/>
+                <w:sz w:val="18"/>
+                <w:szCs w:val="20"/>
+                <w:lang w:eastAsia="es-CL"/>
+              </w:rPr>
+              <w:t>Ofrecer propuestas de solución informática</w:t>
+            </w:r>
+          </w:p>
+        </w:tc>
+        <w:tc>
+          <w:tcPr>
+            <w:tcW w:w="1077" w:type="dxa"/>
+          </w:tcPr>
+          <w:p>
+            <w:pPr>
+              <w:jc w:val="both"/>
+              <w:rPr>
+                <w:rFonts w:ascii="Calibri" w:hAnsi="Calibri" w:cs="Arial"/>
+                <w:i/>
+                <w:color w:val="548DD4"/>
+                <w:sz w:val="18"/>
+                <w:szCs w:val="20"/>
+                <w:lang w:eastAsia="es-CL"/>
+              </w:rPr>
+            </w:pPr>
+            <w:r>
+              <w:rPr>
+                <w:rFonts w:ascii="Calibri" w:hAnsi="Calibri" w:cs="Arial"/>
+                <w:i/>
+                <w:color w:val="548DD4"/>
+                <w:sz w:val="18"/>
+                <w:szCs w:val="20"/>
+                <w:lang w:eastAsia="es-CL"/>
+              </w:rPr>
+              <w:t>Definición del proyecto</w:t>
+            </w:r>
+          </w:p>
+        </w:tc>
+        <w:tc>
+          <w:tcPr>
+            <w:tcW w:w="1276" w:type="dxa"/>
+          </w:tcPr>
+          <w:p>
+            <w:pPr>
+              <w:jc w:val="both"/>
+              <w:rPr>
+                <w:rFonts w:ascii="Calibri" w:hAnsi="Calibri" w:cs="Arial"/>
+                <w:i/>
+                <w:color w:val="548DD4"/>
+                <w:sz w:val="18"/>
+                <w:szCs w:val="20"/>
+                <w:lang w:val="en-US" w:eastAsia="es-CL"/>
+              </w:rPr>
+            </w:pPr>
+            <w:r>
+              <w:rPr>
+                <w:rFonts w:ascii="Calibri" w:hAnsi="Calibri" w:cs="Arial"/>
+                <w:i/>
+                <w:color w:val="548DD4"/>
+                <w:sz w:val="18"/>
+                <w:szCs w:val="20"/>
+                <w:lang w:val="en-US" w:eastAsia="es-CL"/>
+              </w:rPr>
+              <w:t>Google Docs / Google Meet / Discord / PC</w:t>
+            </w:r>
+          </w:p>
+        </w:tc>
+        <w:tc>
+          <w:tcPr>
+            <w:tcW w:w="1276" w:type="dxa"/>
+          </w:tcPr>
+          <w:p>
+            <w:pPr>
+              <w:jc w:val="both"/>
+              <w:rPr>
+                <w:rFonts w:ascii="Calibri" w:hAnsi="Calibri" w:cs="Arial"/>
+                <w:i/>
+                <w:color w:val="548DD4"/>
+                <w:sz w:val="18"/>
+                <w:szCs w:val="20"/>
+                <w:lang w:val="en-US" w:eastAsia="es-CL"/>
+              </w:rPr>
+            </w:pPr>
+            <w:r>
+              <w:rPr>
+                <w:rFonts w:ascii="Calibri" w:hAnsi="Calibri" w:cs="Arial"/>
+                <w:i/>
+                <w:color w:val="548DD4"/>
+                <w:sz w:val="18"/>
+                <w:szCs w:val="20"/>
+                <w:lang w:val="en-US" w:eastAsia="es-CL"/>
+              </w:rPr>
+              <w:t>5 días</w:t>
+            </w:r>
+          </w:p>
+        </w:tc>
+        <w:tc>
+          <w:tcPr>
+            <w:tcW w:w="1275" w:type="dxa"/>
+          </w:tcPr>
+          <w:p>
+            <w:pPr>
+              <w:jc w:val="both"/>
+              <w:rPr>
+                <w:rFonts w:ascii="Calibri" w:hAnsi="Calibri" w:cs="Arial"/>
+                <w:i/>
+                <w:color w:val="548DD4"/>
+                <w:sz w:val="18"/>
+                <w:szCs w:val="20"/>
+                <w:lang w:val="en-US" w:eastAsia="es-CL"/>
+              </w:rPr>
+            </w:pPr>
+            <w:r>
+              <w:rPr>
+                <w:rFonts w:ascii="Calibri" w:hAnsi="Calibri" w:cs="Arial"/>
+                <w:i/>
+                <w:color w:val="548DD4"/>
+                <w:sz w:val="18"/>
+                <w:szCs w:val="20"/>
+                <w:lang w:val="en-US" w:eastAsia="es-CL"/>
+              </w:rPr>
+              <w:t>Cristian Ferreira</w:t>
+            </w:r>
+          </w:p>
+        </w:tc>
+        <w:tc>
+          <w:tcPr>
+            <w:tcW w:w="1276" w:type="dxa"/>
+          </w:tcPr>
+          <w:p>
+            <w:pPr>
+              <w:jc w:val="both"/>
+              <w:rPr>
+                <w:rFonts w:ascii="Calibri" w:hAnsi="Calibri" w:cs="Arial"/>
+                <w:i/>
+                <w:color w:val="548DD4"/>
+                <w:sz w:val="18"/>
+                <w:szCs w:val="20"/>
+                <w:lang w:eastAsia="es-CL"/>
+              </w:rPr>
+            </w:pPr>
+            <w:r>
+              <w:rPr>
+                <w:rFonts w:ascii="Calibri" w:hAnsi="Calibri" w:cs="Arial"/>
+                <w:i/>
+                <w:color w:val="548DD4"/>
+                <w:sz w:val="18"/>
+                <w:szCs w:val="20"/>
+                <w:lang w:eastAsia="es-CL"/>
+              </w:rPr>
+              <w:t>Asegura comprensión del propósito y responsabilidades</w:t>
+            </w:r>
+          </w:p>
+        </w:tc>
+        <w:tc>
+          <w:tcPr>
+            <w:tcW w:w="1418" w:type="dxa"/>
+          </w:tcPr>
+          <w:p>
+            <w:pPr>
+              <w:jc w:val="both"/>
+              <w:rPr>
+                <w:rFonts w:ascii="Calibri" w:hAnsi="Calibri" w:cs="Arial"/>
+                <w:i/>
+                <w:color w:val="548DD4"/>
+                <w:sz w:val="18"/>
+                <w:szCs w:val="20"/>
+                <w:lang w:eastAsia="es-CL"/>
+              </w:rPr>
+            </w:pPr>
+            <w:r>
+              <w:rPr>
+                <w:rFonts w:ascii="Calibri" w:hAnsi="Calibri" w:cs="Arial"/>
+                <w:i/>
+                <w:color w:val="548DD4"/>
+                <w:sz w:val="18"/>
+                <w:szCs w:val="20"/>
+                <w:lang w:eastAsia="es-CL"/>
+              </w:rPr>
+              <w:t>Completado</w:t>
+            </w:r>
+          </w:p>
+        </w:tc>
+        <w:tc>
+          <w:tcPr>
+            <w:tcW w:w="850" w:type="dxa"/>
+          </w:tcPr>
+          <w:p>
+            <w:pPr>
+              <w:jc w:val="both"/>
+              <w:rPr>
+                <w:rFonts w:ascii="Calibri" w:hAnsi="Calibri" w:cs="Arial"/>
+                <w:i/>
+                <w:color w:val="548DD4"/>
+                <w:sz w:val="18"/>
+                <w:szCs w:val="20"/>
+                <w:lang w:eastAsia="es-CL"/>
+              </w:rPr>
+            </w:pPr>
+            <w:r>
+              <w:rPr>
+                <w:rFonts w:ascii="Calibri" w:hAnsi="Calibri" w:cs="Arial"/>
+                <w:i/>
+                <w:color w:val="548DD4"/>
+                <w:sz w:val="18"/>
+                <w:szCs w:val="20"/>
+                <w:lang w:eastAsia="es-CL"/>
+              </w:rPr>
+              <w:t>Ninguno</w:t>
+            </w:r>
+          </w:p>
+        </w:tc>
+      </w:tr>
+      <w:tr>
+        <w:trPr>
+          <w:trHeight w:val="1377"/>
+        </w:trPr>
+        <w:tc>
+          <w:tcPr>
+            <w:tcW w:w="1328" w:type="dxa"/>
+          </w:tcPr>
+          <w:p>
+            <w:pPr>
+              <w:jc w:val="both"/>
+              <w:rPr>
+                <w:rFonts w:ascii="Calibri" w:hAnsi="Calibri" w:cs="Arial"/>
+                <w:i/>
+                <w:color w:val="548DD4"/>
+                <w:sz w:val="18"/>
+                <w:szCs w:val="20"/>
+                <w:lang w:eastAsia="es-CL"/>
+              </w:rPr>
+            </w:pPr>
+            <w:r>
+              <w:rPr>
+                <w:rFonts w:ascii="Calibri" w:hAnsi="Calibri" w:cs="Arial"/>
+                <w:i/>
+                <w:color w:val="548DD4"/>
+                <w:sz w:val="18"/>
+                <w:szCs w:val="20"/>
+                <w:lang w:eastAsia="es-CL"/>
+              </w:rPr>
+              <w:t>Gestionar proyectos informáticos</w:t>
+            </w:r>
+          </w:p>
+        </w:tc>
+        <w:tc>
+          <w:tcPr>
+            <w:tcW w:w="1077" w:type="dxa"/>
+          </w:tcPr>
+          <w:p>
+            <w:pPr>
+              <w:jc w:val="both"/>
+              <w:rPr>
+                <w:rFonts w:ascii="Calibri" w:hAnsi="Calibri" w:cs="Arial"/>
+                <w:i/>
+                <w:color w:val="548DD4"/>
+                <w:sz w:val="18"/>
+                <w:szCs w:val="20"/>
+                <w:lang w:eastAsia="es-CL"/>
+              </w:rPr>
+            </w:pPr>
+            <w:r>
+              <w:rPr>
+                <w:rFonts w:ascii="Calibri" w:hAnsi="Calibri" w:cs="Arial"/>
+                <w:i/>
+                <w:color w:val="548DD4"/>
+                <w:sz w:val="18"/>
+                <w:szCs w:val="20"/>
+                <w:lang w:eastAsia="es-CL"/>
+              </w:rPr>
+              <w:t>Planificación inicial</w:t>
+            </w:r>
+          </w:p>
+        </w:tc>
+        <w:tc>
+          <w:tcPr>
+            <w:tcW w:w="1276" w:type="dxa"/>
+          </w:tcPr>
+          <w:p>
+            <w:pPr>
+              <w:jc w:val="both"/>
+              <w:rPr>
+                <w:rFonts w:ascii="Calibri" w:hAnsi="Calibri" w:cs="Arial"/>
+                <w:i/>
+                <w:color w:val="548DD4"/>
+                <w:sz w:val="18"/>
+                <w:szCs w:val="20"/>
+                <w:lang w:eastAsia="es-CL"/>
+              </w:rPr>
+            </w:pPr>
+            <w:r>
+              <w:rPr>
+                <w:rFonts w:ascii="Calibri" w:hAnsi="Calibri" w:cs="Arial"/>
+                <w:i/>
+                <w:color w:val="548DD4"/>
+                <w:sz w:val="18"/>
+                <w:szCs w:val="20"/>
+                <w:lang w:eastAsia="es-CL"/>
+              </w:rPr>
+              <w:t xml:space="preserve">Jira / Google </w:t>
+            </w:r>
+            <w:r>
+              <w:rPr>
+                <w:rFonts w:ascii="Calibri" w:hAnsi="Calibri" w:cs="Arial"/>
+                <w:i/>
+                <w:color w:val="548DD4"/>
+                <w:sz w:val="18"/>
+                <w:szCs w:val="20"/>
+                <w:lang w:eastAsia="es-CL"/>
+              </w:rPr>
+              <w:t>Docs.</w:t>
+            </w:r>
+            <w:r>
+              <w:rPr>
+                <w:rFonts w:ascii="Calibri" w:hAnsi="Calibri" w:cs="Arial"/>
+                <w:i/>
+                <w:color w:val="548DD4"/>
+                <w:sz w:val="18"/>
+                <w:szCs w:val="20"/>
+                <w:lang w:eastAsia="es-CL"/>
+              </w:rPr>
+              <w:t xml:space="preserve"> / Excel / PC</w:t>
+            </w:r>
+          </w:p>
+        </w:tc>
+        <w:tc>
+          <w:tcPr>
+            <w:tcW w:w="1276" w:type="dxa"/>
+          </w:tcPr>
+          <w:p>
+            <w:pPr>
+              <w:jc w:val="both"/>
+              <w:rPr>
+                <w:rFonts w:ascii="Calibri" w:hAnsi="Calibri" w:cs="Arial"/>
+                <w:i/>
+                <w:color w:val="548DD4"/>
+                <w:sz w:val="18"/>
+                <w:szCs w:val="20"/>
+                <w:lang w:eastAsia="es-CL"/>
+              </w:rPr>
+            </w:pPr>
+            <w:r>
+              <w:rPr>
+                <w:rFonts w:ascii="Calibri" w:hAnsi="Calibri" w:cs="Arial"/>
+                <w:i/>
+                <w:color w:val="548DD4"/>
+                <w:sz w:val="18"/>
+                <w:szCs w:val="20"/>
+                <w:lang w:val="en-US" w:eastAsia="es-CL"/>
+              </w:rPr>
+              <w:t>5 días</w:t>
+            </w:r>
+          </w:p>
+        </w:tc>
+        <w:tc>
+          <w:tcPr>
+            <w:tcW w:w="1275" w:type="dxa"/>
+          </w:tcPr>
+          <w:p>
+            <w:pPr>
+              <w:jc w:val="both"/>
+              <w:rPr>
+                <w:rFonts w:ascii="Calibri" w:hAnsi="Calibri" w:cs="Arial"/>
+                <w:i/>
+                <w:color w:val="548DD4"/>
+                <w:sz w:val="18"/>
+                <w:szCs w:val="20"/>
+                <w:lang w:eastAsia="es-CL"/>
+              </w:rPr>
+            </w:pPr>
+            <w:r>
+              <w:rPr>
+                <w:rFonts w:ascii="Calibri" w:hAnsi="Calibri" w:cs="Arial"/>
+                <w:i/>
+                <w:color w:val="548DD4"/>
+                <w:sz w:val="18"/>
+                <w:szCs w:val="20"/>
+                <w:lang w:eastAsia="es-CL"/>
+              </w:rPr>
+              <w:t>Brayan Moreno</w:t>
+            </w:r>
+          </w:p>
+        </w:tc>
+        <w:tc>
+          <w:tcPr>
+            <w:tcW w:w="1276" w:type="dxa"/>
+          </w:tcPr>
+          <w:p>
+            <w:pPr>
+              <w:jc w:val="both"/>
+              <w:rPr>
+                <w:rFonts w:ascii="Calibri" w:hAnsi="Calibri" w:cs="Arial"/>
+                <w:i/>
+                <w:color w:val="548DD4"/>
+                <w:sz w:val="18"/>
+                <w:szCs w:val="20"/>
+                <w:lang w:eastAsia="es-CL"/>
+              </w:rPr>
+            </w:pPr>
+            <w:r>
+              <w:rPr>
+                <w:rFonts w:ascii="Calibri" w:hAnsi="Calibri" w:cs="Arial"/>
+                <w:i/>
+                <w:color w:val="548DD4"/>
+                <w:sz w:val="18"/>
+                <w:szCs w:val="20"/>
+                <w:lang w:eastAsia="es-CL"/>
+              </w:rPr>
+              <w:t>Organizar el trabajo de forma ágil</w:t>
+            </w:r>
+          </w:p>
+        </w:tc>
+        <w:tc>
+          <w:tcPr>
+            <w:tcW w:w="1418" w:type="dxa"/>
+          </w:tcPr>
+          <w:p>
+            <w:pPr>
+              <w:jc w:val="both"/>
+              <w:rPr>
+                <w:rFonts w:ascii="Calibri" w:hAnsi="Calibri" w:cs="Arial"/>
+                <w:i/>
+                <w:color w:val="548DD4"/>
+                <w:sz w:val="18"/>
+                <w:szCs w:val="20"/>
+                <w:lang w:eastAsia="es-CL"/>
+              </w:rPr>
+            </w:pPr>
+            <w:r>
+              <w:rPr>
+                <w:rFonts w:ascii="Calibri" w:hAnsi="Calibri" w:cs="Arial"/>
+                <w:i/>
+                <w:color w:val="548DD4"/>
+                <w:sz w:val="18"/>
+                <w:szCs w:val="20"/>
+                <w:lang w:eastAsia="es-CL"/>
+              </w:rPr>
+              <w:t>Completado</w:t>
+            </w:r>
+          </w:p>
+        </w:tc>
+        <w:tc>
+          <w:tcPr>
+            <w:tcW w:w="850" w:type="dxa"/>
+          </w:tcPr>
+          <w:p>
+            <w:pPr>
+              <w:jc w:val="both"/>
+              <w:rPr>
+                <w:rFonts w:ascii="Calibri" w:hAnsi="Calibri" w:cs="Arial"/>
+                <w:i/>
+                <w:color w:val="548DD4"/>
+                <w:sz w:val="18"/>
+                <w:szCs w:val="20"/>
+                <w:lang w:eastAsia="es-CL"/>
+              </w:rPr>
+            </w:pPr>
+            <w:r>
+              <w:rPr>
+                <w:rFonts w:ascii="Calibri" w:hAnsi="Calibri" w:cs="Arial"/>
+                <w:i/>
+                <w:color w:val="548DD4"/>
+                <w:sz w:val="18"/>
+                <w:szCs w:val="20"/>
+                <w:lang w:eastAsia="es-CL"/>
+              </w:rPr>
+              <w:t>Ninguno</w:t>
+            </w:r>
+          </w:p>
+        </w:tc>
+      </w:tr>
+      <w:tr>
+        <w:trPr>
+          <w:trHeight w:val="1377"/>
+        </w:trPr>
+        <w:tc>
+          <w:tcPr>
+            <w:tcW w:w="1328" w:type="dxa"/>
+          </w:tcPr>
+          <w:p>
+            <w:pPr>
+              <w:jc w:val="both"/>
+              <w:rPr>
+                <w:rFonts w:ascii="Calibri" w:hAnsi="Calibri" w:cs="Arial"/>
+                <w:i/>
+                <w:color w:val="548DD4"/>
+                <w:sz w:val="18"/>
+                <w:szCs w:val="20"/>
+                <w:lang w:eastAsia="es-CL"/>
+              </w:rPr>
+            </w:pPr>
+            <w:r>
+              <w:rPr>
+                <w:rFonts w:ascii="Calibri" w:hAnsi="Calibri" w:cs="Arial"/>
+                <w:i/>
+                <w:color w:val="548DD4"/>
+                <w:sz w:val="18"/>
+                <w:szCs w:val="20"/>
+                <w:lang w:eastAsia="es-CL"/>
+              </w:rPr>
+              <w:t>Construir modelo arquitectónico</w:t>
+            </w:r>
+          </w:p>
+        </w:tc>
+        <w:tc>
+          <w:tcPr>
+            <w:tcW w:w="1077" w:type="dxa"/>
+          </w:tcPr>
+          <w:p>
+            <w:pPr>
+              <w:jc w:val="both"/>
+              <w:rPr>
+                <w:rFonts w:ascii="Calibri" w:hAnsi="Calibri" w:cs="Arial"/>
+                <w:i/>
+                <w:color w:val="548DD4"/>
+                <w:sz w:val="18"/>
+                <w:szCs w:val="20"/>
+                <w:lang w:eastAsia="es-CL"/>
+              </w:rPr>
+            </w:pPr>
+            <w:r>
+              <w:rPr>
+                <w:rFonts w:ascii="Calibri" w:hAnsi="Calibri" w:cs="Arial"/>
+                <w:i/>
+                <w:color w:val="548DD4"/>
+                <w:sz w:val="18"/>
+                <w:szCs w:val="20"/>
+                <w:lang w:eastAsia="es-CL"/>
+              </w:rPr>
+              <w:t>Diseño técnico (mockups y BD)</w:t>
+            </w:r>
+          </w:p>
+        </w:tc>
+        <w:tc>
+          <w:tcPr>
+            <w:tcW w:w="1276" w:type="dxa"/>
+          </w:tcPr>
+          <w:p>
+            <w:pPr>
+              <w:jc w:val="both"/>
+              <w:rPr>
+                <w:rFonts w:ascii="Calibri" w:hAnsi="Calibri" w:cs="Arial"/>
+                <w:i/>
+                <w:color w:val="548DD4"/>
+                <w:sz w:val="18"/>
+                <w:szCs w:val="20"/>
+                <w:lang w:val="en-US" w:eastAsia="es-CL"/>
+              </w:rPr>
+            </w:pPr>
+            <w:r>
+              <w:rPr>
+                <w:rFonts w:ascii="Calibri" w:hAnsi="Calibri" w:cs="Arial"/>
+                <w:i/>
+                <w:color w:val="548DD4"/>
+                <w:sz w:val="18"/>
+                <w:szCs w:val="20"/>
+                <w:lang w:val="en-US" w:eastAsia="es-CL"/>
+              </w:rPr>
+              <w:t>Figma / Draw.io / MySQL Workbench / PC</w:t>
+            </w:r>
+          </w:p>
+        </w:tc>
+        <w:tc>
+          <w:tcPr>
+            <w:tcW w:w="1276" w:type="dxa"/>
+          </w:tcPr>
+          <w:p>
+            <w:pPr>
+              <w:jc w:val="both"/>
+              <w:rPr>
+                <w:rFonts w:ascii="Calibri" w:hAnsi="Calibri" w:cs="Arial"/>
+                <w:i/>
+                <w:color w:val="548DD4"/>
+                <w:sz w:val="18"/>
+                <w:szCs w:val="20"/>
+                <w:lang w:val="en-US" w:eastAsia="es-CL"/>
+              </w:rPr>
+            </w:pPr>
+            <w:r>
+              <w:rPr>
+                <w:rFonts w:ascii="Calibri" w:hAnsi="Calibri" w:cs="Arial"/>
+                <w:i/>
+                <w:color w:val="548DD4"/>
+                <w:sz w:val="18"/>
+                <w:szCs w:val="20"/>
+                <w:lang w:val="en-US" w:eastAsia="es-CL"/>
+              </w:rPr>
+              <w:t>6 días</w:t>
+            </w:r>
+          </w:p>
+        </w:tc>
+        <w:tc>
+          <w:tcPr>
+            <w:tcW w:w="1275" w:type="dxa"/>
+          </w:tcPr>
+          <w:p>
+            <w:pPr>
+              <w:jc w:val="both"/>
+              <w:rPr>
+                <w:rFonts w:ascii="Calibri" w:hAnsi="Calibri" w:cs="Arial"/>
+                <w:i/>
+                <w:color w:val="548DD4"/>
+                <w:sz w:val="18"/>
+                <w:szCs w:val="20"/>
+                <w:lang w:val="en-US" w:eastAsia="es-CL"/>
+              </w:rPr>
+            </w:pPr>
+            <w:r>
+              <w:rPr>
+                <w:rFonts w:ascii="Calibri" w:hAnsi="Calibri" w:cs="Arial"/>
+                <w:i/>
+                <w:color w:val="548DD4"/>
+                <w:sz w:val="18"/>
+                <w:szCs w:val="20"/>
+                <w:lang w:val="en-US" w:eastAsia="es-CL"/>
+              </w:rPr>
+              <w:t>Cristian Ferreira</w:t>
+            </w:r>
+          </w:p>
+        </w:tc>
+        <w:tc>
+          <w:tcPr>
+            <w:tcW w:w="1276" w:type="dxa"/>
+          </w:tcPr>
+          <w:p>
+            <w:pPr>
+              <w:jc w:val="both"/>
+              <w:rPr>
+                <w:rFonts w:ascii="Calibri" w:hAnsi="Calibri" w:cs="Arial"/>
+                <w:i/>
+                <w:color w:val="548DD4"/>
+                <w:sz w:val="18"/>
+                <w:szCs w:val="20"/>
+                <w:lang w:eastAsia="es-CL"/>
+              </w:rPr>
+            </w:pPr>
+            <w:r>
+              <w:rPr>
+                <w:rFonts w:ascii="Calibri" w:hAnsi="Calibri" w:cs="Arial"/>
+                <w:i/>
+                <w:color w:val="548DD4"/>
+                <w:sz w:val="18"/>
+                <w:szCs w:val="20"/>
+                <w:lang w:eastAsia="es-CL"/>
+              </w:rPr>
+              <w:t>Definir cómo se verá y funcionará el sistema</w:t>
+            </w:r>
+          </w:p>
+        </w:tc>
+        <w:tc>
+          <w:tcPr>
+            <w:tcW w:w="1418" w:type="dxa"/>
+          </w:tcPr>
+          <w:p>
+            <w:pPr>
+              <w:jc w:val="both"/>
+              <w:rPr>
+                <w:rFonts w:ascii="Calibri" w:hAnsi="Calibri" w:cs="Arial"/>
+                <w:i/>
+                <w:color w:val="548DD4"/>
+                <w:sz w:val="18"/>
+                <w:szCs w:val="20"/>
+                <w:lang w:eastAsia="es-CL"/>
+              </w:rPr>
+            </w:pPr>
+            <w:r>
+              <w:rPr>
+                <w:rFonts w:ascii="Calibri" w:hAnsi="Calibri" w:cs="Arial"/>
+                <w:i/>
+                <w:color w:val="548DD4"/>
+                <w:sz w:val="18"/>
+                <w:szCs w:val="20"/>
+                <w:lang w:eastAsia="es-CL"/>
+              </w:rPr>
+              <w:t>Completado</w:t>
+            </w:r>
+          </w:p>
+        </w:tc>
+        <w:tc>
+          <w:tcPr>
+            <w:tcW w:w="850" w:type="dxa"/>
+          </w:tcPr>
+          <w:p>
+            <w:pPr>
+              <w:jc w:val="both"/>
+              <w:rPr>
+                <w:rFonts w:ascii="Calibri" w:hAnsi="Calibri" w:cs="Arial"/>
+                <w:i/>
+                <w:color w:val="548DD4"/>
+                <w:sz w:val="18"/>
+                <w:szCs w:val="20"/>
+                <w:lang w:eastAsia="es-CL"/>
+              </w:rPr>
+            </w:pPr>
+            <w:r>
+              <w:rPr>
+                <w:rFonts w:ascii="Calibri" w:hAnsi="Calibri" w:cs="Arial"/>
+                <w:i/>
+                <w:color w:val="548DD4"/>
+                <w:sz w:val="18"/>
+                <w:szCs w:val="20"/>
+                <w:lang w:eastAsia="es-CL"/>
+              </w:rPr>
+              <w:t>Ninguno</w:t>
+            </w:r>
+          </w:p>
+        </w:tc>
+      </w:tr>
+      <w:tr>
+        <w:trPr>
+          <w:trHeight w:val="1377"/>
+        </w:trPr>
+        <w:tc>
+          <w:tcPr>
+            <w:tcW w:w="1328" w:type="dxa"/>
+          </w:tcPr>
+          <w:p>
+            <w:pPr>
+              <w:jc w:val="both"/>
+              <w:rPr>
+                <w:rFonts w:ascii="Calibri" w:hAnsi="Calibri" w:cs="Arial"/>
+                <w:i/>
+                <w:color w:val="548DD4"/>
+                <w:sz w:val="18"/>
+                <w:szCs w:val="20"/>
+                <w:lang w:eastAsia="es-CL"/>
+              </w:rPr>
+            </w:pPr>
+            <w:r>
+              <w:rPr>
+                <w:rFonts w:ascii="Calibri" w:hAnsi="Calibri" w:cs="Arial"/>
+                <w:i/>
+                <w:color w:val="548DD4"/>
+                <w:sz w:val="18"/>
+                <w:szCs w:val="20"/>
+                <w:lang w:eastAsia="es-CL"/>
+              </w:rPr>
+              <w:t>Gestionar proyectos informáticos</w:t>
+            </w:r>
+          </w:p>
+        </w:tc>
+        <w:tc>
+          <w:tcPr>
+            <w:tcW w:w="1077" w:type="dxa"/>
+          </w:tcPr>
+          <w:p>
+            <w:pPr>
+              <w:jc w:val="both"/>
+              <w:rPr>
+                <w:rFonts w:ascii="Calibri" w:hAnsi="Calibri" w:cs="Arial"/>
+                <w:i/>
+                <w:color w:val="548DD4"/>
+                <w:sz w:val="18"/>
+                <w:szCs w:val="20"/>
+                <w:lang w:eastAsia="es-CL"/>
+              </w:rPr>
+            </w:pPr>
+            <w:r>
+              <w:rPr>
+                <w:rFonts w:ascii="Calibri" w:hAnsi="Calibri" w:cs="Arial"/>
+                <w:i/>
+                <w:color w:val="548DD4"/>
+                <w:sz w:val="18"/>
+                <w:szCs w:val="20"/>
+                <w:lang w:eastAsia="es-CL"/>
+              </w:rPr>
+              <w:t>Identificación de riesgos</w:t>
+            </w:r>
+          </w:p>
+        </w:tc>
+        <w:tc>
+          <w:tcPr>
+            <w:tcW w:w="1276" w:type="dxa"/>
+          </w:tcPr>
+          <w:p>
+            <w:pPr>
+              <w:jc w:val="both"/>
+              <w:rPr>
+                <w:rFonts w:ascii="Calibri" w:hAnsi="Calibri" w:cs="Arial"/>
+                <w:i/>
+                <w:color w:val="548DD4"/>
+                <w:sz w:val="18"/>
+                <w:szCs w:val="20"/>
+                <w:lang w:val="en-US" w:eastAsia="es-CL"/>
+              </w:rPr>
+            </w:pPr>
+            <w:r>
+              <w:rPr>
+                <w:rFonts w:ascii="Calibri" w:hAnsi="Calibri" w:cs="Arial"/>
+                <w:i/>
+                <w:color w:val="548DD4"/>
+                <w:sz w:val="18"/>
+                <w:szCs w:val="20"/>
+                <w:lang w:val="en-US" w:eastAsia="es-CL"/>
+              </w:rPr>
+              <w:t>Google Docs / Excel / Google Meet / Discord / PC</w:t>
+            </w:r>
+          </w:p>
+        </w:tc>
+        <w:tc>
+          <w:tcPr>
+            <w:tcW w:w="1276" w:type="dxa"/>
+          </w:tcPr>
+          <w:p>
+            <w:pPr>
+              <w:jc w:val="both"/>
+              <w:rPr>
+                <w:rFonts w:ascii="Calibri" w:hAnsi="Calibri" w:cs="Arial"/>
+                <w:i/>
+                <w:color w:val="548DD4"/>
+                <w:sz w:val="18"/>
+                <w:szCs w:val="20"/>
+                <w:lang w:val="en-US" w:eastAsia="es-CL"/>
+              </w:rPr>
+            </w:pPr>
+            <w:r>
+              <w:rPr>
+                <w:rFonts w:ascii="Calibri" w:hAnsi="Calibri" w:cs="Arial"/>
+                <w:i/>
+                <w:color w:val="548DD4"/>
+                <w:sz w:val="18"/>
+                <w:szCs w:val="20"/>
+                <w:lang w:val="en-US" w:eastAsia="es-CL"/>
+              </w:rPr>
+              <w:t>2 días</w:t>
+            </w:r>
+          </w:p>
+        </w:tc>
+        <w:tc>
+          <w:tcPr>
+            <w:tcW w:w="1275" w:type="dxa"/>
+          </w:tcPr>
+          <w:p>
+            <w:pPr>
+              <w:jc w:val="both"/>
+              <w:rPr>
+                <w:rFonts w:ascii="Calibri" w:hAnsi="Calibri" w:cs="Arial"/>
+                <w:i/>
+                <w:color w:val="548DD4"/>
+                <w:sz w:val="18"/>
+                <w:szCs w:val="20"/>
+                <w:lang w:val="en-US" w:eastAsia="es-CL"/>
+              </w:rPr>
+            </w:pPr>
+            <w:r>
+              <w:rPr>
+                <w:rFonts w:ascii="Calibri" w:hAnsi="Calibri" w:cs="Arial"/>
+                <w:i/>
+                <w:color w:val="548DD4"/>
+                <w:sz w:val="18"/>
+                <w:szCs w:val="20"/>
+                <w:lang w:val="en-US" w:eastAsia="es-CL"/>
+              </w:rPr>
+              <w:t>Brayan Moreno</w:t>
+            </w:r>
+          </w:p>
+        </w:tc>
+        <w:tc>
+          <w:tcPr>
+            <w:tcW w:w="1276" w:type="dxa"/>
+          </w:tcPr>
+          <w:p>
+            <w:pPr>
+              <w:jc w:val="both"/>
+              <w:rPr>
+                <w:rFonts w:ascii="Calibri" w:hAnsi="Calibri" w:cs="Arial"/>
+                <w:i/>
+                <w:color w:val="548DD4"/>
+                <w:sz w:val="18"/>
+                <w:szCs w:val="20"/>
+                <w:lang w:val="en-US" w:eastAsia="es-CL"/>
+              </w:rPr>
+            </w:pPr>
+            <w:proofErr w:type="spellStart"/>
+            <w:r>
+              <w:rPr>
+                <w:rFonts w:ascii="Calibri" w:hAnsi="Calibri" w:cs="Arial"/>
+                <w:i/>
+                <w:color w:val="548DD4"/>
+                <w:sz w:val="18"/>
+                <w:szCs w:val="20"/>
+                <w:lang w:val="en-US" w:eastAsia="es-CL"/>
+              </w:rPr>
+              <w:t>Preparar</w:t>
+            </w:r>
+            <w:proofErr w:type="spellEnd"/>
+            <w:r>
+              <w:rPr>
+                <w:rFonts w:ascii="Calibri" w:hAnsi="Calibri" w:cs="Arial"/>
+                <w:i/>
+                <w:color w:val="548DD4"/>
+                <w:sz w:val="18"/>
+                <w:szCs w:val="20"/>
+                <w:lang w:val="en-US" w:eastAsia="es-CL"/>
+              </w:rPr>
+              <w:t xml:space="preserve"> estrategias de mitigación</w:t>
+            </w:r>
+          </w:p>
+        </w:tc>
+        <w:tc>
+          <w:tcPr>
+            <w:tcW w:w="1418" w:type="dxa"/>
+          </w:tcPr>
+          <w:p>
+            <w:pPr>
+              <w:jc w:val="both"/>
+              <w:rPr>
+                <w:rFonts w:ascii="Calibri" w:hAnsi="Calibri" w:cs="Arial"/>
+                <w:i/>
+                <w:color w:val="548DD4"/>
+                <w:sz w:val="18"/>
+                <w:szCs w:val="20"/>
+                <w:lang w:val="en-US" w:eastAsia="es-CL"/>
+              </w:rPr>
+            </w:pPr>
+            <w:r>
+              <w:rPr>
+                <w:rFonts w:ascii="Calibri" w:hAnsi="Calibri" w:cs="Arial"/>
+                <w:i/>
+                <w:color w:val="548DD4"/>
+                <w:sz w:val="18"/>
+                <w:szCs w:val="20"/>
+                <w:lang w:val="en-US" w:eastAsia="es-CL"/>
+              </w:rPr>
+              <w:t>En curso</w:t>
+            </w:r>
+          </w:p>
+        </w:tc>
+        <w:tc>
+          <w:tcPr>
+            <w:tcW w:w="850" w:type="dxa"/>
+          </w:tcPr>
+          <w:p>
+            <w:pPr>
+              <w:jc w:val="both"/>
+              <w:rPr>
+                <w:rFonts w:ascii="Calibri" w:hAnsi="Calibri" w:cs="Arial"/>
+                <w:i/>
+                <w:color w:val="548DD4"/>
+                <w:sz w:val="18"/>
+                <w:szCs w:val="20"/>
+                <w:lang w:val="en-US" w:eastAsia="es-CL"/>
+              </w:rPr>
+            </w:pPr>
+            <w:r>
+              <w:rPr>
+                <w:rFonts w:ascii="Calibri" w:hAnsi="Calibri" w:cs="Arial"/>
+                <w:i/>
+                <w:color w:val="548DD4"/>
+                <w:sz w:val="18"/>
+                <w:szCs w:val="20"/>
+                <w:lang w:val="en-US" w:eastAsia="es-CL"/>
+              </w:rPr>
+              <w:t>Ninguno</w:t>
+            </w:r>
+          </w:p>
+        </w:tc>
+      </w:tr>
+      <w:tr>
+        <w:trPr>
+          <w:trHeight w:val="1377"/>
+        </w:trPr>
+        <w:tc>
+          <w:tcPr>
+            <w:tcW w:w="1328" w:type="dxa"/>
+          </w:tcPr>
+          <w:p>
+            <w:pPr>
+              <w:jc w:val="both"/>
+              <w:rPr>
+                <w:rFonts w:ascii="Calibri" w:hAnsi="Calibri" w:cs="Arial"/>
+                <w:i/>
+                <w:color w:val="548DD4"/>
+                <w:sz w:val="18"/>
+                <w:szCs w:val="20"/>
+                <w:lang w:val="en-US" w:eastAsia="es-CL"/>
+              </w:rPr>
+            </w:pPr>
+            <w:r>
+              <w:rPr>
+                <w:rFonts w:ascii="Calibri" w:hAnsi="Calibri" w:cs="Arial"/>
+                <w:i/>
+                <w:color w:val="548DD4"/>
+                <w:sz w:val="18"/>
+                <w:szCs w:val="20"/>
+                <w:lang w:val="en-US" w:eastAsia="es-CL"/>
+              </w:rPr>
+              <w:lastRenderedPageBreak/>
+              <w:t>Gestionar proyectos informáticos</w:t>
+            </w:r>
+          </w:p>
+        </w:tc>
+        <w:tc>
+          <w:tcPr>
+            <w:tcW w:w="1077" w:type="dxa"/>
+          </w:tcPr>
+          <w:p>
+            <w:pPr>
+              <w:jc w:val="both"/>
+              <w:rPr>
+                <w:rFonts w:ascii="Calibri" w:hAnsi="Calibri" w:cs="Arial"/>
+                <w:i/>
+                <w:color w:val="548DD4"/>
+                <w:sz w:val="18"/>
+                <w:szCs w:val="20"/>
+                <w:lang w:val="en-US" w:eastAsia="es-CL"/>
+              </w:rPr>
+            </w:pPr>
+            <w:r>
+              <w:rPr>
+                <w:rFonts w:ascii="Calibri" w:hAnsi="Calibri" w:cs="Arial"/>
+                <w:i/>
+                <w:color w:val="548DD4"/>
+                <w:sz w:val="18"/>
+                <w:szCs w:val="20"/>
+                <w:lang w:val="en-US" w:eastAsia="es-CL"/>
+              </w:rPr>
+              <w:t>Priorización del Product Backlog</w:t>
+            </w:r>
+          </w:p>
+        </w:tc>
+        <w:tc>
+          <w:tcPr>
+            <w:tcW w:w="1276" w:type="dxa"/>
+          </w:tcPr>
+          <w:p>
+            <w:pPr>
+              <w:jc w:val="both"/>
+              <w:rPr>
+                <w:rFonts w:ascii="Calibri" w:hAnsi="Calibri" w:cs="Arial"/>
+                <w:i/>
+                <w:color w:val="548DD4"/>
+                <w:sz w:val="18"/>
+                <w:szCs w:val="20"/>
+                <w:lang w:val="en-US" w:eastAsia="es-CL"/>
+              </w:rPr>
+            </w:pPr>
+            <w:r>
+              <w:rPr>
+                <w:rFonts w:ascii="Calibri" w:hAnsi="Calibri" w:cs="Arial"/>
+                <w:i/>
+                <w:color w:val="548DD4"/>
+                <w:sz w:val="18"/>
+                <w:szCs w:val="20"/>
+                <w:lang w:val="en-US" w:eastAsia="es-CL"/>
+              </w:rPr>
+              <w:t>Jira / Discord / Google Meet / PC</w:t>
+            </w:r>
+          </w:p>
+        </w:tc>
+        <w:tc>
+          <w:tcPr>
+            <w:tcW w:w="1276" w:type="dxa"/>
+          </w:tcPr>
+          <w:p>
+            <w:pPr>
+              <w:jc w:val="both"/>
+              <w:rPr>
+                <w:rFonts w:ascii="Calibri" w:hAnsi="Calibri" w:cs="Arial"/>
+                <w:i/>
+                <w:color w:val="548DD4"/>
+                <w:sz w:val="18"/>
+                <w:szCs w:val="20"/>
+                <w:lang w:val="en-US" w:eastAsia="es-CL"/>
+              </w:rPr>
+            </w:pPr>
+            <w:r>
+              <w:rPr>
+                <w:rFonts w:ascii="Calibri" w:hAnsi="Calibri" w:cs="Arial"/>
+                <w:i/>
+                <w:color w:val="548DD4"/>
+                <w:sz w:val="18"/>
+                <w:szCs w:val="20"/>
+                <w:lang w:val="en-US" w:eastAsia="es-CL"/>
+              </w:rPr>
+              <w:t>3 días</w:t>
+            </w:r>
+          </w:p>
+        </w:tc>
+        <w:tc>
+          <w:tcPr>
+            <w:tcW w:w="1275" w:type="dxa"/>
+          </w:tcPr>
+          <w:p>
+            <w:pPr>
+              <w:jc w:val="both"/>
+              <w:rPr>
+                <w:rFonts w:ascii="Calibri" w:hAnsi="Calibri" w:cs="Arial"/>
+                <w:i/>
+                <w:color w:val="548DD4"/>
+                <w:sz w:val="18"/>
+                <w:szCs w:val="20"/>
+                <w:lang w:val="en-US" w:eastAsia="es-CL"/>
+              </w:rPr>
+            </w:pPr>
+            <w:r>
+              <w:rPr>
+                <w:rFonts w:ascii="Calibri" w:hAnsi="Calibri" w:cs="Arial"/>
+                <w:i/>
+                <w:color w:val="548DD4"/>
+                <w:sz w:val="18"/>
+                <w:szCs w:val="20"/>
+                <w:lang w:val="en-US" w:eastAsia="es-CL"/>
+              </w:rPr>
+              <w:t>Alonso Gómez</w:t>
+            </w:r>
+          </w:p>
+        </w:tc>
+        <w:tc>
+          <w:tcPr>
+            <w:tcW w:w="1276" w:type="dxa"/>
+          </w:tcPr>
+          <w:p>
+            <w:pPr>
+              <w:jc w:val="both"/>
+              <w:rPr>
+                <w:rFonts w:ascii="Calibri" w:hAnsi="Calibri" w:cs="Arial"/>
+                <w:i/>
+                <w:color w:val="548DD4"/>
+                <w:sz w:val="18"/>
+                <w:szCs w:val="20"/>
+                <w:lang w:val="en-US" w:eastAsia="es-CL"/>
+              </w:rPr>
+            </w:pPr>
+            <w:r>
+              <w:rPr>
+                <w:rFonts w:ascii="Calibri" w:hAnsi="Calibri" w:cs="Arial"/>
+                <w:i/>
+                <w:color w:val="548DD4"/>
+                <w:sz w:val="18"/>
+                <w:szCs w:val="20"/>
+                <w:lang w:val="en-US" w:eastAsia="es-CL"/>
+              </w:rPr>
+              <w:t>Priorización de entregables</w:t>
+            </w:r>
+          </w:p>
+        </w:tc>
+        <w:tc>
+          <w:tcPr>
+            <w:tcW w:w="1418" w:type="dxa"/>
+          </w:tcPr>
+          <w:p>
+            <w:pPr>
+              <w:jc w:val="both"/>
+              <w:rPr>
+                <w:rFonts w:ascii="Calibri" w:hAnsi="Calibri" w:cs="Arial"/>
+                <w:i/>
+                <w:color w:val="548DD4"/>
+                <w:sz w:val="18"/>
+                <w:szCs w:val="20"/>
+                <w:lang w:val="en-US" w:eastAsia="es-CL"/>
+              </w:rPr>
+            </w:pPr>
+            <w:r>
+              <w:rPr>
+                <w:rFonts w:ascii="Calibri" w:hAnsi="Calibri" w:cs="Arial"/>
+                <w:i/>
+                <w:color w:val="548DD4"/>
+                <w:sz w:val="18"/>
+                <w:szCs w:val="20"/>
+                <w:lang w:val="en-US" w:eastAsia="es-CL"/>
+              </w:rPr>
+              <w:t>En curso</w:t>
+            </w:r>
+          </w:p>
+        </w:tc>
+        <w:tc>
+          <w:tcPr>
+            <w:tcW w:w="850" w:type="dxa"/>
+          </w:tcPr>
+          <w:p>
+            <w:pPr>
+              <w:jc w:val="both"/>
+              <w:rPr>
+                <w:rFonts w:ascii="Calibri" w:hAnsi="Calibri" w:cs="Arial"/>
+                <w:i/>
+                <w:color w:val="548DD4"/>
+                <w:sz w:val="18"/>
+                <w:szCs w:val="20"/>
+                <w:lang w:val="en-US" w:eastAsia="es-CL"/>
+              </w:rPr>
+            </w:pPr>
+            <w:r>
+              <w:rPr>
+                <w:rFonts w:ascii="Calibri" w:hAnsi="Calibri" w:cs="Arial"/>
+                <w:i/>
+                <w:color w:val="548DD4"/>
+                <w:sz w:val="18"/>
+                <w:szCs w:val="20"/>
+                <w:lang w:val="en-US" w:eastAsia="es-CL"/>
+              </w:rPr>
+              <w:t>Ninguno</w:t>
+            </w:r>
+          </w:p>
+        </w:tc>
+      </w:tr>
+      <w:tr>
+        <w:trPr>
+          <w:trHeight w:val="1377"/>
+        </w:trPr>
+        <w:tc>
+          <w:tcPr>
+            <w:tcW w:w="1328" w:type="dxa"/>
+          </w:tcPr>
+          <w:p>
+            <w:pPr>
+              <w:jc w:val="center"/>
+              <w:rPr>
+                <w:rFonts w:ascii="Calibri" w:hAnsi="Calibri" w:cs="Arial"/>
+                <w:i/>
+                <w:color w:val="548DD4"/>
+                <w:sz w:val="18"/>
+                <w:szCs w:val="20"/>
+                <w:lang w:val="en-US" w:eastAsia="es-CL"/>
+              </w:rPr>
+            </w:pPr>
+            <w:r>
+              <w:rPr>
+                <w:rFonts w:ascii="Calibri" w:hAnsi="Calibri" w:cs="Arial"/>
+                <w:i/>
+                <w:color w:val="548DD4"/>
+                <w:sz w:val="18"/>
+                <w:szCs w:val="20"/>
+                <w:lang w:val="en-US" w:eastAsia="es-CL"/>
+              </w:rPr>
+              <w:t>Gestionar proyectos informáticos</w:t>
+            </w:r>
+          </w:p>
+        </w:tc>
+        <w:tc>
+          <w:tcPr>
+            <w:tcW w:w="1077" w:type="dxa"/>
+          </w:tcPr>
+          <w:p>
+            <w:pPr>
+              <w:jc w:val="both"/>
+              <w:rPr>
+                <w:rFonts w:ascii="Calibri" w:hAnsi="Calibri" w:cs="Arial"/>
+                <w:i/>
+                <w:color w:val="548DD4"/>
+                <w:sz w:val="18"/>
+                <w:szCs w:val="20"/>
+                <w:lang w:eastAsia="es-CL"/>
+              </w:rPr>
+            </w:pPr>
+            <w:r>
+              <w:rPr>
+                <w:rFonts w:ascii="Calibri" w:hAnsi="Calibri" w:cs="Arial"/>
+                <w:i/>
+                <w:color w:val="548DD4"/>
+                <w:sz w:val="18"/>
+                <w:szCs w:val="20"/>
+                <w:lang w:eastAsia="es-CL"/>
+              </w:rPr>
+              <w:t>Creación de la carta Gantt</w:t>
+            </w:r>
+          </w:p>
+        </w:tc>
+        <w:tc>
+          <w:tcPr>
+            <w:tcW w:w="1276" w:type="dxa"/>
+          </w:tcPr>
+          <w:p>
+            <w:pPr>
+              <w:jc w:val="both"/>
+              <w:rPr>
+                <w:rFonts w:ascii="Calibri" w:hAnsi="Calibri" w:cs="Arial"/>
+                <w:i/>
+                <w:color w:val="548DD4"/>
+                <w:sz w:val="18"/>
+                <w:szCs w:val="20"/>
+                <w:lang w:eastAsia="es-CL"/>
+              </w:rPr>
+            </w:pPr>
+            <w:r>
+              <w:rPr>
+                <w:rFonts w:ascii="Calibri" w:hAnsi="Calibri" w:cs="Arial"/>
+                <w:i/>
+                <w:color w:val="548DD4"/>
+                <w:sz w:val="18"/>
+                <w:szCs w:val="20"/>
+                <w:lang w:eastAsia="es-CL"/>
+              </w:rPr>
+              <w:t>Excel</w:t>
+            </w:r>
+          </w:p>
+        </w:tc>
+        <w:tc>
+          <w:tcPr>
+            <w:tcW w:w="1276" w:type="dxa"/>
+          </w:tcPr>
+          <w:p>
+            <w:pPr>
+              <w:jc w:val="both"/>
+              <w:rPr>
+                <w:rFonts w:ascii="Calibri" w:hAnsi="Calibri" w:cs="Arial"/>
+                <w:i/>
+                <w:color w:val="548DD4"/>
+                <w:sz w:val="18"/>
+                <w:szCs w:val="20"/>
+                <w:lang w:eastAsia="es-CL"/>
+              </w:rPr>
+            </w:pPr>
+            <w:r>
+              <w:rPr>
+                <w:rFonts w:ascii="Calibri" w:hAnsi="Calibri" w:cs="Arial"/>
+                <w:i/>
+                <w:color w:val="548DD4"/>
+                <w:sz w:val="18"/>
+                <w:szCs w:val="20"/>
+                <w:lang w:eastAsia="es-CL"/>
+              </w:rPr>
+              <w:t>4 días</w:t>
+            </w:r>
+          </w:p>
+        </w:tc>
+        <w:tc>
+          <w:tcPr>
+            <w:tcW w:w="1275" w:type="dxa"/>
+          </w:tcPr>
+          <w:p>
+            <w:pPr>
+              <w:jc w:val="both"/>
+              <w:rPr>
+                <w:rFonts w:ascii="Calibri" w:hAnsi="Calibri" w:cs="Arial"/>
+                <w:i/>
+                <w:color w:val="548DD4"/>
+                <w:sz w:val="18"/>
+                <w:szCs w:val="20"/>
+                <w:lang w:eastAsia="es-CL"/>
+              </w:rPr>
+            </w:pPr>
+            <w:r>
+              <w:rPr>
+                <w:rFonts w:ascii="Calibri" w:hAnsi="Calibri" w:cs="Arial"/>
+                <w:i/>
+                <w:color w:val="548DD4"/>
+                <w:sz w:val="18"/>
+                <w:szCs w:val="20"/>
+                <w:lang w:eastAsia="es-CL"/>
+              </w:rPr>
+              <w:t>Alonso Gómez</w:t>
+            </w:r>
+          </w:p>
+        </w:tc>
+        <w:tc>
+          <w:tcPr>
+            <w:tcW w:w="1276" w:type="dxa"/>
+          </w:tcPr>
+          <w:p>
+            <w:pPr>
+              <w:jc w:val="both"/>
+              <w:rPr>
+                <w:rFonts w:ascii="Calibri" w:hAnsi="Calibri" w:cs="Arial"/>
+                <w:i/>
+                <w:color w:val="548DD4"/>
+                <w:sz w:val="18"/>
+                <w:szCs w:val="20"/>
+                <w:lang w:eastAsia="es-CL"/>
+              </w:rPr>
+            </w:pPr>
+            <w:r>
+              <w:rPr>
+                <w:rFonts w:ascii="Calibri" w:hAnsi="Calibri" w:cs="Arial"/>
+                <w:i/>
+                <w:color w:val="548DD4"/>
+                <w:sz w:val="18"/>
+                <w:szCs w:val="20"/>
+                <w:lang w:eastAsia="es-CL"/>
+              </w:rPr>
+              <w:t>Asegura planificación incremental</w:t>
+            </w:r>
+          </w:p>
+        </w:tc>
+        <w:tc>
+          <w:tcPr>
+            <w:tcW w:w="1418" w:type="dxa"/>
+          </w:tcPr>
+          <w:p>
+            <w:pPr>
+              <w:jc w:val="both"/>
+              <w:rPr>
+                <w:rFonts w:ascii="Calibri" w:hAnsi="Calibri" w:cs="Arial"/>
+                <w:i/>
+                <w:color w:val="548DD4"/>
+                <w:sz w:val="18"/>
+                <w:szCs w:val="20"/>
+                <w:lang w:eastAsia="es-CL"/>
+              </w:rPr>
+            </w:pPr>
+            <w:r>
+              <w:rPr>
+                <w:rFonts w:ascii="Calibri" w:hAnsi="Calibri" w:cs="Arial"/>
+                <w:i/>
+                <w:color w:val="548DD4"/>
+                <w:sz w:val="18"/>
+                <w:szCs w:val="20"/>
+                <w:lang w:eastAsia="es-CL"/>
+              </w:rPr>
+              <w:t>En curso</w:t>
+            </w:r>
+          </w:p>
+        </w:tc>
+        <w:tc>
+          <w:tcPr>
+            <w:tcW w:w="850" w:type="dxa"/>
+          </w:tcPr>
+          <w:p>
+            <w:pPr>
+              <w:jc w:val="both"/>
+              <w:rPr>
+                <w:rFonts w:ascii="Calibri" w:hAnsi="Calibri" w:cs="Arial"/>
+                <w:i/>
+                <w:color w:val="548DD4"/>
+                <w:sz w:val="18"/>
+                <w:szCs w:val="20"/>
+                <w:lang w:eastAsia="es-CL"/>
+              </w:rPr>
+            </w:pPr>
+            <w:r>
+              <w:rPr>
+                <w:rFonts w:ascii="Calibri" w:hAnsi="Calibri" w:cs="Arial"/>
+                <w:i/>
+                <w:color w:val="548DD4"/>
+                <w:sz w:val="18"/>
+                <w:szCs w:val="20"/>
+                <w:lang w:eastAsia="es-CL"/>
+              </w:rPr>
+              <w:t>Ninguno</w:t>
+            </w:r>
+          </w:p>
+        </w:tc>
+      </w:tr>
+      <w:tr>
+        <w:trPr>
+          <w:trHeight w:val="1377"/>
+        </w:trPr>
+        <w:tc>
+          <w:tcPr>
+            <w:tcW w:w="1328" w:type="dxa"/>
+          </w:tcPr>
+          <w:p>
+            <w:pPr>
+              <w:jc w:val="both"/>
+              <w:rPr>
+                <w:rFonts w:ascii="Calibri" w:hAnsi="Calibri" w:cs="Arial"/>
+                <w:i/>
+                <w:color w:val="548DD4"/>
+                <w:sz w:val="18"/>
+                <w:szCs w:val="20"/>
+                <w:lang w:eastAsia="es-CL"/>
+              </w:rPr>
+            </w:pPr>
+            <w:r>
+              <w:rPr>
+                <w:rFonts w:ascii="Calibri" w:hAnsi="Calibri" w:cs="Arial"/>
+                <w:i/>
+                <w:color w:val="548DD4"/>
+                <w:sz w:val="18"/>
+                <w:szCs w:val="20"/>
+                <w:lang w:eastAsia="es-CL"/>
+              </w:rPr>
+              <w:t>Desarrollar solución de software</w:t>
+            </w:r>
+          </w:p>
+        </w:tc>
+        <w:tc>
+          <w:tcPr>
+            <w:tcW w:w="1077" w:type="dxa"/>
+          </w:tcPr>
+          <w:p>
+            <w:pPr>
+              <w:jc w:val="both"/>
+              <w:rPr>
+                <w:rFonts w:ascii="Calibri" w:hAnsi="Calibri" w:cs="Arial"/>
+                <w:i/>
+                <w:color w:val="548DD4"/>
+                <w:sz w:val="18"/>
+                <w:szCs w:val="20"/>
+                <w:lang w:eastAsia="es-CL"/>
+              </w:rPr>
+            </w:pPr>
+            <w:r>
+              <w:rPr>
+                <w:rFonts w:ascii="Calibri" w:hAnsi="Calibri" w:cs="Arial"/>
+                <w:i/>
+                <w:color w:val="548DD4"/>
+                <w:sz w:val="18"/>
+                <w:szCs w:val="20"/>
+                <w:lang w:eastAsia="es-CL"/>
+              </w:rPr>
+              <w:t>Preparación ambiente de desarrollo</w:t>
+            </w:r>
+          </w:p>
+        </w:tc>
+        <w:tc>
+          <w:tcPr>
+            <w:tcW w:w="1276" w:type="dxa"/>
+          </w:tcPr>
+          <w:p>
+            <w:pPr>
+              <w:jc w:val="both"/>
+              <w:rPr>
+                <w:rFonts w:ascii="Calibri" w:hAnsi="Calibri" w:cs="Arial"/>
+                <w:i/>
+                <w:color w:val="548DD4"/>
+                <w:sz w:val="18"/>
+                <w:szCs w:val="20"/>
+                <w:lang w:val="en-US" w:eastAsia="es-CL"/>
+              </w:rPr>
+            </w:pPr>
+            <w:r>
+              <w:rPr>
+                <w:rFonts w:ascii="Calibri" w:hAnsi="Calibri" w:cs="Arial"/>
+                <w:i/>
+                <w:color w:val="548DD4"/>
+                <w:sz w:val="18"/>
+                <w:szCs w:val="20"/>
+                <w:lang w:val="en-US" w:eastAsia="es-CL"/>
+              </w:rPr>
+              <w:t>GitHub / Docker / IntelliJ / Spring Boot / Java JDK 17 / React Native / Expo / MySQL / PC</w:t>
+            </w:r>
+          </w:p>
+        </w:tc>
+        <w:tc>
+          <w:tcPr>
+            <w:tcW w:w="1276" w:type="dxa"/>
+          </w:tcPr>
+          <w:p>
+            <w:pPr>
+              <w:jc w:val="both"/>
+              <w:rPr>
+                <w:rFonts w:ascii="Calibri" w:hAnsi="Calibri" w:cs="Arial"/>
+                <w:i/>
+                <w:color w:val="548DD4"/>
+                <w:sz w:val="18"/>
+                <w:szCs w:val="20"/>
+                <w:lang w:val="en-US" w:eastAsia="es-CL"/>
+              </w:rPr>
+            </w:pPr>
+            <w:r>
+              <w:rPr>
+                <w:rFonts w:ascii="Calibri" w:hAnsi="Calibri" w:cs="Arial"/>
+                <w:i/>
+                <w:color w:val="548DD4"/>
+                <w:sz w:val="18"/>
+                <w:szCs w:val="20"/>
+                <w:lang w:val="en-US" w:eastAsia="es-CL"/>
+              </w:rPr>
+              <w:t>1 día</w:t>
+            </w:r>
+          </w:p>
+        </w:tc>
+        <w:tc>
+          <w:tcPr>
+            <w:tcW w:w="1275" w:type="dxa"/>
+          </w:tcPr>
+          <w:p>
+            <w:pPr>
+              <w:jc w:val="both"/>
+              <w:rPr>
+                <w:rFonts w:ascii="Calibri" w:hAnsi="Calibri" w:cs="Arial"/>
+                <w:i/>
+                <w:color w:val="548DD4"/>
+                <w:sz w:val="18"/>
+                <w:szCs w:val="20"/>
+                <w:lang w:val="en-US" w:eastAsia="es-CL"/>
+              </w:rPr>
+            </w:pPr>
+            <w:r>
+              <w:rPr>
+                <w:rFonts w:ascii="Calibri" w:hAnsi="Calibri" w:cs="Arial"/>
+                <w:i/>
+                <w:color w:val="548DD4"/>
+                <w:sz w:val="18"/>
+                <w:szCs w:val="20"/>
+                <w:lang w:val="en-US" w:eastAsia="es-CL"/>
+              </w:rPr>
+              <w:t>Alonso Gómez</w:t>
+            </w:r>
+          </w:p>
+        </w:tc>
+        <w:tc>
+          <w:tcPr>
+            <w:tcW w:w="1276" w:type="dxa"/>
+          </w:tcPr>
+          <w:p>
+            <w:pPr>
+              <w:jc w:val="both"/>
+              <w:rPr>
+                <w:rFonts w:ascii="Calibri" w:hAnsi="Calibri" w:cs="Arial"/>
+                <w:i/>
+                <w:color w:val="548DD4"/>
+                <w:sz w:val="18"/>
+                <w:szCs w:val="20"/>
+                <w:lang w:val="en-US" w:eastAsia="es-CL"/>
+              </w:rPr>
+            </w:pPr>
+            <w:r>
+              <w:rPr>
+                <w:rFonts w:ascii="Calibri" w:hAnsi="Calibri" w:cs="Arial"/>
+                <w:i/>
+                <w:color w:val="548DD4"/>
+                <w:sz w:val="18"/>
+                <w:szCs w:val="20"/>
+                <w:lang w:val="en-US" w:eastAsia="es-CL"/>
+              </w:rPr>
+              <w:t>Evita problemas técnicos posteriores</w:t>
+            </w:r>
+          </w:p>
+        </w:tc>
+        <w:tc>
+          <w:tcPr>
+            <w:tcW w:w="1418" w:type="dxa"/>
+          </w:tcPr>
+          <w:p>
+            <w:pPr>
+              <w:jc w:val="both"/>
+              <w:rPr>
+                <w:rFonts w:ascii="Calibri" w:hAnsi="Calibri" w:cs="Arial"/>
+                <w:i/>
+                <w:color w:val="548DD4"/>
+                <w:sz w:val="18"/>
+                <w:szCs w:val="20"/>
+                <w:lang w:val="en-US" w:eastAsia="es-CL"/>
+              </w:rPr>
+            </w:pPr>
+            <w:r>
+              <w:rPr>
+                <w:rFonts w:ascii="Calibri" w:hAnsi="Calibri" w:cs="Arial"/>
+                <w:i/>
+                <w:color w:val="548DD4"/>
+                <w:sz w:val="18"/>
+                <w:szCs w:val="20"/>
+                <w:lang w:val="en-US" w:eastAsia="es-CL"/>
+              </w:rPr>
+              <w:t>Completado</w:t>
+            </w:r>
+          </w:p>
+        </w:tc>
+        <w:tc>
+          <w:tcPr>
+            <w:tcW w:w="850" w:type="dxa"/>
+          </w:tcPr>
+          <w:p>
+            <w:pPr>
+              <w:jc w:val="both"/>
+              <w:rPr>
+                <w:rFonts w:ascii="Calibri" w:hAnsi="Calibri" w:cs="Arial"/>
+                <w:i/>
+                <w:color w:val="548DD4"/>
+                <w:sz w:val="18"/>
+                <w:szCs w:val="20"/>
+                <w:lang w:val="en-US" w:eastAsia="es-CL"/>
+              </w:rPr>
+            </w:pPr>
+            <w:r>
+              <w:rPr>
+                <w:rFonts w:ascii="Calibri" w:hAnsi="Calibri" w:cs="Arial"/>
+                <w:i/>
+                <w:color w:val="548DD4"/>
+                <w:sz w:val="18"/>
+                <w:szCs w:val="20"/>
+                <w:lang w:val="en-US" w:eastAsia="es-CL"/>
+              </w:rPr>
+              <w:t>Ninguno</w:t>
+            </w:r>
+          </w:p>
+        </w:tc>
+      </w:tr>
+      <w:tr>
+        <w:trPr>
+          <w:trHeight w:val="1377"/>
+        </w:trPr>
+        <w:tc>
+          <w:tcPr>
+            <w:tcW w:w="1328" w:type="dxa"/>
+          </w:tcPr>
+          <w:p>
+            <w:pPr>
+              <w:jc w:val="both"/>
+              <w:rPr>
+                <w:rFonts w:ascii="Calibri" w:hAnsi="Calibri" w:cs="Arial"/>
+                <w:i/>
+                <w:color w:val="548DD4"/>
+                <w:sz w:val="18"/>
+                <w:szCs w:val="20"/>
+                <w:lang w:val="en-US" w:eastAsia="es-CL"/>
+              </w:rPr>
+            </w:pPr>
+            <w:r>
+              <w:rPr>
+                <w:rFonts w:ascii="Calibri" w:hAnsi="Calibri" w:cs="Arial"/>
+                <w:i/>
+                <w:color w:val="548DD4"/>
+                <w:sz w:val="18"/>
+                <w:szCs w:val="20"/>
+                <w:lang w:val="en-US" w:eastAsia="es-CL"/>
+              </w:rPr>
+              <w:t>Construir programas y rutinas</w:t>
+            </w:r>
+          </w:p>
+        </w:tc>
+        <w:tc>
+          <w:tcPr>
+            <w:tcW w:w="1077" w:type="dxa"/>
+          </w:tcPr>
+          <w:p>
+            <w:pPr>
+              <w:jc w:val="both"/>
+              <w:rPr>
+                <w:rFonts w:ascii="Calibri" w:hAnsi="Calibri" w:cs="Arial"/>
+                <w:i/>
+                <w:color w:val="548DD4"/>
+                <w:sz w:val="18"/>
+                <w:szCs w:val="20"/>
+                <w:lang w:val="en-US" w:eastAsia="es-CL"/>
+              </w:rPr>
+            </w:pPr>
+            <w:r>
+              <w:rPr>
+                <w:rFonts w:ascii="Calibri" w:hAnsi="Calibri" w:cs="Arial"/>
+                <w:i/>
+                <w:color w:val="548DD4"/>
+                <w:sz w:val="18"/>
+                <w:szCs w:val="20"/>
+                <w:lang w:val="en-US" w:eastAsia="es-CL"/>
+              </w:rPr>
+              <w:t>Desarrollo Frontend</w:t>
+            </w:r>
+          </w:p>
+        </w:tc>
+        <w:tc>
+          <w:tcPr>
+            <w:tcW w:w="1276" w:type="dxa"/>
+          </w:tcPr>
+          <w:p>
+            <w:pPr>
+              <w:jc w:val="both"/>
+              <w:rPr>
+                <w:rFonts w:ascii="Calibri" w:hAnsi="Calibri" w:cs="Arial"/>
+                <w:i/>
+                <w:color w:val="548DD4"/>
+                <w:sz w:val="18"/>
+                <w:szCs w:val="20"/>
+                <w:lang w:val="en-US" w:eastAsia="es-CL"/>
+              </w:rPr>
+            </w:pPr>
+            <w:r>
+              <w:rPr>
+                <w:rFonts w:ascii="Calibri" w:hAnsi="Calibri" w:cs="Arial"/>
+                <w:i/>
+                <w:color w:val="548DD4"/>
+                <w:sz w:val="18"/>
+                <w:szCs w:val="20"/>
+                <w:lang w:val="en-US" w:eastAsia="es-CL"/>
+              </w:rPr>
+              <w:t>React Native / Expo / Figma / PC</w:t>
+            </w:r>
+          </w:p>
+        </w:tc>
+        <w:tc>
+          <w:tcPr>
+            <w:tcW w:w="1276" w:type="dxa"/>
+          </w:tcPr>
+          <w:p>
+            <w:pPr>
+              <w:jc w:val="both"/>
+              <w:rPr>
+                <w:rFonts w:ascii="Calibri" w:hAnsi="Calibri" w:cs="Arial"/>
+                <w:i/>
+                <w:color w:val="548DD4"/>
+                <w:sz w:val="18"/>
+                <w:szCs w:val="20"/>
+                <w:lang w:val="en-US" w:eastAsia="es-CL"/>
+              </w:rPr>
+            </w:pPr>
+            <w:r>
+              <w:rPr>
+                <w:rFonts w:ascii="Calibri" w:hAnsi="Calibri" w:cs="Arial"/>
+                <w:i/>
+                <w:color w:val="548DD4"/>
+                <w:sz w:val="18"/>
+                <w:szCs w:val="20"/>
+                <w:lang w:val="en-US" w:eastAsia="es-CL"/>
+              </w:rPr>
+              <w:t>14 días</w:t>
+            </w:r>
+          </w:p>
+        </w:tc>
+        <w:tc>
+          <w:tcPr>
+            <w:tcW w:w="1275" w:type="dxa"/>
+          </w:tcPr>
+          <w:p>
+            <w:pPr>
+              <w:jc w:val="both"/>
+              <w:rPr>
+                <w:rFonts w:ascii="Calibri" w:hAnsi="Calibri" w:cs="Arial"/>
+                <w:i/>
+                <w:color w:val="548DD4"/>
+                <w:sz w:val="18"/>
+                <w:szCs w:val="20"/>
+                <w:lang w:val="en-US" w:eastAsia="es-CL"/>
+              </w:rPr>
+            </w:pPr>
+            <w:r>
+              <w:rPr>
+                <w:rFonts w:ascii="Calibri" w:hAnsi="Calibri" w:cs="Arial"/>
+                <w:i/>
+                <w:color w:val="548DD4"/>
+                <w:sz w:val="18"/>
+                <w:szCs w:val="20"/>
+                <w:lang w:val="en-US" w:eastAsia="es-CL"/>
+              </w:rPr>
+              <w:t>Cristian Ferreira</w:t>
+            </w:r>
+          </w:p>
+        </w:tc>
+        <w:tc>
+          <w:tcPr>
+            <w:tcW w:w="1276" w:type="dxa"/>
+          </w:tcPr>
+          <w:p>
+            <w:pPr>
+              <w:jc w:val="both"/>
+              <w:rPr>
+                <w:rFonts w:ascii="Calibri" w:hAnsi="Calibri" w:cs="Arial"/>
+                <w:i/>
+                <w:color w:val="548DD4"/>
+                <w:sz w:val="18"/>
+                <w:szCs w:val="20"/>
+                <w:lang w:val="en-US" w:eastAsia="es-CL"/>
+              </w:rPr>
+            </w:pPr>
+            <w:r>
+              <w:rPr>
+                <w:rFonts w:ascii="Calibri" w:hAnsi="Calibri" w:cs="Arial"/>
+                <w:i/>
+                <w:color w:val="548DD4"/>
+                <w:sz w:val="18"/>
+                <w:szCs w:val="20"/>
+                <w:lang w:val="en-US" w:eastAsia="es-CL"/>
+              </w:rPr>
+              <w:t>Validar experiencia de usuario</w:t>
+            </w:r>
+          </w:p>
+        </w:tc>
+        <w:tc>
+          <w:tcPr>
+            <w:tcW w:w="1418" w:type="dxa"/>
+          </w:tcPr>
+          <w:p>
+            <w:pPr>
+              <w:jc w:val="both"/>
+              <w:rPr>
+                <w:rFonts w:ascii="Calibri" w:hAnsi="Calibri" w:cs="Arial"/>
+                <w:i/>
+                <w:color w:val="548DD4"/>
+                <w:sz w:val="18"/>
+                <w:szCs w:val="20"/>
+                <w:lang w:val="en-US" w:eastAsia="es-CL"/>
+              </w:rPr>
+            </w:pPr>
+            <w:r>
+              <w:rPr>
+                <w:rFonts w:ascii="Calibri" w:hAnsi="Calibri" w:cs="Arial"/>
+                <w:i/>
+                <w:color w:val="548DD4"/>
+                <w:sz w:val="18"/>
+                <w:szCs w:val="20"/>
+                <w:lang w:val="en-US" w:eastAsia="es-CL"/>
+              </w:rPr>
+              <w:t>En curso</w:t>
+            </w:r>
+          </w:p>
+        </w:tc>
+        <w:tc>
+          <w:tcPr>
+            <w:tcW w:w="850" w:type="dxa"/>
+          </w:tcPr>
+          <w:p>
+            <w:pPr>
+              <w:jc w:val="both"/>
+              <w:rPr>
+                <w:rFonts w:ascii="Calibri" w:hAnsi="Calibri" w:cs="Arial"/>
+                <w:i/>
+                <w:color w:val="548DD4"/>
+                <w:sz w:val="18"/>
+                <w:szCs w:val="20"/>
+                <w:lang w:val="en-US" w:eastAsia="es-CL"/>
+              </w:rPr>
+            </w:pPr>
+            <w:r>
+              <w:rPr>
+                <w:rFonts w:ascii="Calibri" w:hAnsi="Calibri" w:cs="Arial"/>
+                <w:i/>
+                <w:color w:val="548DD4"/>
+                <w:sz w:val="18"/>
+                <w:szCs w:val="20"/>
+                <w:lang w:val="en-US" w:eastAsia="es-CL"/>
+              </w:rPr>
+              <w:t>Ninguno</w:t>
+            </w:r>
+          </w:p>
+        </w:tc>
+      </w:tr>
+      <w:tr>
+        <w:trPr>
+          <w:trHeight w:val="1377"/>
+        </w:trPr>
+        <w:tc>
+          <w:tcPr>
+            <w:tcW w:w="1328" w:type="dxa"/>
+          </w:tcPr>
+          <w:p>
+            <w:pPr>
+              <w:jc w:val="both"/>
+              <w:rPr>
+                <w:rFonts w:ascii="Calibri" w:hAnsi="Calibri" w:cs="Arial"/>
+                <w:i/>
+                <w:color w:val="548DD4"/>
+                <w:sz w:val="18"/>
+                <w:szCs w:val="20"/>
+                <w:lang w:val="en-US" w:eastAsia="es-CL"/>
+              </w:rPr>
+            </w:pPr>
+            <w:r>
+              <w:rPr>
+                <w:rFonts w:ascii="Calibri" w:hAnsi="Calibri" w:cs="Arial"/>
+                <w:i/>
+                <w:color w:val="548DD4"/>
+                <w:sz w:val="18"/>
+                <w:szCs w:val="20"/>
+                <w:lang w:val="en-US" w:eastAsia="es-CL"/>
+              </w:rPr>
+              <w:t>Programar consultas / rutinas BD</w:t>
+            </w:r>
+          </w:p>
+        </w:tc>
+        <w:tc>
+          <w:tcPr>
+            <w:tcW w:w="1077" w:type="dxa"/>
+          </w:tcPr>
+          <w:p>
+            <w:pPr>
+              <w:jc w:val="both"/>
+              <w:rPr>
+                <w:rFonts w:ascii="Calibri" w:hAnsi="Calibri" w:cs="Arial"/>
+                <w:i/>
+                <w:color w:val="548DD4"/>
+                <w:sz w:val="18"/>
+                <w:szCs w:val="20"/>
+                <w:lang w:val="en-US" w:eastAsia="es-CL"/>
+              </w:rPr>
+            </w:pPr>
+            <w:r>
+              <w:rPr>
+                <w:rFonts w:ascii="Calibri" w:hAnsi="Calibri" w:cs="Arial"/>
+                <w:i/>
+                <w:color w:val="548DD4"/>
+                <w:sz w:val="18"/>
+                <w:szCs w:val="20"/>
+                <w:lang w:val="en-US" w:eastAsia="es-CL"/>
+              </w:rPr>
+              <w:t>Desarrollo Backend</w:t>
+            </w:r>
+          </w:p>
+        </w:tc>
+        <w:tc>
+          <w:tcPr>
+            <w:tcW w:w="1276" w:type="dxa"/>
+          </w:tcPr>
+          <w:p>
+            <w:pPr>
+              <w:jc w:val="both"/>
+              <w:rPr>
+                <w:rFonts w:ascii="Calibri" w:hAnsi="Calibri" w:cs="Arial"/>
+                <w:i/>
+                <w:color w:val="548DD4"/>
+                <w:sz w:val="18"/>
+                <w:szCs w:val="20"/>
+                <w:lang w:val="en-US" w:eastAsia="es-CL"/>
+              </w:rPr>
+            </w:pPr>
+            <w:r>
+              <w:rPr>
+                <w:rFonts w:ascii="Calibri" w:hAnsi="Calibri" w:cs="Arial"/>
+                <w:i/>
+                <w:color w:val="548DD4"/>
+                <w:sz w:val="18"/>
+                <w:szCs w:val="20"/>
+                <w:lang w:val="en-US" w:eastAsia="es-CL"/>
+              </w:rPr>
+              <w:t>Java / Spring Boot / Insomnia / MySQL / PC</w:t>
+            </w:r>
+          </w:p>
+        </w:tc>
+        <w:tc>
+          <w:tcPr>
+            <w:tcW w:w="1276" w:type="dxa"/>
+          </w:tcPr>
+          <w:p>
+            <w:pPr>
+              <w:jc w:val="both"/>
+              <w:rPr>
+                <w:rFonts w:ascii="Calibri" w:hAnsi="Calibri" w:cs="Arial"/>
+                <w:i/>
+                <w:color w:val="548DD4"/>
+                <w:sz w:val="18"/>
+                <w:szCs w:val="20"/>
+                <w:lang w:val="en-US" w:eastAsia="es-CL"/>
+              </w:rPr>
+            </w:pPr>
+            <w:r>
+              <w:rPr>
+                <w:rFonts w:ascii="Calibri" w:hAnsi="Calibri" w:cs="Arial"/>
+                <w:i/>
+                <w:color w:val="548DD4"/>
+                <w:sz w:val="18"/>
+                <w:szCs w:val="20"/>
+                <w:lang w:val="en-US" w:eastAsia="es-CL"/>
+              </w:rPr>
+              <w:t>15 días</w:t>
+            </w:r>
+          </w:p>
+        </w:tc>
+        <w:tc>
+          <w:tcPr>
+            <w:tcW w:w="1275" w:type="dxa"/>
+          </w:tcPr>
+          <w:p>
+            <w:pPr>
+              <w:jc w:val="both"/>
+              <w:rPr>
+                <w:rFonts w:ascii="Calibri" w:hAnsi="Calibri" w:cs="Arial"/>
+                <w:i/>
+                <w:color w:val="548DD4"/>
+                <w:sz w:val="18"/>
+                <w:szCs w:val="20"/>
+                <w:lang w:val="en-US" w:eastAsia="es-CL"/>
+              </w:rPr>
+            </w:pPr>
+            <w:r>
+              <w:rPr>
+                <w:rFonts w:ascii="Calibri" w:hAnsi="Calibri" w:cs="Arial"/>
+                <w:i/>
+                <w:color w:val="548DD4"/>
+                <w:sz w:val="18"/>
+                <w:szCs w:val="20"/>
+                <w:lang w:val="en-US" w:eastAsia="es-CL"/>
+              </w:rPr>
+              <w:t>Alonso Gómez</w:t>
+            </w:r>
+          </w:p>
+        </w:tc>
+        <w:tc>
+          <w:tcPr>
+            <w:tcW w:w="1276" w:type="dxa"/>
+          </w:tcPr>
+          <w:p>
+            <w:pPr>
+              <w:jc w:val="both"/>
+              <w:rPr>
+                <w:rFonts w:ascii="Calibri" w:hAnsi="Calibri" w:cs="Arial"/>
+                <w:i/>
+                <w:color w:val="548DD4"/>
+                <w:sz w:val="18"/>
+                <w:szCs w:val="20"/>
+                <w:lang w:eastAsia="es-CL"/>
+              </w:rPr>
+            </w:pPr>
+            <w:r>
+              <w:rPr>
+                <w:rFonts w:ascii="Calibri" w:hAnsi="Calibri" w:cs="Arial"/>
+                <w:i/>
+                <w:color w:val="548DD4"/>
+                <w:sz w:val="18"/>
+                <w:szCs w:val="20"/>
+                <w:lang w:eastAsia="es-CL"/>
+              </w:rPr>
+              <w:t xml:space="preserve">Base del funcionamiento de la </w:t>
+            </w:r>
+            <w:proofErr w:type="gramStart"/>
+            <w:r>
+              <w:rPr>
+                <w:rFonts w:ascii="Calibri" w:hAnsi="Calibri" w:cs="Arial"/>
+                <w:i/>
+                <w:color w:val="548DD4"/>
+                <w:sz w:val="18"/>
+                <w:szCs w:val="20"/>
+                <w:lang w:eastAsia="es-CL"/>
+              </w:rPr>
+              <w:t>app</w:t>
+            </w:r>
+            <w:proofErr w:type="gramEnd"/>
+          </w:p>
+        </w:tc>
+        <w:tc>
+          <w:tcPr>
+            <w:tcW w:w="1418" w:type="dxa"/>
+          </w:tcPr>
+          <w:p>
+            <w:pPr>
+              <w:jc w:val="both"/>
+              <w:rPr>
+                <w:rFonts w:ascii="Calibri" w:hAnsi="Calibri" w:cs="Arial"/>
+                <w:i/>
+                <w:color w:val="548DD4"/>
+                <w:sz w:val="18"/>
+                <w:szCs w:val="20"/>
+                <w:lang w:eastAsia="es-CL"/>
+              </w:rPr>
+            </w:pPr>
+            <w:r>
+              <w:rPr>
+                <w:rFonts w:ascii="Calibri" w:hAnsi="Calibri" w:cs="Arial"/>
+                <w:i/>
+                <w:color w:val="548DD4"/>
+                <w:sz w:val="18"/>
+                <w:szCs w:val="20"/>
+                <w:lang w:eastAsia="es-CL"/>
+              </w:rPr>
+              <w:t>En curso</w:t>
+            </w:r>
+          </w:p>
+        </w:tc>
+        <w:tc>
+          <w:tcPr>
+            <w:tcW w:w="850" w:type="dxa"/>
+          </w:tcPr>
+          <w:p>
+            <w:pPr>
+              <w:jc w:val="both"/>
+              <w:rPr>
+                <w:rFonts w:ascii="Calibri" w:hAnsi="Calibri" w:cs="Arial"/>
+                <w:i/>
+                <w:color w:val="548DD4"/>
+                <w:sz w:val="18"/>
+                <w:szCs w:val="20"/>
+                <w:lang w:eastAsia="es-CL"/>
+              </w:rPr>
+            </w:pPr>
+            <w:r>
+              <w:rPr>
+                <w:rFonts w:ascii="Calibri" w:hAnsi="Calibri" w:cs="Arial"/>
+                <w:i/>
+                <w:color w:val="548DD4"/>
+                <w:sz w:val="18"/>
+                <w:szCs w:val="20"/>
+                <w:lang w:eastAsia="es-CL"/>
+              </w:rPr>
+              <w:t>Ninguno</w:t>
             </w:r>
           </w:p>
         </w:tc>
@@ -2314,7 +4835,6 @@
           <w:color w:val="595959" w:themeColor="text1" w:themeTint="A6"/>
           <w:sz w:val="24"/>
           <w:szCs w:val="24"/>
-          <w:lang w:val="es-ES"/>
         </w:rPr>
       </w:pPr>
     </w:p>
@@ -2505,195 +5025,342 @@
             <w:pPr>
               <w:jc w:val="both"/>
               <w:rPr>
-                <w:rFonts w:ascii="Calibri" w:hAnsi="Calibri" w:cs="Arial"/>
-                <w:i/>
-                <w:iCs/>
-                <w:color w:val="548DD4"/>
-                <w:sz w:val="20"/>
-                <w:szCs w:val="20"/>
-                <w:lang w:eastAsia="es-CL"/>
-              </w:rPr>
-            </w:pPr>
-            <w:r>
-              <w:rPr>
                 <w:rFonts w:ascii="Calibri" w:hAnsi="Calibri"/>
                 <w:color w:val="1F3864" w:themeColor="accent1" w:themeShade="80"/>
               </w:rPr>
-              <w:t>Factores que han f</w:t>
-            </w:r>
+            </w:pPr>
             <w:r>
               <w:rPr>
                 <w:rFonts w:ascii="Calibri" w:hAnsi="Calibri"/>
                 <w:color w:val="1F3864" w:themeColor="accent1" w:themeShade="80"/>
               </w:rPr>
-              <w:t>acilita</w:t>
+              <w:t>Factores que han f</w:t>
             </w:r>
             <w:r>
               <w:rPr>
                 <w:rFonts w:ascii="Calibri" w:hAnsi="Calibri"/>
                 <w:color w:val="1F3864" w:themeColor="accent1" w:themeShade="80"/>
               </w:rPr>
-              <w:t>do y/o</w:t>
+              <w:t>acilita</w:t>
             </w:r>
             <w:r>
               <w:rPr>
                 <w:rFonts w:ascii="Calibri" w:hAnsi="Calibri"/>
                 <w:color w:val="1F3864" w:themeColor="accent1" w:themeShade="80"/>
               </w:rPr>
-              <w:t xml:space="preserve"> </w:t>
+              <w:t>do y/o</w:t>
             </w:r>
             <w:r>
               <w:rPr>
                 <w:rFonts w:ascii="Calibri" w:hAnsi="Calibri"/>
                 <w:color w:val="1F3864" w:themeColor="accent1" w:themeShade="80"/>
               </w:rPr>
-              <w:t>dificultado el desarrollo de mi plan de trabajo</w:t>
-            </w:r>
-            <w:r>
-              <w:rPr>
-                <w:rFonts w:ascii="Calibri" w:hAnsi="Calibri" w:cs="Arial"/>
-                <w:color w:val="548DD4"/>
-                <w:sz w:val="20"/>
-                <w:szCs w:val="20"/>
-                <w:lang w:eastAsia="es-CL"/>
-              </w:rPr>
-              <w:t xml:space="preserve">: </w:t>
-            </w:r>
-            <w:r>
-              <w:rPr>
-                <w:rFonts w:ascii="Calibri" w:hAnsi="Calibri" w:cs="Arial"/>
-                <w:i/>
-                <w:iCs/>
-                <w:color w:val="548DD4"/>
-                <w:sz w:val="20"/>
-                <w:szCs w:val="20"/>
-                <w:lang w:eastAsia="es-CL"/>
-              </w:rPr>
-              <w:t>Describe los factores que han facilitado y</w:t>
-            </w:r>
-            <w:r>
-              <w:rPr>
-                <w:rFonts w:ascii="Calibri" w:hAnsi="Calibri" w:cs="Arial"/>
-                <w:i/>
-                <w:iCs/>
-                <w:color w:val="548DD4"/>
-                <w:sz w:val="20"/>
-                <w:szCs w:val="20"/>
-                <w:lang w:eastAsia="es-CL"/>
-              </w:rPr>
-              <w:t>/o</w:t>
-            </w:r>
-            <w:r>
-              <w:rPr>
-                <w:rFonts w:ascii="Calibri" w:hAnsi="Calibri" w:cs="Arial"/>
-                <w:i/>
-                <w:iCs/>
-                <w:color w:val="548DD4"/>
-                <w:sz w:val="20"/>
-                <w:szCs w:val="20"/>
-                <w:lang w:eastAsia="es-CL"/>
-              </w:rPr>
-              <w:t xml:space="preserve"> dificultado el desarrollo de tu Proyecto APT hasta ahora. En el caso de las dificultades</w:t>
-            </w:r>
-            <w:r>
-              <w:rPr>
-                <w:rFonts w:ascii="Calibri" w:hAnsi="Calibri" w:cs="Arial"/>
-                <w:i/>
-                <w:iCs/>
-                <w:color w:val="548DD4"/>
-                <w:sz w:val="20"/>
-                <w:szCs w:val="20"/>
-                <w:lang w:eastAsia="es-CL"/>
-              </w:rPr>
-              <w:t xml:space="preserve"> debes describir</w:t>
-            </w:r>
-            <w:r>
-              <w:rPr>
-                <w:rFonts w:ascii="Calibri" w:hAnsi="Calibri" w:cs="Arial"/>
-                <w:i/>
-                <w:iCs/>
-                <w:color w:val="548DD4"/>
-                <w:sz w:val="20"/>
-                <w:szCs w:val="20"/>
-                <w:lang w:eastAsia="es-CL"/>
-              </w:rPr>
-              <w:t xml:space="preserve"> qué acciones tomaste y/o tomarás para </w:t>
-            </w:r>
-            <w:r>
-              <w:rPr>
-                <w:rFonts w:ascii="Calibri" w:hAnsi="Calibri" w:cs="Arial"/>
-                <w:i/>
-                <w:iCs/>
-                <w:color w:val="548DD4"/>
-                <w:sz w:val="20"/>
-                <w:szCs w:val="20"/>
-                <w:lang w:eastAsia="es-CL"/>
-              </w:rPr>
-              <w:t xml:space="preserve">solucionarlas. </w:t>
-            </w:r>
-            <w:r>
-              <w:rPr>
-                <w:rFonts w:ascii="Calibri" w:hAnsi="Calibri"/>
-                <w:b/>
-                <w:color w:val="1F3864" w:themeColor="accent1" w:themeShade="80"/>
-              </w:rPr>
               <w:t xml:space="preserve"> </w:t>
             </w:r>
-          </w:p>
-          <w:p>
-            <w:pPr>
+            <w:r>
               <w:rPr>
                 <w:rFonts w:ascii="Calibri" w:hAnsi="Calibri"/>
                 <w:color w:val="1F3864" w:themeColor="accent1" w:themeShade="80"/>
               </w:rPr>
-            </w:pPr>
-          </w:p>
-          <w:p>
-            <w:pPr>
+              <w:t>dificultado el desarrollo de mi plan de trabajo</w:t>
+            </w:r>
+            <w:r>
               <w:rPr>
                 <w:rFonts w:ascii="Calibri" w:hAnsi="Calibri"/>
                 <w:color w:val="1F3864" w:themeColor="accent1" w:themeShade="80"/>
               </w:rPr>
-            </w:pPr>
-          </w:p>
-          <w:p>
-            <w:pPr>
-              <w:jc w:val="both"/>
-              <w:rPr>
-                <w:rFonts w:ascii="Calibri" w:hAnsi="Calibri" w:cs="Arial"/>
-                <w:i/>
-                <w:color w:val="548DD4"/>
-                <w:sz w:val="20"/>
-                <w:szCs w:val="20"/>
-                <w:lang w:eastAsia="es-CL"/>
-              </w:rPr>
-            </w:pPr>
-          </w:p>
-          <w:p>
-            <w:pPr>
-              <w:jc w:val="both"/>
-              <w:rPr>
-                <w:rFonts w:ascii="Calibri" w:hAnsi="Calibri" w:cs="Arial"/>
-                <w:i/>
-                <w:color w:val="548DD4"/>
-                <w:sz w:val="20"/>
-                <w:szCs w:val="20"/>
-                <w:lang w:eastAsia="es-CL"/>
-              </w:rPr>
-            </w:pPr>
-          </w:p>
-          <w:p>
-            <w:pPr>
-              <w:jc w:val="both"/>
-              <w:rPr>
-                <w:rFonts w:ascii="Calibri" w:hAnsi="Calibri" w:cs="Arial"/>
-                <w:i/>
-                <w:color w:val="548DD4"/>
-                <w:sz w:val="20"/>
-                <w:szCs w:val="20"/>
-                <w:lang w:eastAsia="es-CL"/>
-              </w:rPr>
-            </w:pPr>
+              <w:t>:</w:t>
+            </w:r>
+          </w:p>
+          <w:p>
+            <w:pPr>
+              <w:spacing w:line="240" w:lineRule="auto"/>
+              <w:jc w:val="both"/>
+              <w:rPr>
+                <w:rFonts w:ascii="Calibri" w:hAnsi="Calibri"/>
+                <w:bCs/>
+                <w:i/>
+                <w:iCs/>
+                <w:color w:val="5B9BD5" w:themeColor="accent5"/>
+                <w:sz w:val="20"/>
+                <w:szCs w:val="20"/>
+              </w:rPr>
+            </w:pPr>
+            <w:r>
+              <w:rPr>
+                <w:rFonts w:ascii="Calibri" w:hAnsi="Calibri"/>
+                <w:bCs/>
+                <w:i/>
+                <w:iCs/>
+                <w:color w:val="5B9BD5" w:themeColor="accent5"/>
+                <w:sz w:val="20"/>
+                <w:szCs w:val="20"/>
+              </w:rPr>
+              <w:t>Factores que han facilitado el desarrollo:</w:t>
+            </w:r>
+          </w:p>
+          <w:p>
+            <w:pPr>
+              <w:pStyle w:val="Prrafodelista"/>
+              <w:numPr>
+                <w:ilvl w:val="0"/>
+                <w:numId w:val="2"/>
+              </w:numPr>
+              <w:spacing w:line="240" w:lineRule="auto"/>
+              <w:jc w:val="both"/>
+              <w:rPr>
+                <w:rFonts w:ascii="Calibri" w:hAnsi="Calibri"/>
+                <w:bCs/>
+                <w:i/>
+                <w:iCs/>
+                <w:color w:val="5B9BD5" w:themeColor="accent5"/>
+                <w:sz w:val="20"/>
+                <w:szCs w:val="20"/>
+              </w:rPr>
+            </w:pPr>
+            <w:r>
+              <w:rPr>
+                <w:rFonts w:ascii="Calibri" w:hAnsi="Calibri"/>
+                <w:bCs/>
+                <w:i/>
+                <w:iCs/>
+                <w:color w:val="5B9BD5" w:themeColor="accent5"/>
+                <w:sz w:val="20"/>
+                <w:szCs w:val="20"/>
+              </w:rPr>
+              <w:t>La planificación inicial detallada permitió que cada miembro del equipo entendiera claramente su rol y responsabilidades.</w:t>
+            </w:r>
+          </w:p>
+          <w:p>
+            <w:pPr>
+              <w:pStyle w:val="Prrafodelista"/>
+              <w:numPr>
+                <w:ilvl w:val="0"/>
+                <w:numId w:val="2"/>
+              </w:numPr>
+              <w:spacing w:line="240" w:lineRule="auto"/>
+              <w:jc w:val="both"/>
+              <w:rPr>
+                <w:rFonts w:ascii="Calibri" w:hAnsi="Calibri"/>
+                <w:bCs/>
+                <w:i/>
+                <w:iCs/>
+                <w:color w:val="5B9BD5" w:themeColor="accent5"/>
+                <w:sz w:val="20"/>
+                <w:szCs w:val="20"/>
+              </w:rPr>
+            </w:pPr>
+            <w:r>
+              <w:rPr>
+                <w:rFonts w:ascii="Calibri" w:hAnsi="Calibri"/>
+                <w:bCs/>
+                <w:i/>
+                <w:iCs/>
+                <w:color w:val="5B9BD5" w:themeColor="accent5"/>
+                <w:sz w:val="20"/>
+                <w:szCs w:val="20"/>
+              </w:rPr>
+              <w:t>El uso de herramientas colaborativas como Google Docs, Discord</w:t>
+            </w:r>
+            <w:r>
+              <w:rPr>
+                <w:rFonts w:ascii="Calibri" w:hAnsi="Calibri"/>
+                <w:bCs/>
+                <w:i/>
+                <w:iCs/>
+                <w:color w:val="5B9BD5" w:themeColor="accent5"/>
+                <w:sz w:val="20"/>
+                <w:szCs w:val="20"/>
+              </w:rPr>
+              <w:t xml:space="preserve"> y</w:t>
+            </w:r>
+            <w:r>
+              <w:rPr>
+                <w:rFonts w:ascii="Calibri" w:hAnsi="Calibri"/>
+                <w:bCs/>
+                <w:i/>
+                <w:iCs/>
+                <w:color w:val="5B9BD5" w:themeColor="accent5"/>
+                <w:sz w:val="20"/>
+                <w:szCs w:val="20"/>
+              </w:rPr>
+              <w:t xml:space="preserve"> Jira</w:t>
+            </w:r>
+            <w:r>
+              <w:rPr>
+                <w:rFonts w:ascii="Calibri" w:hAnsi="Calibri"/>
+                <w:bCs/>
+                <w:i/>
+                <w:iCs/>
+                <w:color w:val="5B9BD5" w:themeColor="accent5"/>
+                <w:sz w:val="20"/>
+                <w:szCs w:val="20"/>
+              </w:rPr>
+              <w:t xml:space="preserve"> </w:t>
+            </w:r>
+            <w:r>
+              <w:rPr>
+                <w:rFonts w:ascii="Calibri" w:hAnsi="Calibri"/>
+                <w:bCs/>
+                <w:i/>
+                <w:iCs/>
+                <w:color w:val="5B9BD5" w:themeColor="accent5"/>
+                <w:sz w:val="20"/>
+                <w:szCs w:val="20"/>
+              </w:rPr>
+              <w:t>ha facilitado la comunicación y seguimiento de tareas.</w:t>
+            </w:r>
+          </w:p>
+          <w:p>
+            <w:pPr>
+              <w:pStyle w:val="Prrafodelista"/>
+              <w:numPr>
+                <w:ilvl w:val="0"/>
+                <w:numId w:val="2"/>
+              </w:numPr>
+              <w:spacing w:line="240" w:lineRule="auto"/>
+              <w:jc w:val="both"/>
+              <w:rPr>
+                <w:rFonts w:ascii="Calibri" w:hAnsi="Calibri"/>
+                <w:bCs/>
+                <w:i/>
+                <w:iCs/>
+                <w:color w:val="5B9BD5" w:themeColor="accent5"/>
+                <w:sz w:val="20"/>
+                <w:szCs w:val="20"/>
+              </w:rPr>
+            </w:pPr>
+            <w:r>
+              <w:rPr>
+                <w:rFonts w:ascii="Calibri" w:hAnsi="Calibri"/>
+                <w:bCs/>
+                <w:i/>
+                <w:iCs/>
+                <w:color w:val="5B9BD5" w:themeColor="accent5"/>
+                <w:sz w:val="20"/>
+                <w:szCs w:val="20"/>
+              </w:rPr>
+              <w:t>La metodología Kanban ha permitido visualizar el flujo de trabajo y priorizar tareas críticas.</w:t>
+            </w:r>
+          </w:p>
+          <w:p>
+            <w:pPr>
+              <w:spacing w:line="240" w:lineRule="auto"/>
+              <w:jc w:val="both"/>
+              <w:rPr>
+                <w:rFonts w:ascii="Calibri" w:hAnsi="Calibri"/>
+                <w:bCs/>
+                <w:i/>
+                <w:iCs/>
+                <w:color w:val="5B9BD5" w:themeColor="accent5"/>
+                <w:sz w:val="20"/>
+                <w:szCs w:val="20"/>
+              </w:rPr>
+            </w:pPr>
+            <w:r>
+              <w:rPr>
+                <w:rFonts w:ascii="Calibri" w:hAnsi="Calibri"/>
+                <w:bCs/>
+                <w:i/>
+                <w:iCs/>
+                <w:color w:val="5B9BD5" w:themeColor="accent5"/>
+                <w:sz w:val="20"/>
+                <w:szCs w:val="20"/>
+              </w:rPr>
+              <w:t>Factores que han dificultado el desarrollo:</w:t>
+            </w:r>
+          </w:p>
+          <w:p>
+            <w:pPr>
+              <w:pStyle w:val="Prrafodelista"/>
+              <w:numPr>
+                <w:ilvl w:val="0"/>
+                <w:numId w:val="3"/>
+              </w:numPr>
+              <w:spacing w:line="240" w:lineRule="auto"/>
+              <w:jc w:val="both"/>
+              <w:rPr>
+                <w:rFonts w:ascii="Calibri" w:hAnsi="Calibri"/>
+                <w:bCs/>
+                <w:i/>
+                <w:iCs/>
+                <w:color w:val="5B9BD5" w:themeColor="accent5"/>
+                <w:sz w:val="20"/>
+                <w:szCs w:val="20"/>
+              </w:rPr>
+            </w:pPr>
+            <w:r>
+              <w:rPr>
+                <w:rFonts w:ascii="Calibri" w:hAnsi="Calibri"/>
+                <w:bCs/>
+                <w:i/>
+                <w:iCs/>
+                <w:color w:val="5B9BD5" w:themeColor="accent5"/>
+                <w:sz w:val="20"/>
+                <w:szCs w:val="20"/>
+              </w:rPr>
+              <w:t>Coordinación de horarios para reuniones virtuales debido a disponibilidad de los integrantes.</w:t>
+            </w:r>
+          </w:p>
+          <w:p>
+            <w:pPr>
+              <w:spacing w:line="240" w:lineRule="auto"/>
+              <w:jc w:val="both"/>
+              <w:rPr>
+                <w:rFonts w:ascii="Calibri" w:hAnsi="Calibri"/>
+                <w:bCs/>
+                <w:i/>
+                <w:iCs/>
+                <w:color w:val="5B9BD5" w:themeColor="accent5"/>
+                <w:sz w:val="20"/>
+                <w:szCs w:val="20"/>
+              </w:rPr>
+            </w:pPr>
+            <w:r>
+              <w:rPr>
+                <w:rFonts w:ascii="Calibri" w:hAnsi="Calibri"/>
+                <w:bCs/>
+                <w:i/>
+                <w:iCs/>
+                <w:color w:val="5B9BD5" w:themeColor="accent5"/>
+                <w:sz w:val="20"/>
+                <w:szCs w:val="20"/>
+              </w:rPr>
+              <w:t>Acciones para superar los obstáculos:</w:t>
+            </w:r>
+          </w:p>
+          <w:p>
+            <w:pPr>
+              <w:pStyle w:val="Prrafodelista"/>
+              <w:numPr>
+                <w:ilvl w:val="0"/>
+                <w:numId w:val="4"/>
+              </w:numPr>
+              <w:spacing w:line="240" w:lineRule="auto"/>
+              <w:jc w:val="both"/>
+              <w:rPr>
+                <w:rFonts w:ascii="Calibri" w:hAnsi="Calibri"/>
+                <w:bCs/>
+                <w:i/>
+                <w:iCs/>
+                <w:color w:val="5B9BD5" w:themeColor="accent5"/>
+                <w:sz w:val="20"/>
+                <w:szCs w:val="20"/>
+              </w:rPr>
+            </w:pPr>
+            <w:r>
+              <w:rPr>
+                <w:rFonts w:ascii="Calibri" w:hAnsi="Calibri"/>
+                <w:bCs/>
+                <w:i/>
+                <w:iCs/>
+                <w:color w:val="5B9BD5" w:themeColor="accent5"/>
+                <w:sz w:val="20"/>
+                <w:szCs w:val="20"/>
+              </w:rPr>
+              <w:lastRenderedPageBreak/>
+              <w:t>Se han programado reuniones semanales fijas para asegurar seguimiento.</w:t>
+            </w:r>
           </w:p>
         </w:tc>
       </w:tr>
@@ -2753,7 +5420,6 @@
                 <w:rFonts w:ascii="Calibri" w:hAnsi="Calibri"/>
                 <w:color w:val="1F3864" w:themeColor="accent1" w:themeShade="80"/>
               </w:rPr>
-              <w:lastRenderedPageBreak/>
               <w:t xml:space="preserve">Actividades ajustadas o eliminadas: </w:t>
             </w:r>
             <w:r>
@@ -2882,6 +5548,18 @@
                 <w:lang w:eastAsia="es-CL"/>
               </w:rPr>
             </w:pPr>
+            <w:r>
+              <w:rPr>
+                <w:rFonts w:ascii="Calibri" w:hAnsi="Calibri" w:cs="Arial"/>
+                <w:i/>
+                <w:color w:val="548DD4"/>
+                <w:sz w:val="20"/>
+                <w:szCs w:val="20"/>
+                <w:highlight w:val="yellow"/>
+                <w:lang w:eastAsia="es-CL"/>
+              </w:rPr>
+              <w:t>Hasta ahora no se han eliminado actividades; se han realizado pequeños ajustes en el calendario de la carta Gantt para acomodar retrasos menores en la preparación del ambiente de desarrollo y reuniones.</w:t>
+            </w:r>
           </w:p>
           <w:p>
             <w:pPr>
@@ -3151,7 +5829,31 @@
                 <w:szCs w:val="20"/>
                 <w:lang w:eastAsia="es-CL"/>
               </w:rPr>
-              <w:t xml:space="preserve"> de acuerdo a tu planificación</w:t>
+              <w:t xml:space="preserve"> </w:t>
+            </w:r>
+            <w:proofErr w:type="gramStart"/>
+            <w:r>
+              <w:rPr>
+                <w:rFonts w:ascii="Calibri" w:hAnsi="Calibri" w:cs="Arial"/>
+                <w:i/>
+                <w:color w:val="548DD4"/>
+                <w:sz w:val="20"/>
+                <w:szCs w:val="20"/>
+                <w:lang w:eastAsia="es-CL"/>
+              </w:rPr>
+              <w:t>de acuerdo a</w:t>
+            </w:r>
+            <w:proofErr w:type="gramEnd"/>
+            <w:r>
+              <w:rPr>
+                <w:rFonts w:ascii="Calibri" w:hAnsi="Calibri" w:cs="Arial"/>
+                <w:i/>
+                <w:color w:val="548DD4"/>
+                <w:sz w:val="20"/>
+                <w:szCs w:val="20"/>
+                <w:lang w:eastAsia="es-CL"/>
+              </w:rPr>
+              <w:t xml:space="preserve"> tu planificación</w:t>
             </w:r>
             <w:r>
               <w:rPr>
@@ -3207,9 +5909,47 @@
                 <w:color w:val="548DD4"/>
                 <w:sz w:val="20"/>
                 <w:szCs w:val="20"/>
-                <w:lang w:eastAsia="es-CL"/>
-              </w:rPr>
-            </w:pPr>
+                <w:highlight w:val="yellow"/>
+                <w:lang w:eastAsia="es-CL"/>
+              </w:rPr>
+            </w:pPr>
+            <w:r>
+              <w:rPr>
+                <w:rFonts w:ascii="Calibri" w:hAnsi="Calibri" w:cs="Arial"/>
+                <w:i/>
+                <w:color w:val="548DD4"/>
+                <w:sz w:val="20"/>
+                <w:szCs w:val="20"/>
+                <w:highlight w:val="yellow"/>
+                <w:lang w:eastAsia="es-CL"/>
+              </w:rPr>
+              <w:t>Integración Frontend–Backend, pruebas unitarias y de usabilidad, despliegue en la nube, documentación final, capacitación y cierre aún no se han iniciado porque dependen de la finalización de los módulos principales de desarrollo.</w:t>
+            </w:r>
+          </w:p>
+          <w:p>
+            <w:pPr>
+              <w:jc w:val="both"/>
+              <w:rPr>
+                <w:rFonts w:ascii="Calibri" w:hAnsi="Calibri" w:cs="Arial"/>
+                <w:i/>
+                <w:color w:val="548DD4"/>
+                <w:sz w:val="20"/>
+                <w:szCs w:val="20"/>
+                <w:lang w:eastAsia="es-CL"/>
+              </w:rPr>
+            </w:pPr>
+            <w:r>
+              <w:rPr>
+                <w:rFonts w:ascii="Calibri" w:hAnsi="Calibri" w:cs="Arial"/>
+                <w:i/>
+                <w:color w:val="548DD4"/>
+                <w:sz w:val="20"/>
+                <w:szCs w:val="20"/>
+                <w:highlight w:val="yellow"/>
+                <w:lang w:eastAsia="es-CL"/>
+              </w:rPr>
+              <w:t>Estrategia para avanzar: priorizar el desarrollo completo de los módulos principales y luego pasar de manera secuencial a integración y pruebas, respetando la planificación original.</w:t>
+            </w:r>
           </w:p>
           <w:p>
             <w:pPr>
@@ -3311,7 +6051,7 @@
 </file>
 
 <file path=word/endnotes.xml><?xml version="1.0" encoding="utf-8"?>
-<w:endnotes xmlns:wpc="http://schemas.microsoft.com/office/word/2010/wordprocessingCanvas" xmlns:cx="http://schemas.microsoft.com/office/drawing/2014/chartex" xmlns:mc="http://schemas.openxmlformats.org/markup-compatibility/2006" xmlns:o="urn:schemas-microsoft-com:office:office" xmlns:r="http://schemas.openxmlformats.org/officeDocument/2006/relationships" xmlns:m="http://schemas.openxmlformats.org/officeDocument/2006/math" xmlns:v="urn:schemas-microsoft-com:vml" xmlns:wp14="http://schemas.microsoft.com/office/word/2010/wordprocessingDrawing" xmlns:wp="http://schemas.openxmlformats.org/drawingml/2006/wordprocessingDrawing" xmlns:w10="urn:schemas-microsoft-com:office:word" xmlns:w="http://schemas.openxmlformats.org/wordprocessingml/2006/main" xmlns:w14="http://schemas.microsoft.com/office/word/2010/wordml" xmlns:w15="http://schemas.microsoft.com/office/word/2012/wordml" xmlns:w16se="http://schemas.microsoft.com/office/word/2015/wordml/symex" xmlns:wpg="http://schemas.microsoft.com/office/word/2010/wordprocessingGroup" xmlns:wpi="http://schemas.microsoft.com/office/word/2010/wordprocessingInk" xmlns:wne="http://schemas.microsoft.com/office/word/2006/wordml" xmlns:wps="http://schemas.microsoft.com/office/word/2010/wordprocessingShape" mc:Ignorable="w14 w15 w16se wp14">
+<w:endnotes xmlns:wpc="http://schemas.microsoft.com/office/word/2010/wordprocessingCanvas" xmlns:cx="http://schemas.microsoft.com/office/drawing/2014/chartex" xmlns:cx1="http://schemas.microsoft.com/office/drawing/2015/9/8/chartex" xmlns:cx2="http://schemas.microsoft.com/office/drawing/2015/10/21/chartex" xmlns:cx3="http://schemas.microsoft.com/office/drawing/2016/5/9/chartex" xmlns:cx4="http://schemas.microsoft.com/office/drawing/2016/5/10/chartex" xmlns:cx5="http://schemas.microsoft.com/office/drawing/2016/5/11/chartex" xmlns:cx6="http://schemas.microsoft.com/office/drawing/2016/5/12/chartex" xmlns:cx7="http://schemas.microsoft.com/office/drawing/2016/5/13/chartex" xmlns:cx8="http://schemas.microsoft.com/office/drawing/2016/5/14/chartex" xmlns:mc="http://schemas.openxmlformats.org/markup-compatibility/2006" xmlns:aink="http://schemas.microsoft.com/office/drawing/2016/ink" xmlns:am3d="http://schemas.microsoft.com/office/drawing/2017/model3d" xmlns:o="urn:schemas-microsoft-com:office:office" xmlns:oel="http://schemas.microsoft.com/office/2019/extlst" xmlns:r="http://schemas.openxmlformats.org/officeDocument/2006/relationships" xmlns:m="http://schemas.openxmlformats.org/officeDocument/2006/math" xmlns:v="urn:schemas-microsoft-com:vml" xmlns:wp14="http://schemas.microsoft.com/office/word/2010/wordprocessingDrawing" xmlns:wp="http://schemas.openxmlformats.org/drawingml/2006/wordprocessingDrawing" xmlns:w10="urn:schemas-microsoft-com:office:word" xmlns:w="http://schemas.openxmlformats.org/wordprocessingml/2006/main" xmlns:w14="http://schemas.microsoft.com/office/word/2010/wordml" xmlns:w15="http://schemas.microsoft.com/office/word/2012/wordml" xmlns:w16cex="http://schemas.microsoft.com/office/word/2018/wordml/cex" xmlns:w16cid="http://schemas.microsoft.com/office/word/2016/wordml/cid" xmlns:w16="http://schemas.microsoft.com/office/word/2018/wordml" xmlns:w16du="http://schemas.microsoft.com/office/word/2023/wordml/word16du" xmlns:w16sdtdh="http://schemas.microsoft.com/office/word/2020/wordml/sdtdatahash" xmlns:w16sdtfl="http://schemas.microsoft.com/office/word/2024/wordml/sdtformatlock" xmlns:w16se="http://schemas.microsoft.com/office/word/2015/wordml/symex" xmlns:wpg="http://schemas.microsoft.com/office/word/2010/wordprocessingGroup" xmlns:wpi="http://schemas.microsoft.com/office/word/2010/wordprocessingInk" xmlns:wne="http://schemas.microsoft.com/office/word/2006/wordml" xmlns:wps="http://schemas.microsoft.com/office/word/2010/wordprocessingShape" mc:Ignorable="w14 w15 w16se w16cid w16 w16cex w16sdtdh w16sdtfl w16du wp14">
   <w:endnote w:type="separator" w:id="-1">
     <w:p>
       <w:pPr>
@@ -3336,7 +6076,7 @@
 </file>
 
 <file path=word/footnotes.xml><?xml version="1.0" encoding="utf-8"?>
-<w:footnotes xmlns:wpc="http://schemas.microsoft.com/office/word/2010/wordprocessingCanvas" xmlns:cx="http://schemas.microsoft.com/office/drawing/2014/chartex" xmlns:mc="http://schemas.openxmlformats.org/markup-compatibility/2006" xmlns:o="urn:schemas-microsoft-com:office:office" xmlns:r="http://schemas.openxmlformats.org/officeDocument/2006/relationships" xmlns:m="http://schemas.openxmlformats.org/officeDocument/2006/math" xmlns:v="urn:schemas-microsoft-com:vml" xmlns:wp14="http://schemas.microsoft.com/office/word/2010/wordprocessingDrawing" xmlns:wp="http://schemas.openxmlformats.org/drawingml/2006/wordprocessingDrawing" xmlns:w10="urn:schemas-microsoft-com:office:word" xmlns:w="http://schemas.openxmlformats.org/wordprocessingml/2006/main" xmlns:w14="http://schemas.microsoft.com/office/word/2010/wordml" xmlns:w15="http://schemas.microsoft.com/office/word/2012/wordml" xmlns:w16se="http://schemas.microsoft.com/office/word/2015/wordml/symex" xmlns:wpg="http://schemas.microsoft.com/office/word/2010/wordprocessingGroup" xmlns:wpi="http://schemas.microsoft.com/office/word/2010/wordprocessingInk" xmlns:wne="http://schemas.microsoft.com/office/word/2006/wordml" xmlns:wps="http://schemas.microsoft.com/office/word/2010/wordprocessingShape" mc:Ignorable="w14 w15 w16se wp14">
+<w:footnotes xmlns:wpc="http://schemas.microsoft.com/office/word/2010/wordprocessingCanvas" xmlns:cx="http://schemas.microsoft.com/office/drawing/2014/chartex" xmlns:cx1="http://schemas.microsoft.com/office/drawing/2015/9/8/chartex" xmlns:cx2="http://schemas.microsoft.com/office/drawing/2015/10/21/chartex" xmlns:cx3="http://schemas.microsoft.com/office/drawing/2016/5/9/chartex" xmlns:cx4="http://schemas.microsoft.com/office/drawing/2016/5/10/chartex" xmlns:cx5="http://schemas.microsoft.com/office/drawing/2016/5/11/chartex" xmlns:cx6="http://schemas.microsoft.com/office/drawing/2016/5/12/chartex" xmlns:cx7="http://schemas.microsoft.com/office/drawing/2016/5/13/chartex" xmlns:cx8="http://schemas.microsoft.com/office/drawing/2016/5/14/chartex" xmlns:mc="http://schemas.openxmlformats.org/markup-compatibility/2006" xmlns:aink="http://schemas.microsoft.com/office/drawing/2016/ink" xmlns:am3d="http://schemas.microsoft.com/office/drawing/2017/model3d" xmlns:o="urn:schemas-microsoft-com:office:office" xmlns:oel="http://schemas.microsoft.com/office/2019/extlst" xmlns:r="http://schemas.openxmlformats.org/officeDocument/2006/relationships" xmlns:m="http://schemas.openxmlformats.org/officeDocument/2006/math" xmlns:v="urn:schemas-microsoft-com:vml" xmlns:wp14="http://schemas.microsoft.com/office/word/2010/wordprocessingDrawing" xmlns:wp="http://schemas.openxmlformats.org/drawingml/2006/wordprocessingDrawing" xmlns:w10="urn:schemas-microsoft-com:office:word" xmlns:w="http://schemas.openxmlformats.org/wordprocessingml/2006/main" xmlns:w14="http://schemas.microsoft.com/office/word/2010/wordml" xmlns:w15="http://schemas.microsoft.com/office/word/2012/wordml" xmlns:w16cex="http://schemas.microsoft.com/office/word/2018/wordml/cex" xmlns:w16cid="http://schemas.microsoft.com/office/word/2016/wordml/cid" xmlns:w16="http://schemas.microsoft.com/office/word/2018/wordml" xmlns:w16du="http://schemas.microsoft.com/office/word/2023/wordml/word16du" xmlns:w16sdtdh="http://schemas.microsoft.com/office/word/2020/wordml/sdtdatahash" xmlns:w16sdtfl="http://schemas.microsoft.com/office/word/2024/wordml/sdtformatlock" xmlns:w16se="http://schemas.microsoft.com/office/word/2015/wordml/symex" xmlns:wpg="http://schemas.microsoft.com/office/word/2010/wordprocessingGroup" xmlns:wpi="http://schemas.microsoft.com/office/word/2010/wordprocessingInk" xmlns:wne="http://schemas.microsoft.com/office/word/2006/wordml" xmlns:wps="http://schemas.microsoft.com/office/word/2010/wordprocessingShape" mc:Ignorable="w14 w15 w16se w16cid w16 w16cex w16sdtdh w16sdtfl w16du wp14">
   <w:footnote w:type="separator" w:id="-1">
     <w:p>
       <w:pPr>
@@ -3419,7 +6159,7 @@
 </file>
 
 <file path=word/header1.xml><?xml version="1.0" encoding="utf-8"?>
-<w:hdr xmlns:wpc="http://schemas.microsoft.com/office/word/2010/wordprocessingCanvas" xmlns:cx="http://schemas.microsoft.com/office/drawing/2014/chartex" xmlns:mc="http://schemas.openxmlformats.org/markup-compatibility/2006" xmlns:o="urn:schemas-microsoft-com:office:office" xmlns:r="http://schemas.openxmlformats.org/officeDocument/2006/relationships" xmlns:m="http://schemas.openxmlformats.org/officeDocument/2006/math" xmlns:v="urn:schemas-microsoft-com:vml" xmlns:wp14="http://schemas.microsoft.com/office/word/2010/wordprocessingDrawing" xmlns:wp="http://schemas.openxmlformats.org/drawingml/2006/wordprocessingDrawing" xmlns:w10="urn:schemas-microsoft-com:office:word" xmlns:w="http://schemas.openxmlformats.org/wordprocessingml/2006/main" xmlns:w14="http://schemas.microsoft.com/office/word/2010/wordml" xmlns:w15="http://schemas.microsoft.com/office/word/2012/wordml" xmlns:w16se="http://schemas.microsoft.com/office/word/2015/wordml/symex" xmlns:wpg="http://schemas.microsoft.com/office/word/2010/wordprocessingGroup" xmlns:wpi="http://schemas.microsoft.com/office/word/2010/wordprocessingInk" xmlns:wne="http://schemas.microsoft.com/office/word/2006/wordml" xmlns:wps="http://schemas.microsoft.com/office/word/2010/wordprocessingShape" mc:Ignorable="w14 w15 w16se wp14">
+<w:hdr xmlns:wpc="http://schemas.microsoft.com/office/word/2010/wordprocessingCanvas" xmlns:cx="http://schemas.microsoft.com/office/drawing/2014/chartex" xmlns:cx1="http://schemas.microsoft.com/office/drawing/2015/9/8/chartex" xmlns:cx2="http://schemas.microsoft.com/office/drawing/2015/10/21/chartex" xmlns:cx3="http://schemas.microsoft.com/office/drawing/2016/5/9/chartex" xmlns:cx4="http://schemas.microsoft.com/office/drawing/2016/5/10/chartex" xmlns:cx5="http://schemas.microsoft.com/office/drawing/2016/5/11/chartex" xmlns:cx6="http://schemas.microsoft.com/office/drawing/2016/5/12/chartex" xmlns:cx7="http://schemas.microsoft.com/office/drawing/2016/5/13/chartex" xmlns:cx8="http://schemas.microsoft.com/office/drawing/2016/5/14/chartex" xmlns:mc="http://schemas.openxmlformats.org/markup-compatibility/2006" xmlns:aink="http://schemas.microsoft.com/office/drawing/2016/ink" xmlns:am3d="http://schemas.microsoft.com/office/drawing/2017/model3d" xmlns:o="urn:schemas-microsoft-com:office:office" xmlns:oel="http://schemas.microsoft.com/office/2019/extlst" xmlns:r="http://schemas.openxmlformats.org/officeDocument/2006/relationships" xmlns:m="http://schemas.openxmlformats.org/officeDocument/2006/math" xmlns:v="urn:schemas-microsoft-com:vml" xmlns:wp14="http://schemas.microsoft.com/office/word/2010/wordprocessingDrawing" xmlns:wp="http://schemas.openxmlformats.org/drawingml/2006/wordprocessingDrawing" xmlns:w10="urn:schemas-microsoft-com:office:word" xmlns:w="http://schemas.openxmlformats.org/wordprocessingml/2006/main" xmlns:w14="http://schemas.microsoft.com/office/word/2010/wordml" xmlns:w15="http://schemas.microsoft.com/office/word/2012/wordml" xmlns:w16cex="http://schemas.microsoft.com/office/word/2018/wordml/cex" xmlns:w16cid="http://schemas.microsoft.com/office/word/2016/wordml/cid" xmlns:w16="http://schemas.microsoft.com/office/word/2018/wordml" xmlns:w16du="http://schemas.microsoft.com/office/word/2023/wordml/word16du" xmlns:w16sdtdh="http://schemas.microsoft.com/office/word/2020/wordml/sdtdatahash" xmlns:w16sdtfl="http://schemas.microsoft.com/office/word/2024/wordml/sdtformatlock" xmlns:w16se="http://schemas.microsoft.com/office/word/2015/wordml/symex" xmlns:wpg="http://schemas.microsoft.com/office/word/2010/wordprocessingGroup" xmlns:wpi="http://schemas.microsoft.com/office/word/2010/wordprocessingInk" xmlns:wne="http://schemas.microsoft.com/office/word/2006/wordml" xmlns:wps="http://schemas.microsoft.com/office/word/2010/wordprocessingShape" mc:Ignorable="w14 w15 w16se w16cid w16 w16cex w16sdtdh w16sdtfl w16du wp14">
   <w:tbl>
     <w:tblPr>
       <w:tblStyle w:val="Tablaconcuadrcula1"/>
@@ -3644,8 +6384,234 @@
 </file>
 
 <file path=word/numbering.xml><?xml version="1.0" encoding="utf-8"?>
-<w:numbering xmlns:wpc="http://schemas.microsoft.com/office/word/2010/wordprocessingCanvas" xmlns:cx="http://schemas.microsoft.com/office/drawing/2014/chartex" xmlns:mc="http://schemas.openxmlformats.org/markup-compatibility/2006" xmlns:o="urn:schemas-microsoft-com:office:office" xmlns:r="http://schemas.openxmlformats.org/officeDocument/2006/relationships" xmlns:m="http://schemas.openxmlformats.org/officeDocument/2006/math" xmlns:v="urn:schemas-microsoft-com:vml" xmlns:wp14="http://schemas.microsoft.com/office/word/2010/wordprocessingDrawing" xmlns:wp="http://schemas.openxmlformats.org/drawingml/2006/wordprocessingDrawing" xmlns:w10="urn:schemas-microsoft-com:office:word" xmlns:w="http://schemas.openxmlformats.org/wordprocessingml/2006/main" xmlns:w14="http://schemas.microsoft.com/office/word/2010/wordml" xmlns:w15="http://schemas.microsoft.com/office/word/2012/wordml" xmlns:w16se="http://schemas.microsoft.com/office/word/2015/wordml/symex" xmlns:wpg="http://schemas.microsoft.com/office/word/2010/wordprocessingGroup" xmlns:wpi="http://schemas.microsoft.com/office/word/2010/wordprocessingInk" xmlns:wne="http://schemas.microsoft.com/office/word/2006/wordml" xmlns:wps="http://schemas.microsoft.com/office/word/2010/wordprocessingShape" mc:Ignorable="w14 w15 w16se wp14">
+<w:numbering xmlns:wpc="http://schemas.microsoft.com/office/word/2010/wordprocessingCanvas" xmlns:cx="http://schemas.microsoft.com/office/drawing/2014/chartex" xmlns:cx1="http://schemas.microsoft.com/office/drawing/2015/9/8/chartex" xmlns:cx2="http://schemas.microsoft.com/office/drawing/2015/10/21/chartex" xmlns:cx3="http://schemas.microsoft.com/office/drawing/2016/5/9/chartex" xmlns:cx4="http://schemas.microsoft.com/office/drawing/2016/5/10/chartex" xmlns:cx5="http://schemas.microsoft.com/office/drawing/2016/5/11/chartex" xmlns:cx6="http://schemas.microsoft.com/office/drawing/2016/5/12/chartex" xmlns:cx7="http://schemas.microsoft.com/office/drawing/2016/5/13/chartex" xmlns:cx8="http://schemas.microsoft.com/office/drawing/2016/5/14/chartex" xmlns:mc="http://schemas.openxmlformats.org/markup-compatibility/2006" xmlns:aink="http://schemas.microsoft.com/office/drawing/2016/ink" xmlns:am3d="http://schemas.microsoft.com/office/drawing/2017/model3d" xmlns:o="urn:schemas-microsoft-com:office:office" xmlns:oel="http://schemas.microsoft.com/office/2019/extlst" xmlns:r="http://schemas.openxmlformats.org/officeDocument/2006/relationships" xmlns:m="http://schemas.openxmlformats.org/officeDocument/2006/math" xmlns:v="urn:schemas-microsoft-com:vml" xmlns:wp14="http://schemas.microsoft.com/office/word/2010/wordprocessingDrawing" xmlns:wp="http://schemas.openxmlformats.org/drawingml/2006/wordprocessingDrawing" xmlns:w10="urn:schemas-microsoft-com:office:word" xmlns:w="http://schemas.openxmlformats.org/wordprocessingml/2006/main" xmlns:w14="http://schemas.microsoft.com/office/word/2010/wordml" xmlns:w15="http://schemas.microsoft.com/office/word/2012/wordml" xmlns:w16cex="http://schemas.microsoft.com/office/word/2018/wordml/cex" xmlns:w16cid="http://schemas.microsoft.com/office/word/2016/wordml/cid" xmlns:w16="http://schemas.microsoft.com/office/word/2018/wordml" xmlns:w16du="http://schemas.microsoft.com/office/word/2023/wordml/word16du" xmlns:w16sdtdh="http://schemas.microsoft.com/office/word/2020/wordml/sdtdatahash" xmlns:w16sdtfl="http://schemas.microsoft.com/office/word/2024/wordml/sdtformatlock" xmlns:w16se="http://schemas.microsoft.com/office/word/2015/wordml/symex" xmlns:wpg="http://schemas.microsoft.com/office/word/2010/wordprocessingGroup" xmlns:wpi="http://schemas.microsoft.com/office/word/2010/wordprocessingInk" xmlns:wne="http://schemas.microsoft.com/office/word/2006/wordml" xmlns:wps="http://schemas.microsoft.com/office/word/2010/wordprocessingShape" mc:Ignorable="w14 w15 w16se w16cid w16 w16cex w16sdtdh w16sdtfl w16du wp14">
   <w:abstractNum w:abstractNumId="0" w15:restartNumberingAfterBreak="0">
+    <w:nsid w:val="18A81D37"/>
+    <w:multiLevelType w:val="hybridMultilevel"/>
+    <w:tmpl w:val="FDFAF032"/>
+    <w:lvl w:ilvl="0" w:tplc="340A0001">
+      <w:start w:val="1"/>
+      <w:numFmt w:val="bullet"/>
+      <w:lvlText w:val=""/>
+      <w:lvlJc w:val="left"/>
+      <w:pPr>
+        <w:ind w:left="720" w:hanging="360"/>
+      </w:pPr>
+      <w:rPr>
+        <w:rFonts w:ascii="Symbol" w:hAnsi="Symbol" w:hint="default"/>
+      </w:rPr>
+    </w:lvl>
+    <w:lvl w:ilvl="1" w:tplc="340A0003" w:tentative="1">
+      <w:start w:val="1"/>
+      <w:numFmt w:val="bullet"/>
+      <w:lvlText w:val="o"/>
+      <w:lvlJc w:val="left"/>
+      <w:pPr>
+        <w:ind w:left="1440" w:hanging="360"/>
+      </w:pPr>
+      <w:rPr>
+        <w:rFonts w:ascii="Courier New" w:hAnsi="Courier New" w:cs="Courier New" w:hint="default"/>
+      </w:rPr>
+    </w:lvl>
+    <w:lvl w:ilvl="2" w:tplc="340A0005" w:tentative="1">
+      <w:start w:val="1"/>
+      <w:numFmt w:val="bullet"/>
+      <w:lvlText w:val=""/>
+      <w:lvlJc w:val="left"/>
+      <w:pPr>
+        <w:ind w:left="2160" w:hanging="360"/>
+      </w:pPr>
+      <w:rPr>
+        <w:rFonts w:ascii="Wingdings" w:hAnsi="Wingdings" w:hint="default"/>
+      </w:rPr>
+    </w:lvl>
+    <w:lvl w:ilvl="3" w:tplc="340A0001" w:tentative="1">
+      <w:start w:val="1"/>
+      <w:numFmt w:val="bullet"/>
+      <w:lvlText w:val=""/>
+      <w:lvlJc w:val="left"/>
+      <w:pPr>
+        <w:ind w:left="2880" w:hanging="360"/>
+      </w:pPr>
+      <w:rPr>
+        <w:rFonts w:ascii="Symbol" w:hAnsi="Symbol" w:hint="default"/>
+      </w:rPr>
+    </w:lvl>
+    <w:lvl w:ilvl="4" w:tplc="340A0003" w:tentative="1">
+      <w:start w:val="1"/>
+      <w:numFmt w:val="bullet"/>
+      <w:lvlText w:val="o"/>
+      <w:lvlJc w:val="left"/>
+      <w:pPr>
+        <w:ind w:left="3600" w:hanging="360"/>
+      </w:pPr>
+      <w:rPr>
+        <w:rFonts w:ascii="Courier New" w:hAnsi="Courier New" w:cs="Courier New" w:hint="default"/>
+      </w:rPr>
+    </w:lvl>
+    <w:lvl w:ilvl="5" w:tplc="340A0005" w:tentative="1">
+      <w:start w:val="1"/>
+      <w:numFmt w:val="bullet"/>
+      <w:lvlText w:val=""/>
+      <w:lvlJc w:val="left"/>
+      <w:pPr>
+        <w:ind w:left="4320" w:hanging="360"/>
+      </w:pPr>
+      <w:rPr>
+        <w:rFonts w:ascii="Wingdings" w:hAnsi="Wingdings" w:hint="default"/>
+      </w:rPr>
+    </w:lvl>
+    <w:lvl w:ilvl="6" w:tplc="340A0001" w:tentative="1">
+      <w:start w:val="1"/>
+      <w:numFmt w:val="bullet"/>
+      <w:lvlText w:val=""/>
+      <w:lvlJc w:val="left"/>
+      <w:pPr>
+        <w:ind w:left="5040" w:hanging="360"/>
+      </w:pPr>
+      <w:rPr>
+        <w:rFonts w:ascii="Symbol" w:hAnsi="Symbol" w:hint="default"/>
+      </w:rPr>
+    </w:lvl>
+    <w:lvl w:ilvl="7" w:tplc="340A0003" w:tentative="1">
+      <w:start w:val="1"/>
+      <w:numFmt w:val="bullet"/>
+      <w:lvlText w:val="o"/>
+      <w:lvlJc w:val="left"/>
+      <w:pPr>
+        <w:ind w:left="5760" w:hanging="360"/>
+      </w:pPr>
+      <w:rPr>
+        <w:rFonts w:ascii="Courier New" w:hAnsi="Courier New" w:cs="Courier New" w:hint="default"/>
+      </w:rPr>
+    </w:lvl>
+    <w:lvl w:ilvl="8" w:tplc="340A0005" w:tentative="1">
+      <w:start w:val="1"/>
+      <w:numFmt w:val="bullet"/>
+      <w:lvlText w:val=""/>
+      <w:lvlJc w:val="left"/>
+      <w:pPr>
+        <w:ind w:left="6480" w:hanging="360"/>
+      </w:pPr>
+      <w:rPr>
+        <w:rFonts w:ascii="Wingdings" w:hAnsi="Wingdings" w:hint="default"/>
+      </w:rPr>
+    </w:lvl>
+  </w:abstractNum>
+  <w:abstractNum w:abstractNumId="1" w15:restartNumberingAfterBreak="0">
+    <w:nsid w:val="23BF1E32"/>
+    <w:multiLevelType w:val="hybridMultilevel"/>
+    <w:tmpl w:val="204A0B6E"/>
+    <w:lvl w:ilvl="0" w:tplc="340A0001">
+      <w:start w:val="1"/>
+      <w:numFmt w:val="bullet"/>
+      <w:lvlText w:val=""/>
+      <w:lvlJc w:val="left"/>
+      <w:pPr>
+        <w:ind w:left="720" w:hanging="360"/>
+      </w:pPr>
+      <w:rPr>
+        <w:rFonts w:ascii="Symbol" w:hAnsi="Symbol" w:hint="default"/>
+      </w:rPr>
+    </w:lvl>
+    <w:lvl w:ilvl="1" w:tplc="340A0003" w:tentative="1">
+      <w:start w:val="1"/>
+      <w:numFmt w:val="bullet"/>
+      <w:lvlText w:val="o"/>
+      <w:lvlJc w:val="left"/>
+      <w:pPr>
+        <w:ind w:left="1440" w:hanging="360"/>
+      </w:pPr>
+      <w:rPr>
+        <w:rFonts w:ascii="Courier New" w:hAnsi="Courier New" w:cs="Courier New" w:hint="default"/>
+      </w:rPr>
+    </w:lvl>
+    <w:lvl w:ilvl="2" w:tplc="340A0005" w:tentative="1">
+      <w:start w:val="1"/>
+      <w:numFmt w:val="bullet"/>
+      <w:lvlText w:val=""/>
+      <w:lvlJc w:val="left"/>
+      <w:pPr>
+        <w:ind w:left="2160" w:hanging="360"/>
+      </w:pPr>
+      <w:rPr>
+        <w:rFonts w:ascii="Wingdings" w:hAnsi="Wingdings" w:hint="default"/>
+      </w:rPr>
+    </w:lvl>
+    <w:lvl w:ilvl="3" w:tplc="340A0001" w:tentative="1">
+      <w:start w:val="1"/>
+      <w:numFmt w:val="bullet"/>
+      <w:lvlText w:val=""/>
+      <w:lvlJc w:val="left"/>
+      <w:pPr>
+        <w:ind w:left="2880" w:hanging="360"/>
+      </w:pPr>
+      <w:rPr>
+        <w:rFonts w:ascii="Symbol" w:hAnsi="Symbol" w:hint="default"/>
+      </w:rPr>
+    </w:lvl>
+    <w:lvl w:ilvl="4" w:tplc="340A0003" w:tentative="1">
+      <w:start w:val="1"/>
+      <w:numFmt w:val="bullet"/>
+      <w:lvlText w:val="o"/>
+      <w:lvlJc w:val="left"/>
+      <w:pPr>
+        <w:ind w:left="3600" w:hanging="360"/>
+      </w:pPr>
+      <w:rPr>
+        <w:rFonts w:ascii="Courier New" w:hAnsi="Courier New" w:cs="Courier New" w:hint="default"/>
+      </w:rPr>
+    </w:lvl>
+    <w:lvl w:ilvl="5" w:tplc="340A0005" w:tentative="1">
+      <w:start w:val="1"/>
+      <w:numFmt w:val="bullet"/>
+      <w:lvlText w:val=""/>
+      <w:lvlJc w:val="left"/>
+      <w:pPr>
+        <w:ind w:left="4320" w:hanging="360"/>
+      </w:pPr>
+      <w:rPr>
+        <w:rFonts w:ascii="Wingdings" w:hAnsi="Wingdings" w:hint="default"/>
+      </w:rPr>
+    </w:lvl>
+    <w:lvl w:ilvl="6" w:tplc="340A0001" w:tentative="1">
+      <w:start w:val="1"/>
+      <w:numFmt w:val="bullet"/>
+      <w:lvlText w:val=""/>
+      <w:lvlJc w:val="left"/>
+      <w:pPr>
+        <w:ind w:left="5040" w:hanging="360"/>
+      </w:pPr>
+      <w:rPr>
+        <w:rFonts w:ascii="Symbol" w:hAnsi="Symbol" w:hint="default"/>
+      </w:rPr>
+    </w:lvl>
+    <w:lvl w:ilvl="7" w:tplc="340A0003" w:tentative="1">
+      <w:start w:val="1"/>
+      <w:numFmt w:val="bullet"/>
+      <w:lvlText w:val="o"/>
+      <w:lvlJc w:val="left"/>
+      <w:pPr>
+        <w:ind w:left="5760" w:hanging="360"/>
+      </w:pPr>
+      <w:rPr>
+        <w:rFonts w:ascii="Courier New" w:hAnsi="Courier New" w:cs="Courier New" w:hint="default"/>
+      </w:rPr>
+    </w:lvl>
+    <w:lvl w:ilvl="8" w:tplc="340A0005" w:tentative="1">
+      <w:start w:val="1"/>
+      <w:numFmt w:val="bullet"/>
+      <w:lvlText w:val=""/>
+      <w:lvlJc w:val="left"/>
+      <w:pPr>
+        <w:ind w:left="6480" w:hanging="360"/>
+      </w:pPr>
+      <w:rPr>
+        <w:rFonts w:ascii="Wingdings" w:hAnsi="Wingdings" w:hint="default"/>
+      </w:rPr>
+    </w:lvl>
+  </w:abstractNum>
+  <w:abstractNum w:abstractNumId="2" w15:restartNumberingAfterBreak="0">
     <w:nsid w:val="2FFD4C7F"/>
     <w:multiLevelType w:val="multilevel"/>
     <w:tmpl w:val="CAF0F936"/>
@@ -3766,14 +6732,136 @@
       </w:rPr>
     </w:lvl>
   </w:abstractNum>
-  <w:num w:numId="1">
+  <w:abstractNum w:abstractNumId="3" w15:restartNumberingAfterBreak="0">
+    <w:nsid w:val="65664D0F"/>
+    <w:multiLevelType w:val="hybridMultilevel"/>
+    <w:tmpl w:val="073008F4"/>
+    <w:lvl w:ilvl="0" w:tplc="340A0001">
+      <w:start w:val="1"/>
+      <w:numFmt w:val="bullet"/>
+      <w:lvlText w:val=""/>
+      <w:lvlJc w:val="left"/>
+      <w:pPr>
+        <w:ind w:left="720" w:hanging="360"/>
+      </w:pPr>
+      <w:rPr>
+        <w:rFonts w:ascii="Symbol" w:hAnsi="Symbol" w:hint="default"/>
+      </w:rPr>
+    </w:lvl>
+    <w:lvl w:ilvl="1" w:tplc="340A0003" w:tentative="1">
+      <w:start w:val="1"/>
+      <w:numFmt w:val="bullet"/>
+      <w:lvlText w:val="o"/>
+      <w:lvlJc w:val="left"/>
+      <w:pPr>
+        <w:ind w:left="1440" w:hanging="360"/>
+      </w:pPr>
+      <w:rPr>
+        <w:rFonts w:ascii="Courier New" w:hAnsi="Courier New" w:cs="Courier New" w:hint="default"/>
+      </w:rPr>
+    </w:lvl>
+    <w:lvl w:ilvl="2" w:tplc="340A0005" w:tentative="1">
+      <w:start w:val="1"/>
+      <w:numFmt w:val="bullet"/>
+      <w:lvlText w:val=""/>
+      <w:lvlJc w:val="left"/>
+      <w:pPr>
+        <w:ind w:left="2160" w:hanging="360"/>
+      </w:pPr>
+      <w:rPr>
+        <w:rFonts w:ascii="Wingdings" w:hAnsi="Wingdings" w:hint="default"/>
+      </w:rPr>
+    </w:lvl>
+    <w:lvl w:ilvl="3" w:tplc="340A0001" w:tentative="1">
+      <w:start w:val="1"/>
+      <w:numFmt w:val="bullet"/>
+      <w:lvlText w:val=""/>
+      <w:lvlJc w:val="left"/>
+      <w:pPr>
+        <w:ind w:left="2880" w:hanging="360"/>
+      </w:pPr>
+      <w:rPr>
+        <w:rFonts w:ascii="Symbol" w:hAnsi="Symbol" w:hint="default"/>
+      </w:rPr>
+    </w:lvl>
+    <w:lvl w:ilvl="4" w:tplc="340A0003" w:tentative="1">
+      <w:start w:val="1"/>
+      <w:numFmt w:val="bullet"/>
+      <w:lvlText w:val="o"/>
+      <w:lvlJc w:val="left"/>
+      <w:pPr>
+        <w:ind w:left="3600" w:hanging="360"/>
+      </w:pPr>
+      <w:rPr>
+        <w:rFonts w:ascii="Courier New" w:hAnsi="Courier New" w:cs="Courier New" w:hint="default"/>
+      </w:rPr>
+    </w:lvl>
+    <w:lvl w:ilvl="5" w:tplc="340A0005" w:tentative="1">
+      <w:start w:val="1"/>
+      <w:numFmt w:val="bullet"/>
+      <w:lvlText w:val=""/>
+      <w:lvlJc w:val="left"/>
+      <w:pPr>
+        <w:ind w:left="4320" w:hanging="360"/>
+      </w:pPr>
+      <w:rPr>
+        <w:rFonts w:ascii="Wingdings" w:hAnsi="Wingdings" w:hint="default"/>
+      </w:rPr>
+    </w:lvl>
+    <w:lvl w:ilvl="6" w:tplc="340A0001" w:tentative="1">
+      <w:start w:val="1"/>
+      <w:numFmt w:val="bullet"/>
+      <w:lvlText w:val=""/>
+      <w:lvlJc w:val="left"/>
+      <w:pPr>
+        <w:ind w:left="5040" w:hanging="360"/>
+      </w:pPr>
+      <w:rPr>
+        <w:rFonts w:ascii="Symbol" w:hAnsi="Symbol" w:hint="default"/>
+      </w:rPr>
+    </w:lvl>
+    <w:lvl w:ilvl="7" w:tplc="340A0003" w:tentative="1">
+      <w:start w:val="1"/>
+      <w:numFmt w:val="bullet"/>
+      <w:lvlText w:val="o"/>
+      <w:lvlJc w:val="left"/>
+      <w:pPr>
+        <w:ind w:left="5760" w:hanging="360"/>
+      </w:pPr>
+      <w:rPr>
+        <w:rFonts w:ascii="Courier New" w:hAnsi="Courier New" w:cs="Courier New" w:hint="default"/>
+      </w:rPr>
+    </w:lvl>
+    <w:lvl w:ilvl="8" w:tplc="340A0005" w:tentative="1">
+      <w:start w:val="1"/>
+      <w:numFmt w:val="bullet"/>
+      <w:lvlText w:val=""/>
+      <w:lvlJc w:val="left"/>
+      <w:pPr>
+        <w:ind w:left="6480" w:hanging="360"/>
+      </w:pPr>
+      <w:rPr>
+        <w:rFonts w:ascii="Wingdings" w:hAnsi="Wingdings" w:hint="default"/>
+      </w:rPr>
+    </w:lvl>
+  </w:abstractNum>
+  <w:num w:numId="1" w16cid:durableId="13001806">
+    <w:abstractNumId w:val="2"/>
+  </w:num>
+  <w:num w:numId="2" w16cid:durableId="96753391">
+    <w:abstractNumId w:val="3"/>
+  </w:num>
+  <w:num w:numId="3" w16cid:durableId="1391264457">
     <w:abstractNumId w:val="0"/>
+  </w:num>
+  <w:num w:numId="4" w16cid:durableId="1295989604">
+    <w:abstractNumId w:val="1"/>
   </w:num>
 </w:numbering>
 </file>
 
 <file path=word/styles.xml><?xml version="1.0" encoding="utf-8"?>
-<w:styles xmlns:mc="http://schemas.openxmlformats.org/markup-compatibility/2006" xmlns:r="http://schemas.openxmlformats.org/officeDocument/2006/relationships" xmlns:w="http://schemas.openxmlformats.org/wordprocessingml/2006/main" xmlns:w14="http://schemas.microsoft.com/office/word/2010/wordml" xmlns:w15="http://schemas.microsoft.com/office/word/2012/wordml" xmlns:w16se="http://schemas.microsoft.com/office/word/2015/wordml/symex" mc:Ignorable="w14 w15 w16se">
+<w:styles xmlns:mc="http://schemas.openxmlformats.org/markup-compatibility/2006" xmlns:r="http://schemas.openxmlformats.org/officeDocument/2006/relationships" xmlns:w="http://schemas.openxmlformats.org/wordprocessingml/2006/main" xmlns:w14="http://schemas.microsoft.com/office/word/2010/wordml" xmlns:w15="http://schemas.microsoft.com/office/word/2012/wordml" xmlns:w16cex="http://schemas.microsoft.com/office/word/2018/wordml/cex" xmlns:w16cid="http://schemas.microsoft.com/office/word/2016/wordml/cid" xmlns:w16="http://schemas.microsoft.com/office/word/2018/wordml" xmlns:w16du="http://schemas.microsoft.com/office/word/2023/wordml/word16du" xmlns:w16sdtdh="http://schemas.microsoft.com/office/word/2020/wordml/sdtdatahash" xmlns:w16sdtfl="http://schemas.microsoft.com/office/word/2024/wordml/sdtformatlock" xmlns:w16se="http://schemas.microsoft.com/office/word/2015/wordml/symex" mc:Ignorable="w14 w15 w16se w16cid w16 w16cex w16sdtdh w16sdtfl w16du">
   <w:docDefaults>
     <w:rPrDefault>
       <w:rPr>
@@ -3785,7 +6873,7 @@
     </w:rPrDefault>
     <w:pPrDefault/>
   </w:docDefaults>
-  <w:latentStyles w:defLockedState="0" w:defUIPriority="99" w:defSemiHidden="0" w:defUnhideWhenUsed="0" w:defQFormat="0" w:count="371">
+  <w:latentStyles w:defLockedState="0" w:defUIPriority="99" w:defSemiHidden="0" w:defUnhideWhenUsed="0" w:defQFormat="0" w:count="376">
     <w:lsdException w:name="Normal" w:uiPriority="0" w:qFormat="1"/>
     <w:lsdException w:name="heading 1" w:uiPriority="9" w:qFormat="1"/>
     <w:lsdException w:name="heading 2" w:semiHidden="1" w:uiPriority="9" w:unhideWhenUsed="1" w:qFormat="1"/>
@@ -4157,6 +7245,11 @@
     <w:lsdException w:name="List Table 5 Dark Accent 6" w:uiPriority="50"/>
     <w:lsdException w:name="List Table 6 Colorful Accent 6" w:uiPriority="51"/>
     <w:lsdException w:name="List Table 7 Colorful Accent 6" w:uiPriority="52"/>
+    <w:lsdException w:name="Mention" w:semiHidden="1" w:unhideWhenUsed="1"/>
+    <w:lsdException w:name="Smart Hyperlink" w:semiHidden="1" w:unhideWhenUsed="1"/>
+    <w:lsdException w:name="Hashtag" w:semiHidden="1" w:unhideWhenUsed="1"/>
+    <w:lsdException w:name="Unresolved Mention" w:semiHidden="1" w:unhideWhenUsed="1"/>
+    <w:lsdException w:name="Smart Link" w:semiHidden="1" w:unhideWhenUsed="1"/>
   </w:latentStyles>
   <w:style w:type="paragraph" w:default="1" w:styleId="Normal">
     <w:name w:val="Normal"/>
@@ -4195,7 +7288,6 @@
   <w:style w:type="character" w:default="1" w:styleId="Fuentedeprrafopredeter">
     <w:name w:val="Default Paragraph Font"/>
     <w:uiPriority w:val="1"/>
-    <w:semiHidden/>
     <w:unhideWhenUsed/>
   </w:style>
   <w:style w:type="table" w:default="1" w:styleId="Tablanormal">
@@ -4459,6 +7551,17 @@
       <w:sz w:val="20"/>
       <w:szCs w:val="20"/>
     </w:rPr>
+  </w:style>
+  <w:style w:type="paragraph" w:styleId="Prrafodelista">
+    <w:name w:val="List Paragraph"/>
+    <w:basedOn w:val="Normal"/>
+    <w:uiPriority w:val="34"/>
+    <w:qFormat/>
+    <w:rsid w:val="007C786C"/>
+    <w:pPr>
+      <w:ind w:left="720"/>
+      <w:contextualSpacing/>
+    </w:pPr>
   </w:style>
 </w:styles>
 </file>
@@ -4759,9 +7862,12 @@
 </file>
 
 <file path=customXml/item1.xml><?xml version="1.0" encoding="utf-8"?>
-<p:properties xmlns:p="http://schemas.microsoft.com/office/2006/metadata/properties" xmlns:xsi="http://www.w3.org/2001/XMLSchema-instance" xmlns:pc="http://schemas.microsoft.com/office/infopath/2007/PartnerControls">
-  <documentManagement/>
-</p:properties>
+<?mso-contentType ?>
+<FormTemplates xmlns="http://schemas.microsoft.com/sharepoint/v3/contenttype/forms">
+  <Display>DocumentLibraryForm</Display>
+  <Edit>DocumentLibraryForm</Edit>
+  <New>DocumentLibraryForm</New>
+</FormTemplates>
 </file>
 
 <file path=customXml/item2.xml><?xml version="1.0" encoding="utf-8"?>
@@ -4897,26 +8003,15 @@
 </file>
 
 <file path=customXml/item3.xml><?xml version="1.0" encoding="utf-8"?>
-<?mso-contentType ?>
-<FormTemplates xmlns="http://schemas.microsoft.com/sharepoint/v3/contenttype/forms">
-  <Display>DocumentLibraryForm</Display>
-  <Edit>DocumentLibraryForm</Edit>
-  <New>DocumentLibraryForm</New>
-</FormTemplates>
+<p:properties xmlns:p="http://schemas.microsoft.com/office/2006/metadata/properties" xmlns:xsi="http://www.w3.org/2001/XMLSchema-instance" xmlns:pc="http://schemas.microsoft.com/office/infopath/2007/PartnerControls">
+  <documentManagement/>
+</p:properties>
 </file>
 
 <file path=customXml/itemProps1.xml><?xml version="1.0" encoding="utf-8"?>
-<ds:datastoreItem xmlns:ds="http://schemas.openxmlformats.org/officeDocument/2006/customXml" ds:itemID="{46CA5683-AF87-4E40-B841-2E23A3B52406}">
+<ds:datastoreItem xmlns:ds="http://schemas.openxmlformats.org/officeDocument/2006/customXml" ds:itemID="{D51C61E4-DB75-4684-AD25-71F546404E96}">
   <ds:schemaRefs>
-    <ds:schemaRef ds:uri="http://purl.org/dc/terms/"/>
-    <ds:schemaRef ds:uri="http://purl.org/dc/elements/1.1/"/>
-    <ds:schemaRef ds:uri="http://schemas.openxmlformats.org/package/2006/metadata/core-properties"/>
-    <ds:schemaRef ds:uri="http://www.w3.org/XML/1998/namespace"/>
-    <ds:schemaRef ds:uri="http://schemas.microsoft.com/office/2006/metadata/properties"/>
-    <ds:schemaRef ds:uri="http://schemas.microsoft.com/office/2006/documentManagement/types"/>
-    <ds:schemaRef ds:uri="http://purl.org/dc/dcmitype/"/>
-    <ds:schemaRef ds:uri="http://schemas.microsoft.com/office/infopath/2007/PartnerControls"/>
-    <ds:schemaRef ds:uri="126e8a1c-9ea9-435a-ac89-d06c80d62e30"/>
+    <ds:schemaRef ds:uri="http://schemas.microsoft.com/sharepoint/v3/contenttype/forms"/>
   </ds:schemaRefs>
 </ds:datastoreItem>
 </file>
@@ -4940,9 +8035,10 @@
 </file>
 
 <file path=customXml/itemProps3.xml><?xml version="1.0" encoding="utf-8"?>
-<ds:datastoreItem xmlns:ds="http://schemas.openxmlformats.org/officeDocument/2006/customXml" ds:itemID="{D51C61E4-DB75-4684-AD25-71F546404E96}">
+<ds:datastoreItem xmlns:ds="http://schemas.openxmlformats.org/officeDocument/2006/customXml" ds:itemID="{46CA5683-AF87-4E40-B841-2E23A3B52406}">
   <ds:schemaRefs>
-    <ds:schemaRef ds:uri="http://schemas.microsoft.com/sharepoint/v3/contenttype/forms"/>
+    <ds:schemaRef ds:uri="http://schemas.microsoft.com/office/2006/metadata/properties"/>
+    <ds:schemaRef ds:uri="http://schemas.microsoft.com/office/infopath/2007/PartnerControls"/>
   </ds:schemaRefs>
 </ds:datastoreItem>
 </file>
</xml_diff>

<commit_message>
Atualización 2.4 y 2.5
Se agregó último vinculo faltante
</commit_message>
<xml_diff>
--- a/Capstone/Fase 2/Grupales/2.4_GuiaEstudiante_Fase 2_DesarrolloProyecto APT.docx
+++ b/Capstone/Fase 2/Grupales/2.4_GuiaEstudiante_Fase 2_DesarrolloProyecto APT.docx
@@ -1152,29 +1152,7 @@
                   <w:szCs w:val="20"/>
                   <w:lang w:eastAsia="es-CL"/>
                 </w:rPr>
-                <w:t xml:space="preserve">Apunte de Historia de </w:t>
-              </w:r>
-              <w:r>
-                <w:rPr>
-                  <w:rStyle w:val="Hipervnculo"/>
-                  <w:rFonts w:ascii="Calibri" w:hAnsi="Calibri" w:cs="Arial"/>
-                  <w:iCs/>
-                  <w:sz w:val="20"/>
-                  <w:szCs w:val="20"/>
-                  <w:lang w:eastAsia="es-CL"/>
-                </w:rPr>
-                <w:t>u</w:t>
-              </w:r>
-              <w:r>
-                <w:rPr>
-                  <w:rStyle w:val="Hipervnculo"/>
-                  <w:rFonts w:ascii="Calibri" w:hAnsi="Calibri" w:cs="Arial"/>
-                  <w:iCs/>
-                  <w:sz w:val="20"/>
-                  <w:szCs w:val="20"/>
-                  <w:lang w:eastAsia="es-CL"/>
-                </w:rPr>
-                <w:t>suario y Sprint</w:t>
+                <w:t>Apunte de Historia de usuario y Sprint</w:t>
               </w:r>
             </w:hyperlink>
           </w:p>
@@ -1596,17 +1574,32 @@
                 <w:lang w:eastAsia="es-CL"/>
               </w:rPr>
             </w:pPr>
-            <w:r>
-              <w:rPr>
-                <w:rFonts w:ascii="Calibri" w:hAnsi="Calibri" w:cs="Arial"/>
-                <w:iCs/>
-                <w:color w:val="548DD4"/>
-                <w:sz w:val="20"/>
-                <w:szCs w:val="20"/>
-                <w:lang w:eastAsia="es-CL"/>
-              </w:rPr>
-              <w:t>Product Backlog</w:t>
-            </w:r>
+            <w:hyperlink r:id="rId14" w:history="1">
+              <w:proofErr w:type="spellStart"/>
+              <w:r>
+                <w:rPr>
+                  <w:rStyle w:val="Hipervnculo"/>
+                  <w:rFonts w:ascii="Calibri" w:hAnsi="Calibri" w:cs="Arial"/>
+                  <w:iCs/>
+                  <w:sz w:val="20"/>
+                  <w:szCs w:val="20"/>
+                  <w:lang w:eastAsia="es-CL"/>
+                </w:rPr>
+                <w:t>Product</w:t>
+              </w:r>
+              <w:proofErr w:type="spellEnd"/>
+              <w:r>
+                <w:rPr>
+                  <w:rStyle w:val="Hipervnculo"/>
+                  <w:rFonts w:ascii="Calibri" w:hAnsi="Calibri" w:cs="Arial"/>
+                  <w:iCs/>
+                  <w:sz w:val="20"/>
+                  <w:szCs w:val="20"/>
+                  <w:lang w:eastAsia="es-CL"/>
+                </w:rPr>
+                <w:t xml:space="preserve"> Backlog</w:t>
+              </w:r>
+            </w:hyperlink>
           </w:p>
           <w:p>
             <w:pPr>
@@ -1662,7 +1655,7 @@
                 <w:lang w:eastAsia="es-CL"/>
               </w:rPr>
             </w:pPr>
-            <w:hyperlink r:id="rId14" w:history="1">
+            <w:hyperlink r:id="rId15" w:history="1">
               <w:r>
                 <w:rPr>
                   <w:rStyle w:val="Hipervnculo"/>
@@ -1719,7 +1712,7 @@
                 <w:lang w:eastAsia="es-CL"/>
               </w:rPr>
             </w:pPr>
-            <w:hyperlink r:id="rId15" w:history="1">
+            <w:hyperlink r:id="rId16" w:history="1">
               <w:r>
                 <w:rPr>
                   <w:rStyle w:val="Hipervnculo"/>
@@ -4309,21 +4302,8 @@
                 <w:szCs w:val="18"/>
                 <w:lang w:eastAsia="es-CL"/>
               </w:rPr>
-              <w:t xml:space="preserve">Base del funcionamiento de la </w:t>
-            </w:r>
-            <w:proofErr w:type="gramStart"/>
-            <w:r>
-              <w:rPr>
-                <w:rFonts w:cstheme="minorHAnsi"/>
-                <w:iCs/>
-                <w:color w:val="548DD4"/>
-                <w:sz w:val="18"/>
-                <w:szCs w:val="18"/>
-                <w:lang w:eastAsia="es-CL"/>
-              </w:rPr>
-              <w:t>app</w:t>
-            </w:r>
-            <w:proofErr w:type="gramEnd"/>
+              <w:t>Base del funcionamiento de la app</w:t>
+            </w:r>
           </w:p>
         </w:tc>
         <w:tc>
@@ -5180,7 +5160,7 @@
       </w:pPr>
     </w:p>
     <w:sectPr>
-      <w:headerReference w:type="default" r:id="rId16"/>
+      <w:headerReference w:type="default" r:id="rId17"/>
       <w:pgSz w:w="11906" w:h="16838"/>
       <w:pgMar w:top="1417" w:right="1701" w:bottom="1417" w:left="1701" w:header="708" w:footer="708" w:gutter="0"/>
       <w:cols w:space="708"/>
@@ -7154,6 +7134,21 @@
 </file>
 
 <file path=customXml/item1.xml><?xml version="1.0" encoding="utf-8"?>
+<p:properties xmlns:p="http://schemas.microsoft.com/office/2006/metadata/properties" xmlns:xsi="http://www.w3.org/2001/XMLSchema-instance" xmlns:pc="http://schemas.microsoft.com/office/infopath/2007/PartnerControls">
+  <documentManagement/>
+</p:properties>
+</file>
+
+<file path=customXml/item2.xml><?xml version="1.0" encoding="utf-8"?>
+<?mso-contentType ?>
+<FormTemplates xmlns="http://schemas.microsoft.com/sharepoint/v3/contenttype/forms">
+  <Display>DocumentLibraryForm</Display>
+  <Edit>DocumentLibraryForm</Edit>
+  <New>DocumentLibraryForm</New>
+</FormTemplates>
+</file>
+
+<file path=customXml/item3.xml><?xml version="1.0" encoding="utf-8"?>
 <ct:contentTypeSchema xmlns:ct="http://schemas.microsoft.com/office/2006/metadata/contentType" xmlns:ma="http://schemas.microsoft.com/office/2006/metadata/properties/metaAttributes" ct:_="" ma:_="" ma:contentTypeName="Documento" ma:contentTypeID="0x010100E96778489EE7714D8BD12CC105EB918B" ma:contentTypeVersion="2" ma:contentTypeDescription="Crear nuevo documento." ma:contentTypeScope="" ma:versionID="416c5c7ae9b5d54d83875cd3c65194e3">
   <xsd:schema xmlns:xsd="http://www.w3.org/2001/XMLSchema" xmlns:xs="http://www.w3.org/2001/XMLSchema" xmlns:p="http://schemas.microsoft.com/office/2006/metadata/properties" xmlns:ns2="126e8a1c-9ea9-435a-ac89-d06c80d62e30" targetNamespace="http://schemas.microsoft.com/office/2006/metadata/properties" ma:root="true" ma:fieldsID="70a237c842677bd850644f8595079f5e" ns2:_="">
     <xsd:import namespace="126e8a1c-9ea9-435a-ac89-d06c80d62e30"/>
@@ -7285,22 +7280,24 @@
 </ct:contentTypeSchema>
 </file>
 
-<file path=customXml/item2.xml><?xml version="1.0" encoding="utf-8"?>
-<?mso-contentType ?>
-<FormTemplates xmlns="http://schemas.microsoft.com/sharepoint/v3/contenttype/forms">
-  <Display>DocumentLibraryForm</Display>
-  <Edit>DocumentLibraryForm</Edit>
-  <New>DocumentLibraryForm</New>
-</FormTemplates>
+<file path=customXml/itemProps1.xml><?xml version="1.0" encoding="utf-8"?>
+<ds:datastoreItem xmlns:ds="http://schemas.openxmlformats.org/officeDocument/2006/customXml" ds:itemID="{46CA5683-AF87-4E40-B841-2E23A3B52406}">
+  <ds:schemaRefs>
+    <ds:schemaRef ds:uri="http://schemas.microsoft.com/office/2006/metadata/properties"/>
+    <ds:schemaRef ds:uri="http://schemas.microsoft.com/office/infopath/2007/PartnerControls"/>
+  </ds:schemaRefs>
+</ds:datastoreItem>
 </file>
 
-<file path=customXml/item3.xml><?xml version="1.0" encoding="utf-8"?>
-<p:properties xmlns:p="http://schemas.microsoft.com/office/2006/metadata/properties" xmlns:xsi="http://www.w3.org/2001/XMLSchema-instance" xmlns:pc="http://schemas.microsoft.com/office/infopath/2007/PartnerControls">
-  <documentManagement/>
-</p:properties>
+<file path=customXml/itemProps2.xml><?xml version="1.0" encoding="utf-8"?>
+<ds:datastoreItem xmlns:ds="http://schemas.openxmlformats.org/officeDocument/2006/customXml" ds:itemID="{D51C61E4-DB75-4684-AD25-71F546404E96}">
+  <ds:schemaRefs>
+    <ds:schemaRef ds:uri="http://schemas.microsoft.com/sharepoint/v3/contenttype/forms"/>
+  </ds:schemaRefs>
+</ds:datastoreItem>
 </file>
 
-<file path=customXml/itemProps1.xml><?xml version="1.0" encoding="utf-8"?>
+<file path=customXml/itemProps3.xml><?xml version="1.0" encoding="utf-8"?>
 <ds:datastoreItem xmlns:ds="http://schemas.openxmlformats.org/officeDocument/2006/customXml" ds:itemID="{6F3661B0-5934-4FAB-ADC6-33A19B814E8D}">
   <ds:schemaRefs>
     <ds:schemaRef ds:uri="http://schemas.microsoft.com/office/2006/metadata/contentType"/>
@@ -7316,21 +7313,4 @@
     <ds:schemaRef ds:uri="http://schemas.microsoft.com/internal/obd"/>
   </ds:schemaRefs>
 </ds:datastoreItem>
-</file>
-
-<file path=customXml/itemProps2.xml><?xml version="1.0" encoding="utf-8"?>
-<ds:datastoreItem xmlns:ds="http://schemas.openxmlformats.org/officeDocument/2006/customXml" ds:itemID="{D51C61E4-DB75-4684-AD25-71F546404E96}">
-  <ds:schemaRefs>
-    <ds:schemaRef ds:uri="http://schemas.microsoft.com/sharepoint/v3/contenttype/forms"/>
-  </ds:schemaRefs>
-</ds:datastoreItem>
-</file>
-
-<file path=customXml/itemProps3.xml><?xml version="1.0" encoding="utf-8"?>
-<ds:datastoreItem xmlns:ds="http://schemas.openxmlformats.org/officeDocument/2006/customXml" ds:itemID="{46CA5683-AF87-4E40-B841-2E23A3B52406}">
-  <ds:schemaRefs>
-    <ds:schemaRef ds:uri="http://schemas.microsoft.com/office/2006/metadata/properties"/>
-    <ds:schemaRef ds:uri="http://schemas.microsoft.com/office/infopath/2007/PartnerControls"/>
-  </ds:schemaRefs>
-</ds:datastoreItem>
 </file>
</xml_diff>